<commit_message>
Record notification authorization fix in the handoff document
</commit_message>
<xml_diff>
--- a/ReqATK_Maintenance_Handoff_Document.docx
+++ b/ReqATK_Maintenance_Handoff_Document.docx
@@ -1,6 +1,6 @@
 
 <file path=word/document.xml><?xml version="1.0" encoding="utf-8"?>
-<w:document xmlns:wpc="http://schemas.microsoft.com/office/word/2010/wordprocessingCanvas" xmlns:cx="http://schemas.microsoft.com/office/drawing/2014/chartex" xmlns:cx1="http://schemas.microsoft.com/office/drawing/2015/9/8/chartex" xmlns:cx2="http://schemas.microsoft.com/office/drawing/2015/10/21/chartex" xmlns:cx3="http://schemas.microsoft.com/office/drawing/2016/5/9/chartex" xmlns:cx4="http://schemas.microsoft.com/office/drawing/2016/5/10/chartex" xmlns:cx5="http://schemas.microsoft.com/office/drawing/2016/5/11/chartex" xmlns:cx6="http://schemas.microsoft.com/office/drawing/2016/5/12/chartex" xmlns:cx7="http://schemas.microsoft.com/office/drawing/2016/5/13/chartex" xmlns:cx8="http://schemas.microsoft.com/office/drawing/2016/5/14/chartex" xmlns:mc="http://schemas.openxmlformats.org/markup-compatibility/2006" xmlns:aink="http://schemas.microsoft.com/office/drawing/2016/ink" xmlns:am3d="http://schemas.microsoft.com/office/drawing/2017/model3d" xmlns:o="urn:schemas-microsoft-com:office:office" xmlns:oel="http://schemas.microsoft.com/office/2019/extlst" xmlns:r="http://schemas.openxmlformats.org/officeDocument/2006/relationships" xmlns:m="http://schemas.openxmlformats.org/officeDocument/2006/math" xmlns:v="urn:schemas-microsoft-com:vml" xmlns:wp14="http://schemas.microsoft.com/office/word/2010/wordprocessingDrawing" xmlns:wp="http://schemas.openxmlformats.org/drawingml/2006/wordprocessingDrawing" xmlns:w10="urn:schemas-microsoft-com:office:word" xmlns:w="http://schemas.openxmlformats.org/wordprocessingml/2006/main" xmlns:w14="http://schemas.microsoft.com/office/word/2010/wordml" xmlns:w15="http://schemas.microsoft.com/office/word/2012/wordml" xmlns:w16cex="http://schemas.microsoft.com/office/word/2018/wordml/cex" xmlns:w16cid="http://schemas.microsoft.com/office/word/2016/wordml/cid" xmlns:w16="http://schemas.microsoft.com/office/word/2018/wordml" xmlns:w16du="http://schemas.microsoft.com/office/word/2023/wordml/word16du" xmlns:w16sdtdh="http://schemas.microsoft.com/office/word/2020/wordml/sdtdatahash" xmlns:w16sdtfl="http://schemas.microsoft.com/office/word/2024/wordml/sdtformatlock" xmlns:w16se="http://schemas.microsoft.com/office/word/2015/wordml/symex" xmlns:wpg="http://schemas.microsoft.com/office/word/2010/wordprocessingGroup" xmlns:wpi="http://schemas.microsoft.com/office/word/2010/wordprocessingInk" xmlns:wne="http://schemas.microsoft.com/office/word/2006/wordml" xmlns:wps="http://schemas.microsoft.com/office/word/2010/wordprocessingShape" mc:Ignorable="w14 w15 w16se w16cid w16 w16cex w16sdtdh w16sdtfl w16du wp14">
+<w:document xmlns:wpc="http://schemas.microsoft.com/office/word/2010/wordprocessingCanvas" xmlns:cx="http://schemas.microsoft.com/office/drawing/2014/chartex" xmlns:cx1="http://schemas.microsoft.com/office/drawing/2015/9/8/chartex" xmlns:cx2="http://schemas.microsoft.com/office/drawing/2015/10/21/chartex" xmlns:cx3="http://schemas.microsoft.com/office/drawing/2016/5/9/chartex" xmlns:cx4="http://schemas.microsoft.com/office/drawing/2016/5/10/chartex" xmlns:cx5="http://schemas.microsoft.com/office/drawing/2016/5/11/chartex" xmlns:cx6="http://schemas.microsoft.com/office/drawing/2016/5/12/chartex" xmlns:cx7="http://schemas.microsoft.com/office/drawing/2016/5/13/chartex" xmlns:cx8="http://schemas.microsoft.com/office/drawing/2016/5/14/chartex" xmlns:mc="http://schemas.openxmlformats.org/markup-compatibility/2006" xmlns:aink="http://schemas.microsoft.com/office/drawing/2016/ink" xmlns:am3d="http://schemas.microsoft.com/office/drawing/2017/model3d" xmlns:o="urn:schemas-microsoft-com:office:office" xmlns:oel="http://schemas.microsoft.com/office/2019/extlst" xmlns:r="http://schemas.openxmlformats.org/officeDocument/2006/relationships" xmlns:m="http://schemas.openxmlformats.org/officeDocument/2006/math" xmlns:v="urn:schemas-microsoft-com:vml" xmlns:wp14="http://schemas.microsoft.com/office/word/2010/wordprocessingDrawing" xmlns:wp="http://schemas.openxmlformats.org/drawingml/2006/wordprocessingDrawing" xmlns:w10="urn:schemas-microsoft-com:office:word" xmlns:w="http://schemas.openxmlformats.org/wordprocessingml/2006/main" xmlns:w14="http://schemas.microsoft.com/office/word/2010/wordml" xmlns:w15="http://schemas.microsoft.com/office/word/2012/wordml" xmlns:w16cei="http://schemas.microsoft.com/office/word/2026/wordml/cei" xmlns:w16cex="http://schemas.microsoft.com/office/word/2018/wordml/cex" xmlns:w16cid="http://schemas.microsoft.com/office/word/2016/wordml/cid" xmlns:w16="http://schemas.microsoft.com/office/word/2018/wordml" xmlns:w16du="http://schemas.microsoft.com/office/word/2023/wordml/word16du" xmlns:w16sdtdh="http://schemas.microsoft.com/office/word/2020/wordml/sdtdatahash" xmlns:w16sdtfl="http://schemas.microsoft.com/office/word/2024/wordml/sdtformatlock" xmlns:w16se="http://schemas.microsoft.com/office/word/2015/wordml/symex" xmlns:wpg="http://schemas.microsoft.com/office/word/2010/wordprocessingGroup" xmlns:wpi="http://schemas.microsoft.com/office/word/2010/wordprocessingInk" xmlns:wne="http://schemas.microsoft.com/office/word/2006/wordml" xmlns:wps="http://schemas.microsoft.com/office/word/2010/wordprocessingShape" mc:Ignorable="w14 w15 w16se w16cid w16 w16cex w16sdtdh w16sdtfl w16du wp14">
   <w:body>
     <w:p>
       <w:r>
@@ -8,7 +8,7 @@
           <w:noProof/>
         </w:rPr>
         <w:drawing>
-          <wp:inline distT="0" distB="0" distL="0" distR="0" wp14:anchorId="5C2F1D0D" wp14:editId="167A6A65">
+          <wp:inline distT="0" distB="0" distL="0" distR="0" wp14:anchorId="7AD1CDE0" wp14:editId="5DD40D6C">
             <wp:extent cx="512399" cy="503999"/>
             <wp:effectExtent l="0" t="0" r="0" b="0"/>
             <wp:docPr id="1" name="Picture 1"/>
@@ -51,7 +51,7 @@
           <w:noProof/>
         </w:rPr>
         <w:drawing>
-          <wp:inline distT="0" distB="0" distL="0" distR="0" wp14:anchorId="71506307" wp14:editId="33F4088B">
+          <wp:inline distT="0" distB="0" distL="0" distR="0" wp14:anchorId="2B13DC9A" wp14:editId="3402B6CB">
             <wp:extent cx="790920" cy="468000"/>
             <wp:effectExtent l="0" t="0" r="0" b="0"/>
             <wp:docPr id="2" name="Picture 2"/>
@@ -96,7 +96,7 @@
           <w:noProof/>
         </w:rPr>
         <w:drawing>
-          <wp:inline distT="0" distB="0" distL="0" distR="0" wp14:anchorId="33F87FDC" wp14:editId="5F4DD9B6">
+          <wp:inline distT="0" distB="0" distL="0" distR="0" wp14:anchorId="672B6216" wp14:editId="065EC5C1">
             <wp:extent cx="1423013" cy="342000"/>
             <wp:effectExtent l="0" t="0" r="0" b="0"/>
             <wp:docPr id="3" name="Picture 3"/>
@@ -748,7 +748,7 @@
       <w:r>
         <w:fldChar w:fldCharType="separate"/>
       </w:r>
-      <w:hyperlink w:anchor="_Toc236140224" w:history="1">
+      <w:hyperlink w:anchor="_Toc236150816" w:history="1">
         <w:r>
           <w:rPr>
             <w:rStyle w:val="Hyperlink"/>
@@ -772,7 +772,7 @@
           <w:rPr>
             <w:noProof/>
           </w:rPr>
-          <w:instrText xml:space="preserve"> PAGEREF _Toc236140224 \h </w:instrText>
+          <w:instrText xml:space="preserve"> PAGEREF _Toc236150816 \h </w:instrText>
         </w:r>
         <w:r>
           <w:rPr>
@@ -813,7 +813,7 @@
           <w14:ligatures w14:val="standardContextual"/>
         </w:rPr>
       </w:pPr>
-      <w:hyperlink w:anchor="_Toc236140225" w:history="1">
+      <w:hyperlink w:anchor="_Toc236150817" w:history="1">
         <w:r>
           <w:rPr>
             <w:rStyle w:val="Hyperlink"/>
@@ -837,7 +837,7 @@
           <w:rPr>
             <w:noProof/>
           </w:rPr>
-          <w:instrText xml:space="preserve"> PAGEREF _Toc236140225 \h </w:instrText>
+          <w:instrText xml:space="preserve"> PAGEREF _Toc236150817 \h </w:instrText>
         </w:r>
         <w:r>
           <w:rPr>
@@ -878,7 +878,7 @@
           <w14:ligatures w14:val="standardContextual"/>
         </w:rPr>
       </w:pPr>
-      <w:hyperlink w:anchor="_Toc236140226" w:history="1">
+      <w:hyperlink w:anchor="_Toc236150818" w:history="1">
         <w:r>
           <w:rPr>
             <w:rStyle w:val="Hyperlink"/>
@@ -902,7 +902,7 @@
           <w:rPr>
             <w:noProof/>
           </w:rPr>
-          <w:instrText xml:space="preserve"> PAGEREF _Toc236140226 \h </w:instrText>
+          <w:instrText xml:space="preserve"> PAGEREF _Toc236150818 \h </w:instrText>
         </w:r>
         <w:r>
           <w:rPr>
@@ -943,7 +943,7 @@
           <w14:ligatures w14:val="standardContextual"/>
         </w:rPr>
       </w:pPr>
-      <w:hyperlink w:anchor="_Toc236140227" w:history="1">
+      <w:hyperlink w:anchor="_Toc236150819" w:history="1">
         <w:r>
           <w:rPr>
             <w:rStyle w:val="Hyperlink"/>
@@ -967,7 +967,7 @@
           <w:rPr>
             <w:noProof/>
           </w:rPr>
-          <w:instrText xml:space="preserve"> PAGEREF _Toc236140227 \h </w:instrText>
+          <w:instrText xml:space="preserve"> PAGEREF _Toc236150819 \h </w:instrText>
         </w:r>
         <w:r>
           <w:rPr>
@@ -1008,7 +1008,7 @@
           <w14:ligatures w14:val="standardContextual"/>
         </w:rPr>
       </w:pPr>
-      <w:hyperlink w:anchor="_Toc236140228" w:history="1">
+      <w:hyperlink w:anchor="_Toc236150820" w:history="1">
         <w:r>
           <w:rPr>
             <w:rStyle w:val="Hyperlink"/>
@@ -1032,7 +1032,7 @@
           <w:rPr>
             <w:noProof/>
           </w:rPr>
-          <w:instrText xml:space="preserve"> PAGEREF _Toc236140228 \h </w:instrText>
+          <w:instrText xml:space="preserve"> PAGEREF _Toc236150820 \h </w:instrText>
         </w:r>
         <w:r>
           <w:rPr>
@@ -1073,7 +1073,7 @@
           <w14:ligatures w14:val="standardContextual"/>
         </w:rPr>
       </w:pPr>
-      <w:hyperlink w:anchor="_Toc236140229" w:history="1">
+      <w:hyperlink w:anchor="_Toc236150821" w:history="1">
         <w:r>
           <w:rPr>
             <w:rStyle w:val="Hyperlink"/>
@@ -1097,7 +1097,7 @@
           <w:rPr>
             <w:noProof/>
           </w:rPr>
-          <w:instrText xml:space="preserve"> PAGEREF _Toc236140229 \h </w:instrText>
+          <w:instrText xml:space="preserve"> PAGEREF _Toc236150821 \h </w:instrText>
         </w:r>
         <w:r>
           <w:rPr>
@@ -1138,7 +1138,7 @@
           <w14:ligatures w14:val="standardContextual"/>
         </w:rPr>
       </w:pPr>
-      <w:hyperlink w:anchor="_Toc236140230" w:history="1">
+      <w:hyperlink w:anchor="_Toc236150822" w:history="1">
         <w:r>
           <w:rPr>
             <w:rStyle w:val="Hyperlink"/>
@@ -1162,7 +1162,7 @@
           <w:rPr>
             <w:noProof/>
           </w:rPr>
-          <w:instrText xml:space="preserve"> PAGEREF _Toc236140230 \h </w:instrText>
+          <w:instrText xml:space="preserve"> PAGEREF _Toc236150822 \h </w:instrText>
         </w:r>
         <w:r>
           <w:rPr>
@@ -1203,7 +1203,7 @@
           <w14:ligatures w14:val="standardContextual"/>
         </w:rPr>
       </w:pPr>
-      <w:hyperlink w:anchor="_Toc236140231" w:history="1">
+      <w:hyperlink w:anchor="_Toc236150823" w:history="1">
         <w:r>
           <w:rPr>
             <w:rStyle w:val="Hyperlink"/>
@@ -1227,7 +1227,7 @@
           <w:rPr>
             <w:noProof/>
           </w:rPr>
-          <w:instrText xml:space="preserve"> PAGEREF _Toc236140231 \h </w:instrText>
+          <w:instrText xml:space="preserve"> PAGEREF _Toc236150823 \h </w:instrText>
         </w:r>
         <w:r>
           <w:rPr>
@@ -1268,7 +1268,7 @@
           <w14:ligatures w14:val="standardContextual"/>
         </w:rPr>
       </w:pPr>
-      <w:hyperlink w:anchor="_Toc236140232" w:history="1">
+      <w:hyperlink w:anchor="_Toc236150824" w:history="1">
         <w:r>
           <w:rPr>
             <w:rStyle w:val="Hyperlink"/>
@@ -1292,7 +1292,7 @@
           <w:rPr>
             <w:noProof/>
           </w:rPr>
-          <w:instrText xml:space="preserve"> PAGEREF _Toc236140232 \h </w:instrText>
+          <w:instrText xml:space="preserve"> PAGEREF _Toc236150824 \h </w:instrText>
         </w:r>
         <w:r>
           <w:rPr>
@@ -1333,7 +1333,7 @@
           <w14:ligatures w14:val="standardContextual"/>
         </w:rPr>
       </w:pPr>
-      <w:hyperlink w:anchor="_Toc236140233" w:history="1">
+      <w:hyperlink w:anchor="_Toc236150825" w:history="1">
         <w:r>
           <w:rPr>
             <w:rStyle w:val="Hyperlink"/>
@@ -1357,7 +1357,7 @@
           <w:rPr>
             <w:noProof/>
           </w:rPr>
-          <w:instrText xml:space="preserve"> PAGEREF _Toc236140233 \h </w:instrText>
+          <w:instrText xml:space="preserve"> PAGEREF _Toc236150825 \h </w:instrText>
         </w:r>
         <w:r>
           <w:rPr>
@@ -1398,7 +1398,7 @@
           <w14:ligatures w14:val="standardContextual"/>
         </w:rPr>
       </w:pPr>
-      <w:hyperlink w:anchor="_Toc236140234" w:history="1">
+      <w:hyperlink w:anchor="_Toc236150826" w:history="1">
         <w:r>
           <w:rPr>
             <w:rStyle w:val="Hyperlink"/>
@@ -1422,7 +1422,7 @@
           <w:rPr>
             <w:noProof/>
           </w:rPr>
-          <w:instrText xml:space="preserve"> PAGEREF _Toc236140234 \h </w:instrText>
+          <w:instrText xml:space="preserve"> PAGEREF _Toc236150826 \h </w:instrText>
         </w:r>
         <w:r>
           <w:rPr>
@@ -1463,7 +1463,7 @@
           <w14:ligatures w14:val="standardContextual"/>
         </w:rPr>
       </w:pPr>
-      <w:hyperlink w:anchor="_Toc236140235" w:history="1">
+      <w:hyperlink w:anchor="_Toc236150827" w:history="1">
         <w:r>
           <w:rPr>
             <w:rStyle w:val="Hyperlink"/>
@@ -1487,7 +1487,7 @@
           <w:rPr>
             <w:noProof/>
           </w:rPr>
-          <w:instrText xml:space="preserve"> PAGEREF _Toc236140235 \h </w:instrText>
+          <w:instrText xml:space="preserve"> PAGEREF _Toc236150827 \h </w:instrText>
         </w:r>
         <w:r>
           <w:rPr>
@@ -1528,7 +1528,7 @@
           <w14:ligatures w14:val="standardContextual"/>
         </w:rPr>
       </w:pPr>
-      <w:hyperlink w:anchor="_Toc236140236" w:history="1">
+      <w:hyperlink w:anchor="_Toc236150828" w:history="1">
         <w:r>
           <w:rPr>
             <w:rStyle w:val="Hyperlink"/>
@@ -1552,7 +1552,7 @@
           <w:rPr>
             <w:noProof/>
           </w:rPr>
-          <w:instrText xml:space="preserve"> PAGEREF _Toc236140236 \h </w:instrText>
+          <w:instrText xml:space="preserve"> PAGEREF _Toc236150828 \h </w:instrText>
         </w:r>
         <w:r>
           <w:rPr>
@@ -1593,7 +1593,7 @@
           <w14:ligatures w14:val="standardContextual"/>
         </w:rPr>
       </w:pPr>
-      <w:hyperlink w:anchor="_Toc236140237" w:history="1">
+      <w:hyperlink w:anchor="_Toc236150829" w:history="1">
         <w:r>
           <w:rPr>
             <w:rStyle w:val="Hyperlink"/>
@@ -1617,7 +1617,7 @@
           <w:rPr>
             <w:noProof/>
           </w:rPr>
-          <w:instrText xml:space="preserve"> PAGEREF _Toc236140237 \h </w:instrText>
+          <w:instrText xml:space="preserve"> PAGEREF _Toc236150829 \h </w:instrText>
         </w:r>
         <w:r>
           <w:rPr>
@@ -1658,7 +1658,7 @@
           <w14:ligatures w14:val="standardContextual"/>
         </w:rPr>
       </w:pPr>
-      <w:hyperlink w:anchor="_Toc236140238" w:history="1">
+      <w:hyperlink w:anchor="_Toc236150830" w:history="1">
         <w:r>
           <w:rPr>
             <w:rStyle w:val="Hyperlink"/>
@@ -1682,7 +1682,7 @@
           <w:rPr>
             <w:noProof/>
           </w:rPr>
-          <w:instrText xml:space="preserve"> PAGEREF _Toc236140238 \h </w:instrText>
+          <w:instrText xml:space="preserve"> PAGEREF _Toc236150830 \h </w:instrText>
         </w:r>
         <w:r>
           <w:rPr>
@@ -1723,7 +1723,7 @@
           <w14:ligatures w14:val="standardContextual"/>
         </w:rPr>
       </w:pPr>
-      <w:hyperlink w:anchor="_Toc236140239" w:history="1">
+      <w:hyperlink w:anchor="_Toc236150831" w:history="1">
         <w:r>
           <w:rPr>
             <w:rStyle w:val="Hyperlink"/>
@@ -1747,7 +1747,7 @@
           <w:rPr>
             <w:noProof/>
           </w:rPr>
-          <w:instrText xml:space="preserve"> PAGEREF _Toc236140239 \h </w:instrText>
+          <w:instrText xml:space="preserve"> PAGEREF _Toc236150831 \h </w:instrText>
         </w:r>
         <w:r>
           <w:rPr>
@@ -1788,7 +1788,7 @@
           <w14:ligatures w14:val="standardContextual"/>
         </w:rPr>
       </w:pPr>
-      <w:hyperlink w:anchor="_Toc236140240" w:history="1">
+      <w:hyperlink w:anchor="_Toc236150832" w:history="1">
         <w:r>
           <w:rPr>
             <w:rStyle w:val="Hyperlink"/>
@@ -1812,7 +1812,7 @@
           <w:rPr>
             <w:noProof/>
           </w:rPr>
-          <w:instrText xml:space="preserve"> PAGEREF _Toc236140240 \h </w:instrText>
+          <w:instrText xml:space="preserve"> PAGEREF _Toc236150832 \h </w:instrText>
         </w:r>
         <w:r>
           <w:rPr>
@@ -1853,7 +1853,7 @@
           <w14:ligatures w14:val="standardContextual"/>
         </w:rPr>
       </w:pPr>
-      <w:hyperlink w:anchor="_Toc236140241" w:history="1">
+      <w:hyperlink w:anchor="_Toc236150833" w:history="1">
         <w:r>
           <w:rPr>
             <w:rStyle w:val="Hyperlink"/>
@@ -1877,7 +1877,7 @@
           <w:rPr>
             <w:noProof/>
           </w:rPr>
-          <w:instrText xml:space="preserve"> PAGEREF _Toc236140241 \h </w:instrText>
+          <w:instrText xml:space="preserve"> PAGEREF _Toc236150833 \h </w:instrText>
         </w:r>
         <w:r>
           <w:rPr>
@@ -1918,7 +1918,7 @@
           <w14:ligatures w14:val="standardContextual"/>
         </w:rPr>
       </w:pPr>
-      <w:hyperlink w:anchor="_Toc236140242" w:history="1">
+      <w:hyperlink w:anchor="_Toc236150834" w:history="1">
         <w:r>
           <w:rPr>
             <w:rStyle w:val="Hyperlink"/>
@@ -1942,7 +1942,7 @@
           <w:rPr>
             <w:noProof/>
           </w:rPr>
-          <w:instrText xml:space="preserve"> PAGEREF _Toc236140242 \h </w:instrText>
+          <w:instrText xml:space="preserve"> PAGEREF _Toc236150834 \h </w:instrText>
         </w:r>
         <w:r>
           <w:rPr>
@@ -1983,7 +1983,7 @@
           <w14:ligatures w14:val="standardContextual"/>
         </w:rPr>
       </w:pPr>
-      <w:hyperlink w:anchor="_Toc236140243" w:history="1">
+      <w:hyperlink w:anchor="_Toc236150835" w:history="1">
         <w:r>
           <w:rPr>
             <w:rStyle w:val="Hyperlink"/>
@@ -2007,7 +2007,7 @@
           <w:rPr>
             <w:noProof/>
           </w:rPr>
-          <w:instrText xml:space="preserve"> PAGEREF _Toc236140243 \h </w:instrText>
+          <w:instrText xml:space="preserve"> PAGEREF _Toc236150835 \h </w:instrText>
         </w:r>
         <w:r>
           <w:rPr>
@@ -2048,7 +2048,7 @@
           <w14:ligatures w14:val="standardContextual"/>
         </w:rPr>
       </w:pPr>
-      <w:hyperlink w:anchor="_Toc236140244" w:history="1">
+      <w:hyperlink w:anchor="_Toc236150836" w:history="1">
         <w:r>
           <w:rPr>
             <w:rStyle w:val="Hyperlink"/>
@@ -2072,7 +2072,7 @@
           <w:rPr>
             <w:noProof/>
           </w:rPr>
-          <w:instrText xml:space="preserve"> PAGEREF _Toc236140244 \h </w:instrText>
+          <w:instrText xml:space="preserve"> PAGEREF _Toc236150836 \h </w:instrText>
         </w:r>
         <w:r>
           <w:rPr>
@@ -2113,7 +2113,7 @@
           <w14:ligatures w14:val="standardContextual"/>
         </w:rPr>
       </w:pPr>
-      <w:hyperlink w:anchor="_Toc236140245" w:history="1">
+      <w:hyperlink w:anchor="_Toc236150837" w:history="1">
         <w:r>
           <w:rPr>
             <w:rStyle w:val="Hyperlink"/>
@@ -2137,7 +2137,7 @@
           <w:rPr>
             <w:noProof/>
           </w:rPr>
-          <w:instrText xml:space="preserve"> PAGEREF _Toc236140245 \h </w:instrText>
+          <w:instrText xml:space="preserve"> PAGEREF _Toc236150837 \h </w:instrText>
         </w:r>
         <w:r>
           <w:rPr>
@@ -2178,7 +2178,7 @@
           <w14:ligatures w14:val="standardContextual"/>
         </w:rPr>
       </w:pPr>
-      <w:hyperlink w:anchor="_Toc236140246" w:history="1">
+      <w:hyperlink w:anchor="_Toc236150838" w:history="1">
         <w:r>
           <w:rPr>
             <w:rStyle w:val="Hyperlink"/>
@@ -2202,7 +2202,7 @@
           <w:rPr>
             <w:noProof/>
           </w:rPr>
-          <w:instrText xml:space="preserve"> PAGEREF _Toc236140246 \h </w:instrText>
+          <w:instrText xml:space="preserve"> PAGEREF _Toc236150838 \h </w:instrText>
         </w:r>
         <w:r>
           <w:rPr>
@@ -2243,7 +2243,7 @@
           <w14:ligatures w14:val="standardContextual"/>
         </w:rPr>
       </w:pPr>
-      <w:hyperlink w:anchor="_Toc236140247" w:history="1">
+      <w:hyperlink w:anchor="_Toc236150839" w:history="1">
         <w:r>
           <w:rPr>
             <w:rStyle w:val="Hyperlink"/>
@@ -2267,7 +2267,7 @@
           <w:rPr>
             <w:noProof/>
           </w:rPr>
-          <w:instrText xml:space="preserve"> PAGEREF _Toc236140247 \h </w:instrText>
+          <w:instrText xml:space="preserve"> PAGEREF _Toc236150839 \h </w:instrText>
         </w:r>
         <w:r>
           <w:rPr>
@@ -2308,7 +2308,7 @@
           <w14:ligatures w14:val="standardContextual"/>
         </w:rPr>
       </w:pPr>
-      <w:hyperlink w:anchor="_Toc236140248" w:history="1">
+      <w:hyperlink w:anchor="_Toc236150840" w:history="1">
         <w:r>
           <w:rPr>
             <w:rStyle w:val="Hyperlink"/>
@@ -2332,7 +2332,7 @@
           <w:rPr>
             <w:noProof/>
           </w:rPr>
-          <w:instrText xml:space="preserve"> PAGEREF _Toc236140248 \h </w:instrText>
+          <w:instrText xml:space="preserve"> PAGEREF _Toc236150840 \h </w:instrText>
         </w:r>
         <w:r>
           <w:rPr>
@@ -2373,7 +2373,7 @@
           <w14:ligatures w14:val="standardContextual"/>
         </w:rPr>
       </w:pPr>
-      <w:hyperlink w:anchor="_Toc236140249" w:history="1">
+      <w:hyperlink w:anchor="_Toc236150841" w:history="1">
         <w:r>
           <w:rPr>
             <w:rStyle w:val="Hyperlink"/>
@@ -2397,7 +2397,7 @@
           <w:rPr>
             <w:noProof/>
           </w:rPr>
-          <w:instrText xml:space="preserve"> PAGEREF _Toc236140249 \h </w:instrText>
+          <w:instrText xml:space="preserve"> PAGEREF _Toc236150841 \h </w:instrText>
         </w:r>
         <w:r>
           <w:rPr>
@@ -2438,7 +2438,7 @@
           <w14:ligatures w14:val="standardContextual"/>
         </w:rPr>
       </w:pPr>
-      <w:hyperlink w:anchor="_Toc236140250" w:history="1">
+      <w:hyperlink w:anchor="_Toc236150842" w:history="1">
         <w:r>
           <w:rPr>
             <w:rStyle w:val="Hyperlink"/>
@@ -2462,7 +2462,7 @@
           <w:rPr>
             <w:noProof/>
           </w:rPr>
-          <w:instrText xml:space="preserve"> PAGEREF _Toc236140250 \h </w:instrText>
+          <w:instrText xml:space="preserve"> PAGEREF _Toc236150842 \h </w:instrText>
         </w:r>
         <w:r>
           <w:rPr>
@@ -2503,7 +2503,7 @@
           <w14:ligatures w14:val="standardContextual"/>
         </w:rPr>
       </w:pPr>
-      <w:hyperlink w:anchor="_Toc236140251" w:history="1">
+      <w:hyperlink w:anchor="_Toc236150843" w:history="1">
         <w:r>
           <w:rPr>
             <w:rStyle w:val="Hyperlink"/>
@@ -2527,7 +2527,7 @@
           <w:rPr>
             <w:noProof/>
           </w:rPr>
-          <w:instrText xml:space="preserve"> PAGEREF _Toc236140251 \h </w:instrText>
+          <w:instrText xml:space="preserve"> PAGEREF _Toc236150843 \h </w:instrText>
         </w:r>
         <w:r>
           <w:rPr>
@@ -2568,7 +2568,7 @@
       <w:pPr>
         <w:pStyle w:val="Heading1"/>
       </w:pPr>
-      <w:bookmarkStart w:id="0" w:name="_Toc236140224"/>
+      <w:bookmarkStart w:id="0" w:name="_Toc236150816"/>
       <w:r>
         <w:lastRenderedPageBreak/>
         <w:t>Bab I   Gambaran Umum Sistem dan Arsitektur</w:t>
@@ -4194,7 +4194,7 @@
       <w:pPr>
         <w:pStyle w:val="Heading2"/>
       </w:pPr>
-      <w:bookmarkStart w:id="1" w:name="_Toc236140225"/>
+      <w:bookmarkStart w:id="1" w:name="_Toc236150817"/>
       <w:r>
         <w:t>Keputusan Desain Utama</w:t>
       </w:r>
@@ -4388,7 +4388,7 @@
       <w:pPr>
         <w:pStyle w:val="Heading2"/>
       </w:pPr>
-      <w:bookmarkStart w:id="2" w:name="_Toc236140226"/>
+      <w:bookmarkStart w:id="2" w:name="_Toc236150818"/>
       <w:r>
         <w:t>Layanan Eksternal</w:t>
       </w:r>
@@ -4793,7 +4793,7 @@
       <w:pPr>
         <w:pStyle w:val="Heading1"/>
       </w:pPr>
-      <w:bookmarkStart w:id="3" w:name="_Toc236140227"/>
+      <w:bookmarkStart w:id="3" w:name="_Toc236150819"/>
       <w:r>
         <w:lastRenderedPageBreak/>
         <w:t>Bab II   Penelusuran Struktur Kode</w:t>
@@ -5435,7 +5435,7 @@
       <w:pPr>
         <w:pStyle w:val="Heading2"/>
       </w:pPr>
-      <w:bookmarkStart w:id="4" w:name="_Toc236140228"/>
+      <w:bookmarkStart w:id="4" w:name="_Toc236150820"/>
       <w:r>
         <w:t>Rute dan Pembagian Peran</w:t>
       </w:r>
@@ -6741,7 +6741,7 @@
       <w:pPr>
         <w:pStyle w:val="Heading2"/>
       </w:pPr>
-      <w:bookmarkStart w:id="5" w:name="_Toc236140229"/>
+      <w:bookmarkStart w:id="5" w:name="_Toc236150821"/>
       <w:r>
         <w:t>Modul Server yang Perlu Dikenali</w:t>
       </w:r>
@@ -7769,7 +7769,7 @@
       <w:pPr>
         <w:pStyle w:val="Heading2"/>
       </w:pPr>
-      <w:bookmarkStart w:id="6" w:name="_Toc236140230"/>
+      <w:bookmarkStart w:id="6" w:name="_Toc236150822"/>
       <w:r>
         <w:t>Logika Bisnis yang Perlu Diperhatikan</w:t>
       </w:r>
@@ -8132,7 +8132,7 @@
       <w:pPr>
         <w:pStyle w:val="Heading2"/>
       </w:pPr>
-      <w:bookmarkStart w:id="7" w:name="_Toc236140231"/>
+      <w:bookmarkStart w:id="7" w:name="_Toc236150823"/>
       <w:r>
         <w:t>Urutan Membaca yang Disarankan</w:t>
       </w:r>
@@ -8256,7 +8256,7 @@
       <w:pPr>
         <w:pStyle w:val="Heading1"/>
       </w:pPr>
-      <w:bookmarkStart w:id="8" w:name="_Toc236140232"/>
+      <w:bookmarkStart w:id="8" w:name="_Toc236150824"/>
       <w:r>
         <w:lastRenderedPageBreak/>
         <w:t>Bab III   Panduan Persiapan Lingkungan</w:t>
@@ -8377,7 +8377,7 @@
       <w:pPr>
         <w:pStyle w:val="Heading2"/>
       </w:pPr>
-      <w:bookmarkStart w:id="9" w:name="_Toc236140233"/>
+      <w:bookmarkStart w:id="9" w:name="_Toc236150825"/>
       <w:r>
         <w:t>Variabel Environment</w:t>
       </w:r>
@@ -8812,7 +8812,7 @@
       <w:pPr>
         <w:pStyle w:val="Heading2"/>
       </w:pPr>
-      <w:bookmarkStart w:id="10" w:name="_Toc236140234"/>
+      <w:bookmarkStart w:id="10" w:name="_Toc236150826"/>
       <w:r>
         <w:t>Perintah npm</w:t>
       </w:r>
@@ -9232,7 +9232,7 @@
       <w:pPr>
         <w:pStyle w:val="Heading1"/>
       </w:pPr>
-      <w:bookmarkStart w:id="11" w:name="_Toc236140235"/>
+      <w:bookmarkStart w:id="11" w:name="_Toc236150827"/>
       <w:r>
         <w:lastRenderedPageBreak/>
         <w:t>Bab IV   Deployment dan Infrastruktur</w:t>
@@ -9263,7 +9263,7 @@
       <w:pPr>
         <w:pStyle w:val="Heading2"/>
       </w:pPr>
-      <w:bookmarkStart w:id="12" w:name="_Toc236140236"/>
+      <w:bookmarkStart w:id="12" w:name="_Toc236150828"/>
       <w:r>
         <w:t>Konfigurasi vercel.json</w:t>
       </w:r>
@@ -9389,7 +9389,7 @@
       <w:pPr>
         <w:pStyle w:val="Heading2"/>
       </w:pPr>
-      <w:bookmarkStart w:id="13" w:name="_Toc236140237"/>
+      <w:bookmarkStart w:id="13" w:name="_Toc236150829"/>
       <w:r>
         <w:t>Variabel Produksi dan Rollback</w:t>
       </w:r>
@@ -9428,7 +9428,7 @@
       <w:pPr>
         <w:pStyle w:val="Heading1"/>
       </w:pPr>
-      <w:bookmarkStart w:id="14" w:name="_Toc236140238"/>
+      <w:bookmarkStart w:id="14" w:name="_Toc236150830"/>
       <w:r>
         <w:lastRenderedPageBreak/>
         <w:t>Bab V   Dokumentasi Basis Data</w:t>
@@ -9854,7 +9854,7 @@
       <w:pPr>
         <w:pStyle w:val="Heading2"/>
       </w:pPr>
-      <w:bookmarkStart w:id="15" w:name="_Toc236140239"/>
+      <w:bookmarkStart w:id="15" w:name="_Toc236150831"/>
       <w:r>
         <w:t>Skema sebagai Kode</w:t>
       </w:r>
@@ -10070,7 +10070,7 @@
       <w:pPr>
         <w:pStyle w:val="Heading2"/>
       </w:pPr>
-      <w:bookmarkStart w:id="16" w:name="_Toc236140240"/>
+      <w:bookmarkStart w:id="16" w:name="_Toc236150832"/>
       <w:r>
         <w:t>Karakteristik Data yang Perlu Diketahui</w:t>
       </w:r>
@@ -10169,7 +10169,7 @@
       <w:pPr>
         <w:pStyle w:val="Heading1"/>
       </w:pPr>
-      <w:bookmarkStart w:id="17" w:name="_Toc236140241"/>
+      <w:bookmarkStart w:id="17" w:name="_Toc236150833"/>
       <w:r>
         <w:lastRenderedPageBreak/>
         <w:t>Bab VI   Masalah yang Diketahui dan Utang Teknis</w:t>
@@ -10190,7 +10190,7 @@
       <w:pPr>
         <w:pStyle w:val="Heading2"/>
       </w:pPr>
-      <w:bookmarkStart w:id="18" w:name="_Toc236140242"/>
+      <w:bookmarkStart w:id="18" w:name="_Toc236150834"/>
       <w:r>
         <w:t>Telah Diselesaikan pada Serah Terima Ini</w:t>
       </w:r>
@@ -10256,6 +10256,31 @@
           <w:b/>
           <w:color w:val="16365C"/>
         </w:rPr>
+        <w:t>Kebocoran otorisasi pada aksi pemberitahuan ditutup.</w:t>
+      </w:r>
+      <w:r>
+        <w:t xml:space="preserve"> Ketiga Server Action pemberitahuan di src/lib/actions.ts, yaitu getNotifications, markNotificationAsRead, dan markAllNotificationsAsRead, sama sekali tidak memeriksa sesi dan menerima id pengguna sebagai argumen. Karena setiap Server Action sesungguhnya adalah endpoint POST yang dapat dipanggil siapa pun, siapa saja bisa membaca seluruh pemberitahuan milik pegawai lain atau menandainya sudah dibaca hanya dengan menebak angka id. Sekarang ketiganya memanggil requireSession dan pemilik pemberitahuan selalu d</w:t>
+      </w:r>
+      <w:r>
+        <w:t>iambil dari sesi, bukan dari argumen; perintah UPDATE pada satu pemberitahuan juga dibatasi dengan syarat user_id sehingga baris milik orang lain tidak mungkin tersentuh. Sebagai aturan umum, jangan pernah mempercayai id pengguna yang datang sebagai parameter Server Action.</w:t>
+      </w:r>
+    </w:p>
+    <w:p>
+      <w:pPr>
+        <w:pStyle w:val="ListParagraph"/>
+        <w:spacing w:after="90" w:line="330" w:lineRule="auto"/>
+        <w:ind w:left="700" w:hanging="340"/>
+        <w:jc w:val="both"/>
+      </w:pPr>
+      <w:r>
+        <w:lastRenderedPageBreak/>
+        <w:t xml:space="preserve">–  </w:t>
+      </w:r>
+      <w:r>
+        <w:rPr>
+          <w:b/>
+          <w:color w:val="16365C"/>
+        </w:rPr>
         <w:t>Tombol tandai sudah dibaca pada lonceng diperbaiki.</w:t>
       </w:r>
       <w:r>
@@ -10291,7 +10316,6 @@
         <w:jc w:val="both"/>
       </w:pPr>
       <w:r>
-        <w:lastRenderedPageBreak/>
         <w:t xml:space="preserve">–  </w:t>
       </w:r>
       <w:r>
@@ -10351,7 +10375,7 @@
       <w:pPr>
         <w:pStyle w:val="Heading2"/>
       </w:pPr>
-      <w:bookmarkStart w:id="19" w:name="_Toc236140243"/>
+      <w:bookmarkStart w:id="19" w:name="_Toc236150835"/>
       <w:r>
         <w:t>Utang Teknis yang Masih Tersisa</w:t>
       </w:r>
@@ -10407,6 +10431,7 @@
         <w:jc w:val="both"/>
       </w:pPr>
       <w:r>
+        <w:lastRenderedPageBreak/>
         <w:t xml:space="preserve">–  </w:t>
       </w:r>
       <w:r>
@@ -10449,7 +10474,6 @@
         <w:jc w:val="both"/>
       </w:pPr>
       <w:r>
-        <w:lastRenderedPageBreak/>
         <w:t xml:space="preserve">–  </w:t>
       </w:r>
       <w:r>
@@ -10556,7 +10580,7 @@
       <w:pPr>
         <w:pStyle w:val="Heading1"/>
       </w:pPr>
-      <w:bookmarkStart w:id="20" w:name="_Toc236140244"/>
+      <w:bookmarkStart w:id="20" w:name="_Toc236150836"/>
       <w:r>
         <w:lastRenderedPageBreak/>
         <w:t>Bab VII   Pengujian</w:t>
@@ -11171,7 +11195,7 @@
       <w:pPr>
         <w:pStyle w:val="Heading1"/>
       </w:pPr>
-      <w:bookmarkStart w:id="21" w:name="_Toc236140245"/>
+      <w:bookmarkStart w:id="21" w:name="_Toc236150837"/>
       <w:r>
         <w:lastRenderedPageBreak/>
         <w:t>Bab VIII   Dependensi Pihak Ketiga dan Lisensi</w:t>
@@ -13445,7 +13469,7 @@
       <w:pPr>
         <w:pStyle w:val="Heading1"/>
       </w:pPr>
-      <w:bookmarkStart w:id="22" w:name="_Toc236140246"/>
+      <w:bookmarkStart w:id="22" w:name="_Toc236150838"/>
       <w:r>
         <w:lastRenderedPageBreak/>
         <w:t>Bab IX   Runbook Pemeliharaan</w:t>
@@ -13466,7 +13490,7 @@
       <w:pPr>
         <w:pStyle w:val="Heading2"/>
       </w:pPr>
-      <w:bookmarkStart w:id="23" w:name="_Toc236140247"/>
+      <w:bookmarkStart w:id="23" w:name="_Toc236150839"/>
       <w:r>
         <w:t>Prosedur Rutin</w:t>
       </w:r>
@@ -13623,7 +13647,7 @@
       <w:pPr>
         <w:pStyle w:val="Heading2"/>
       </w:pPr>
-      <w:bookmarkStart w:id="24" w:name="_Toc236140248"/>
+      <w:bookmarkStart w:id="24" w:name="_Toc236150840"/>
       <w:r>
         <w:t>Logging, Pemantauan, dan Pencadangan</w:t>
       </w:r>
@@ -13665,7 +13689,7 @@
       <w:pPr>
         <w:pStyle w:val="Heading1"/>
       </w:pPr>
-      <w:bookmarkStart w:id="25" w:name="_Toc236140249"/>
+      <w:bookmarkStart w:id="25" w:name="_Toc236150841"/>
       <w:r>
         <w:lastRenderedPageBreak/>
         <w:t>Bab X   Ringkasan Serah Terima dan Langkah Selanjutnya</w:t>
@@ -13699,7 +13723,7 @@
       <w:pPr>
         <w:pStyle w:val="Heading2"/>
       </w:pPr>
-      <w:bookmarkStart w:id="26" w:name="_Toc236140250"/>
+      <w:bookmarkStart w:id="26" w:name="_Toc236150842"/>
       <w:r>
         <w:t>Tiga Langkah Pertama bagi Pemelihara Baru</w:t>
       </w:r>
@@ -13763,7 +13787,7 @@
       <w:pPr>
         <w:pStyle w:val="Heading2"/>
       </w:pPr>
-      <w:bookmarkStart w:id="27" w:name="_Toc236140251"/>
+      <w:bookmarkStart w:id="27" w:name="_Toc236150843"/>
       <w:r>
         <w:t>Pekerjaan Lanjutan yang Disarankan</w:t>
       </w:r>
@@ -13877,7 +13901,7 @@
 </file>
 
 <file path=word/endnotes.xml><?xml version="1.0" encoding="utf-8"?>
-<w:endnotes xmlns:wpc="http://schemas.microsoft.com/office/word/2010/wordprocessingCanvas" xmlns:cx="http://schemas.microsoft.com/office/drawing/2014/chartex" xmlns:cx1="http://schemas.microsoft.com/office/drawing/2015/9/8/chartex" xmlns:cx2="http://schemas.microsoft.com/office/drawing/2015/10/21/chartex" xmlns:cx3="http://schemas.microsoft.com/office/drawing/2016/5/9/chartex" xmlns:cx4="http://schemas.microsoft.com/office/drawing/2016/5/10/chartex" xmlns:cx5="http://schemas.microsoft.com/office/drawing/2016/5/11/chartex" xmlns:cx6="http://schemas.microsoft.com/office/drawing/2016/5/12/chartex" xmlns:cx7="http://schemas.microsoft.com/office/drawing/2016/5/13/chartex" xmlns:cx8="http://schemas.microsoft.com/office/drawing/2016/5/14/chartex" xmlns:mc="http://schemas.openxmlformats.org/markup-compatibility/2006" xmlns:aink="http://schemas.microsoft.com/office/drawing/2016/ink" xmlns:am3d="http://schemas.microsoft.com/office/drawing/2017/model3d" xmlns:o="urn:schemas-microsoft-com:office:office" xmlns:oel="http://schemas.microsoft.com/office/2019/extlst" xmlns:r="http://schemas.openxmlformats.org/officeDocument/2006/relationships" xmlns:m="http://schemas.openxmlformats.org/officeDocument/2006/math" xmlns:v="urn:schemas-microsoft-com:vml" xmlns:wp14="http://schemas.microsoft.com/office/word/2010/wordprocessingDrawing" xmlns:wp="http://schemas.openxmlformats.org/drawingml/2006/wordprocessingDrawing" xmlns:w10="urn:schemas-microsoft-com:office:word" xmlns:w="http://schemas.openxmlformats.org/wordprocessingml/2006/main" xmlns:w14="http://schemas.microsoft.com/office/word/2010/wordml" xmlns:w15="http://schemas.microsoft.com/office/word/2012/wordml" xmlns:w16cex="http://schemas.microsoft.com/office/word/2018/wordml/cex" xmlns:w16cid="http://schemas.microsoft.com/office/word/2016/wordml/cid" xmlns:w16="http://schemas.microsoft.com/office/word/2018/wordml" xmlns:w16du="http://schemas.microsoft.com/office/word/2023/wordml/word16du" xmlns:w16sdtdh="http://schemas.microsoft.com/office/word/2020/wordml/sdtdatahash" xmlns:w16sdtfl="http://schemas.microsoft.com/office/word/2024/wordml/sdtformatlock" xmlns:w16se="http://schemas.microsoft.com/office/word/2015/wordml/symex" xmlns:wpg="http://schemas.microsoft.com/office/word/2010/wordprocessingGroup" xmlns:wpi="http://schemas.microsoft.com/office/word/2010/wordprocessingInk" xmlns:wne="http://schemas.microsoft.com/office/word/2006/wordml" xmlns:wps="http://schemas.microsoft.com/office/word/2010/wordprocessingShape" mc:Ignorable="w14 w15 w16se w16cid w16 w16cex w16sdtdh w16sdtfl w16du wp14">
+<w:endnotes xmlns:wpc="http://schemas.microsoft.com/office/word/2010/wordprocessingCanvas" xmlns:cx="http://schemas.microsoft.com/office/drawing/2014/chartex" xmlns:cx1="http://schemas.microsoft.com/office/drawing/2015/9/8/chartex" xmlns:cx2="http://schemas.microsoft.com/office/drawing/2015/10/21/chartex" xmlns:cx3="http://schemas.microsoft.com/office/drawing/2016/5/9/chartex" xmlns:cx4="http://schemas.microsoft.com/office/drawing/2016/5/10/chartex" xmlns:cx5="http://schemas.microsoft.com/office/drawing/2016/5/11/chartex" xmlns:cx6="http://schemas.microsoft.com/office/drawing/2016/5/12/chartex" xmlns:cx7="http://schemas.microsoft.com/office/drawing/2016/5/13/chartex" xmlns:cx8="http://schemas.microsoft.com/office/drawing/2016/5/14/chartex" xmlns:mc="http://schemas.openxmlformats.org/markup-compatibility/2006" xmlns:aink="http://schemas.microsoft.com/office/drawing/2016/ink" xmlns:am3d="http://schemas.microsoft.com/office/drawing/2017/model3d" xmlns:o="urn:schemas-microsoft-com:office:office" xmlns:oel="http://schemas.microsoft.com/office/2019/extlst" xmlns:r="http://schemas.openxmlformats.org/officeDocument/2006/relationships" xmlns:m="http://schemas.openxmlformats.org/officeDocument/2006/math" xmlns:v="urn:schemas-microsoft-com:vml" xmlns:wp14="http://schemas.microsoft.com/office/word/2010/wordprocessingDrawing" xmlns:wp="http://schemas.openxmlformats.org/drawingml/2006/wordprocessingDrawing" xmlns:w10="urn:schemas-microsoft-com:office:word" xmlns:w="http://schemas.openxmlformats.org/wordprocessingml/2006/main" xmlns:w14="http://schemas.microsoft.com/office/word/2010/wordml" xmlns:w15="http://schemas.microsoft.com/office/word/2012/wordml" xmlns:w16cei="http://schemas.microsoft.com/office/word/2026/wordml/cei" xmlns:w16cex="http://schemas.microsoft.com/office/word/2018/wordml/cex" xmlns:w16cid="http://schemas.microsoft.com/office/word/2016/wordml/cid" xmlns:w16="http://schemas.microsoft.com/office/word/2018/wordml" xmlns:w16du="http://schemas.microsoft.com/office/word/2023/wordml/word16du" xmlns:w16sdtdh="http://schemas.microsoft.com/office/word/2020/wordml/sdtdatahash" xmlns:w16sdtfl="http://schemas.microsoft.com/office/word/2024/wordml/sdtformatlock" xmlns:w16se="http://schemas.microsoft.com/office/word/2015/wordml/symex" xmlns:wpg="http://schemas.microsoft.com/office/word/2010/wordprocessingGroup" xmlns:wpi="http://schemas.microsoft.com/office/word/2010/wordprocessingInk" xmlns:wne="http://schemas.microsoft.com/office/word/2006/wordml" xmlns:wps="http://schemas.microsoft.com/office/word/2010/wordprocessingShape" mc:Ignorable="w14 w15 w16se w16cid w16 w16cex w16sdtdh w16sdtfl w16du wp14">
   <w:endnote w:type="separator" w:id="-1">
     <w:p>
       <w:r>
@@ -13896,7 +13920,7 @@
 </file>
 
 <file path=word/footer1.xml><?xml version="1.0" encoding="utf-8"?>
-<w:ftr xmlns:wpc="http://schemas.microsoft.com/office/word/2010/wordprocessingCanvas" xmlns:cx="http://schemas.microsoft.com/office/drawing/2014/chartex" xmlns:cx1="http://schemas.microsoft.com/office/drawing/2015/9/8/chartex" xmlns:cx2="http://schemas.microsoft.com/office/drawing/2015/10/21/chartex" xmlns:cx3="http://schemas.microsoft.com/office/drawing/2016/5/9/chartex" xmlns:cx4="http://schemas.microsoft.com/office/drawing/2016/5/10/chartex" xmlns:cx5="http://schemas.microsoft.com/office/drawing/2016/5/11/chartex" xmlns:cx6="http://schemas.microsoft.com/office/drawing/2016/5/12/chartex" xmlns:cx7="http://schemas.microsoft.com/office/drawing/2016/5/13/chartex" xmlns:cx8="http://schemas.microsoft.com/office/drawing/2016/5/14/chartex" xmlns:mc="http://schemas.openxmlformats.org/markup-compatibility/2006" xmlns:aink="http://schemas.microsoft.com/office/drawing/2016/ink" xmlns:am3d="http://schemas.microsoft.com/office/drawing/2017/model3d" xmlns:o="urn:schemas-microsoft-com:office:office" xmlns:oel="http://schemas.microsoft.com/office/2019/extlst" xmlns:r="http://schemas.openxmlformats.org/officeDocument/2006/relationships" xmlns:m="http://schemas.openxmlformats.org/officeDocument/2006/math" xmlns:v="urn:schemas-microsoft-com:vml" xmlns:wp14="http://schemas.microsoft.com/office/word/2010/wordprocessingDrawing" xmlns:wp="http://schemas.openxmlformats.org/drawingml/2006/wordprocessingDrawing" xmlns:w10="urn:schemas-microsoft-com:office:word" xmlns:w="http://schemas.openxmlformats.org/wordprocessingml/2006/main" xmlns:w14="http://schemas.microsoft.com/office/word/2010/wordml" xmlns:w15="http://schemas.microsoft.com/office/word/2012/wordml" xmlns:w16cex="http://schemas.microsoft.com/office/word/2018/wordml/cex" xmlns:w16cid="http://schemas.microsoft.com/office/word/2016/wordml/cid" xmlns:w16="http://schemas.microsoft.com/office/word/2018/wordml" xmlns:w16du="http://schemas.microsoft.com/office/word/2023/wordml/word16du" xmlns:w16sdtdh="http://schemas.microsoft.com/office/word/2020/wordml/sdtdatahash" xmlns:w16sdtfl="http://schemas.microsoft.com/office/word/2024/wordml/sdtformatlock" xmlns:w16se="http://schemas.microsoft.com/office/word/2015/wordml/symex" xmlns:wpg="http://schemas.microsoft.com/office/word/2010/wordprocessingGroup" xmlns:wpi="http://schemas.microsoft.com/office/word/2010/wordprocessingInk" xmlns:wne="http://schemas.microsoft.com/office/word/2006/wordml" xmlns:wps="http://schemas.microsoft.com/office/word/2010/wordprocessingShape" mc:Ignorable="w14 w15 w16se w16cid w16 w16cex w16sdtdh w16sdtfl w16du wp14">
+<w:ftr xmlns:wpc="http://schemas.microsoft.com/office/word/2010/wordprocessingCanvas" xmlns:cx="http://schemas.microsoft.com/office/drawing/2014/chartex" xmlns:cx1="http://schemas.microsoft.com/office/drawing/2015/9/8/chartex" xmlns:cx2="http://schemas.microsoft.com/office/drawing/2015/10/21/chartex" xmlns:cx3="http://schemas.microsoft.com/office/drawing/2016/5/9/chartex" xmlns:cx4="http://schemas.microsoft.com/office/drawing/2016/5/10/chartex" xmlns:cx5="http://schemas.microsoft.com/office/drawing/2016/5/11/chartex" xmlns:cx6="http://schemas.microsoft.com/office/drawing/2016/5/12/chartex" xmlns:cx7="http://schemas.microsoft.com/office/drawing/2016/5/13/chartex" xmlns:cx8="http://schemas.microsoft.com/office/drawing/2016/5/14/chartex" xmlns:mc="http://schemas.openxmlformats.org/markup-compatibility/2006" xmlns:aink="http://schemas.microsoft.com/office/drawing/2016/ink" xmlns:am3d="http://schemas.microsoft.com/office/drawing/2017/model3d" xmlns:o="urn:schemas-microsoft-com:office:office" xmlns:oel="http://schemas.microsoft.com/office/2019/extlst" xmlns:r="http://schemas.openxmlformats.org/officeDocument/2006/relationships" xmlns:m="http://schemas.openxmlformats.org/officeDocument/2006/math" xmlns:v="urn:schemas-microsoft-com:vml" xmlns:wp14="http://schemas.microsoft.com/office/word/2010/wordprocessingDrawing" xmlns:wp="http://schemas.openxmlformats.org/drawingml/2006/wordprocessingDrawing" xmlns:w10="urn:schemas-microsoft-com:office:word" xmlns:w="http://schemas.openxmlformats.org/wordprocessingml/2006/main" xmlns:w14="http://schemas.microsoft.com/office/word/2010/wordml" xmlns:w15="http://schemas.microsoft.com/office/word/2012/wordml" xmlns:w16cei="http://schemas.microsoft.com/office/word/2026/wordml/cei" xmlns:w16cex="http://schemas.microsoft.com/office/word/2018/wordml/cex" xmlns:w16cid="http://schemas.microsoft.com/office/word/2016/wordml/cid" xmlns:w16="http://schemas.microsoft.com/office/word/2018/wordml" xmlns:w16du="http://schemas.microsoft.com/office/word/2023/wordml/word16du" xmlns:w16sdtdh="http://schemas.microsoft.com/office/word/2020/wordml/sdtdatahash" xmlns:w16sdtfl="http://schemas.microsoft.com/office/word/2024/wordml/sdtformatlock" xmlns:w16se="http://schemas.microsoft.com/office/word/2015/wordml/symex" xmlns:wpg="http://schemas.microsoft.com/office/word/2010/wordprocessingGroup" xmlns:wpi="http://schemas.microsoft.com/office/word/2010/wordprocessingInk" xmlns:wne="http://schemas.microsoft.com/office/word/2006/wordml" xmlns:wps="http://schemas.microsoft.com/office/word/2010/wordprocessingShape" mc:Ignorable="w14 w15 w16se w16cid w16 w16cex w16sdtdh w16sdtfl w16du wp14">
   <w:p>
     <w:r>
       <w:cr/>
@@ -13906,7 +13930,7 @@
 </file>
 
 <file path=word/footer2.xml><?xml version="1.0" encoding="utf-8"?>
-<w:ftr xmlns:wpc="http://schemas.microsoft.com/office/word/2010/wordprocessingCanvas" xmlns:cx="http://schemas.microsoft.com/office/drawing/2014/chartex" xmlns:cx1="http://schemas.microsoft.com/office/drawing/2015/9/8/chartex" xmlns:cx2="http://schemas.microsoft.com/office/drawing/2015/10/21/chartex" xmlns:cx3="http://schemas.microsoft.com/office/drawing/2016/5/9/chartex" xmlns:cx4="http://schemas.microsoft.com/office/drawing/2016/5/10/chartex" xmlns:cx5="http://schemas.microsoft.com/office/drawing/2016/5/11/chartex" xmlns:cx6="http://schemas.microsoft.com/office/drawing/2016/5/12/chartex" xmlns:cx7="http://schemas.microsoft.com/office/drawing/2016/5/13/chartex" xmlns:cx8="http://schemas.microsoft.com/office/drawing/2016/5/14/chartex" xmlns:mc="http://schemas.openxmlformats.org/markup-compatibility/2006" xmlns:aink="http://schemas.microsoft.com/office/drawing/2016/ink" xmlns:am3d="http://schemas.microsoft.com/office/drawing/2017/model3d" xmlns:o="urn:schemas-microsoft-com:office:office" xmlns:oel="http://schemas.microsoft.com/office/2019/extlst" xmlns:r="http://schemas.openxmlformats.org/officeDocument/2006/relationships" xmlns:m="http://schemas.openxmlformats.org/officeDocument/2006/math" xmlns:v="urn:schemas-microsoft-com:vml" xmlns:wp14="http://schemas.microsoft.com/office/word/2010/wordprocessingDrawing" xmlns:wp="http://schemas.openxmlformats.org/drawingml/2006/wordprocessingDrawing" xmlns:w10="urn:schemas-microsoft-com:office:word" xmlns:w="http://schemas.openxmlformats.org/wordprocessingml/2006/main" xmlns:w14="http://schemas.microsoft.com/office/word/2010/wordml" xmlns:w15="http://schemas.microsoft.com/office/word/2012/wordml" xmlns:w16cex="http://schemas.microsoft.com/office/word/2018/wordml/cex" xmlns:w16cid="http://schemas.microsoft.com/office/word/2016/wordml/cid" xmlns:w16="http://schemas.microsoft.com/office/word/2018/wordml" xmlns:w16du="http://schemas.microsoft.com/office/word/2023/wordml/word16du" xmlns:w16sdtdh="http://schemas.microsoft.com/office/word/2020/wordml/sdtdatahash" xmlns:w16sdtfl="http://schemas.microsoft.com/office/word/2024/wordml/sdtformatlock" xmlns:w16se="http://schemas.microsoft.com/office/word/2015/wordml/symex" xmlns:wpg="http://schemas.microsoft.com/office/word/2010/wordprocessingGroup" xmlns:wpi="http://schemas.microsoft.com/office/word/2010/wordprocessingInk" xmlns:wne="http://schemas.microsoft.com/office/word/2006/wordml" xmlns:wps="http://schemas.microsoft.com/office/word/2010/wordprocessingShape" mc:Ignorable="w14 w15 w16se w16cid w16 w16cex w16sdtdh w16sdtfl w16du wp14">
+<w:ftr xmlns:wpc="http://schemas.microsoft.com/office/word/2010/wordprocessingCanvas" xmlns:cx="http://schemas.microsoft.com/office/drawing/2014/chartex" xmlns:cx1="http://schemas.microsoft.com/office/drawing/2015/9/8/chartex" xmlns:cx2="http://schemas.microsoft.com/office/drawing/2015/10/21/chartex" xmlns:cx3="http://schemas.microsoft.com/office/drawing/2016/5/9/chartex" xmlns:cx4="http://schemas.microsoft.com/office/drawing/2016/5/10/chartex" xmlns:cx5="http://schemas.microsoft.com/office/drawing/2016/5/11/chartex" xmlns:cx6="http://schemas.microsoft.com/office/drawing/2016/5/12/chartex" xmlns:cx7="http://schemas.microsoft.com/office/drawing/2016/5/13/chartex" xmlns:cx8="http://schemas.microsoft.com/office/drawing/2016/5/14/chartex" xmlns:mc="http://schemas.openxmlformats.org/markup-compatibility/2006" xmlns:aink="http://schemas.microsoft.com/office/drawing/2016/ink" xmlns:am3d="http://schemas.microsoft.com/office/drawing/2017/model3d" xmlns:o="urn:schemas-microsoft-com:office:office" xmlns:oel="http://schemas.microsoft.com/office/2019/extlst" xmlns:r="http://schemas.openxmlformats.org/officeDocument/2006/relationships" xmlns:m="http://schemas.openxmlformats.org/officeDocument/2006/math" xmlns:v="urn:schemas-microsoft-com:vml" xmlns:wp14="http://schemas.microsoft.com/office/word/2010/wordprocessingDrawing" xmlns:wp="http://schemas.openxmlformats.org/drawingml/2006/wordprocessingDrawing" xmlns:w10="urn:schemas-microsoft-com:office:word" xmlns:w="http://schemas.openxmlformats.org/wordprocessingml/2006/main" xmlns:w14="http://schemas.microsoft.com/office/word/2010/wordml" xmlns:w15="http://schemas.microsoft.com/office/word/2012/wordml" xmlns:w16cei="http://schemas.microsoft.com/office/word/2026/wordml/cei" xmlns:w16cex="http://schemas.microsoft.com/office/word/2018/wordml/cex" xmlns:w16cid="http://schemas.microsoft.com/office/word/2016/wordml/cid" xmlns:w16="http://schemas.microsoft.com/office/word/2018/wordml" xmlns:w16du="http://schemas.microsoft.com/office/word/2023/wordml/word16du" xmlns:w16sdtdh="http://schemas.microsoft.com/office/word/2020/wordml/sdtdatahash" xmlns:w16sdtfl="http://schemas.microsoft.com/office/word/2024/wordml/sdtformatlock" xmlns:w16se="http://schemas.microsoft.com/office/word/2015/wordml/symex" xmlns:wpg="http://schemas.microsoft.com/office/word/2010/wordprocessingGroup" xmlns:wpi="http://schemas.microsoft.com/office/word/2010/wordprocessingInk" xmlns:wne="http://schemas.microsoft.com/office/word/2006/wordml" xmlns:wps="http://schemas.microsoft.com/office/word/2010/wordprocessingShape" mc:Ignorable="w14 w15 w16se w16cid w16 w16cex w16sdtdh w16sdtfl w16du wp14">
   <w:sdt>
     <w:sdtPr>
       <w:id w:val="-289980713"/>
@@ -13965,7 +13989,7 @@
 </file>
 
 <file path=word/footnotes.xml><?xml version="1.0" encoding="utf-8"?>
-<w:footnotes xmlns:wpc="http://schemas.microsoft.com/office/word/2010/wordprocessingCanvas" xmlns:cx="http://schemas.microsoft.com/office/drawing/2014/chartex" xmlns:cx1="http://schemas.microsoft.com/office/drawing/2015/9/8/chartex" xmlns:cx2="http://schemas.microsoft.com/office/drawing/2015/10/21/chartex" xmlns:cx3="http://schemas.microsoft.com/office/drawing/2016/5/9/chartex" xmlns:cx4="http://schemas.microsoft.com/office/drawing/2016/5/10/chartex" xmlns:cx5="http://schemas.microsoft.com/office/drawing/2016/5/11/chartex" xmlns:cx6="http://schemas.microsoft.com/office/drawing/2016/5/12/chartex" xmlns:cx7="http://schemas.microsoft.com/office/drawing/2016/5/13/chartex" xmlns:cx8="http://schemas.microsoft.com/office/drawing/2016/5/14/chartex" xmlns:mc="http://schemas.openxmlformats.org/markup-compatibility/2006" xmlns:aink="http://schemas.microsoft.com/office/drawing/2016/ink" xmlns:am3d="http://schemas.microsoft.com/office/drawing/2017/model3d" xmlns:o="urn:schemas-microsoft-com:office:office" xmlns:oel="http://schemas.microsoft.com/office/2019/extlst" xmlns:r="http://schemas.openxmlformats.org/officeDocument/2006/relationships" xmlns:m="http://schemas.openxmlformats.org/officeDocument/2006/math" xmlns:v="urn:schemas-microsoft-com:vml" xmlns:wp14="http://schemas.microsoft.com/office/word/2010/wordprocessingDrawing" xmlns:wp="http://schemas.openxmlformats.org/drawingml/2006/wordprocessingDrawing" xmlns:w10="urn:schemas-microsoft-com:office:word" xmlns:w="http://schemas.openxmlformats.org/wordprocessingml/2006/main" xmlns:w14="http://schemas.microsoft.com/office/word/2010/wordml" xmlns:w15="http://schemas.microsoft.com/office/word/2012/wordml" xmlns:w16cex="http://schemas.microsoft.com/office/word/2018/wordml/cex" xmlns:w16cid="http://schemas.microsoft.com/office/word/2016/wordml/cid" xmlns:w16="http://schemas.microsoft.com/office/word/2018/wordml" xmlns:w16du="http://schemas.microsoft.com/office/word/2023/wordml/word16du" xmlns:w16sdtdh="http://schemas.microsoft.com/office/word/2020/wordml/sdtdatahash" xmlns:w16sdtfl="http://schemas.microsoft.com/office/word/2024/wordml/sdtformatlock" xmlns:w16se="http://schemas.microsoft.com/office/word/2015/wordml/symex" xmlns:wpg="http://schemas.microsoft.com/office/word/2010/wordprocessingGroup" xmlns:wpi="http://schemas.microsoft.com/office/word/2010/wordprocessingInk" xmlns:wne="http://schemas.microsoft.com/office/word/2006/wordml" xmlns:wps="http://schemas.microsoft.com/office/word/2010/wordprocessingShape" mc:Ignorable="w14 w15 w16se w16cid w16 w16cex w16sdtdh w16sdtfl w16du wp14">
+<w:footnotes xmlns:wpc="http://schemas.microsoft.com/office/word/2010/wordprocessingCanvas" xmlns:cx="http://schemas.microsoft.com/office/drawing/2014/chartex" xmlns:cx1="http://schemas.microsoft.com/office/drawing/2015/9/8/chartex" xmlns:cx2="http://schemas.microsoft.com/office/drawing/2015/10/21/chartex" xmlns:cx3="http://schemas.microsoft.com/office/drawing/2016/5/9/chartex" xmlns:cx4="http://schemas.microsoft.com/office/drawing/2016/5/10/chartex" xmlns:cx5="http://schemas.microsoft.com/office/drawing/2016/5/11/chartex" xmlns:cx6="http://schemas.microsoft.com/office/drawing/2016/5/12/chartex" xmlns:cx7="http://schemas.microsoft.com/office/drawing/2016/5/13/chartex" xmlns:cx8="http://schemas.microsoft.com/office/drawing/2016/5/14/chartex" xmlns:mc="http://schemas.openxmlformats.org/markup-compatibility/2006" xmlns:aink="http://schemas.microsoft.com/office/drawing/2016/ink" xmlns:am3d="http://schemas.microsoft.com/office/drawing/2017/model3d" xmlns:o="urn:schemas-microsoft-com:office:office" xmlns:oel="http://schemas.microsoft.com/office/2019/extlst" xmlns:r="http://schemas.openxmlformats.org/officeDocument/2006/relationships" xmlns:m="http://schemas.openxmlformats.org/officeDocument/2006/math" xmlns:v="urn:schemas-microsoft-com:vml" xmlns:wp14="http://schemas.microsoft.com/office/word/2010/wordprocessingDrawing" xmlns:wp="http://schemas.openxmlformats.org/drawingml/2006/wordprocessingDrawing" xmlns:w10="urn:schemas-microsoft-com:office:word" xmlns:w="http://schemas.openxmlformats.org/wordprocessingml/2006/main" xmlns:w14="http://schemas.microsoft.com/office/word/2010/wordml" xmlns:w15="http://schemas.microsoft.com/office/word/2012/wordml" xmlns:w16cei="http://schemas.microsoft.com/office/word/2026/wordml/cei" xmlns:w16cex="http://schemas.microsoft.com/office/word/2018/wordml/cex" xmlns:w16cid="http://schemas.microsoft.com/office/word/2016/wordml/cid" xmlns:w16="http://schemas.microsoft.com/office/word/2018/wordml" xmlns:w16du="http://schemas.microsoft.com/office/word/2023/wordml/word16du" xmlns:w16sdtdh="http://schemas.microsoft.com/office/word/2020/wordml/sdtdatahash" xmlns:w16sdtfl="http://schemas.microsoft.com/office/word/2024/wordml/sdtformatlock" xmlns:w16se="http://schemas.microsoft.com/office/word/2015/wordml/symex" xmlns:wpg="http://schemas.microsoft.com/office/word/2010/wordprocessingGroup" xmlns:wpi="http://schemas.microsoft.com/office/word/2010/wordprocessingInk" xmlns:wne="http://schemas.microsoft.com/office/word/2006/wordml" xmlns:wps="http://schemas.microsoft.com/office/word/2010/wordprocessingShape" mc:Ignorable="w14 w15 w16se w16cid w16 w16cex w16sdtdh w16sdtfl w16du wp14">
   <w:footnote w:type="separator" w:id="-1">
     <w:p>
       <w:r>
@@ -13984,7 +14008,7 @@
 </file>
 
 <file path=word/header1.xml><?xml version="1.0" encoding="utf-8"?>
-<w:hdr xmlns:wpc="http://schemas.microsoft.com/office/word/2010/wordprocessingCanvas" xmlns:cx="http://schemas.microsoft.com/office/drawing/2014/chartex" xmlns:cx1="http://schemas.microsoft.com/office/drawing/2015/9/8/chartex" xmlns:cx2="http://schemas.microsoft.com/office/drawing/2015/10/21/chartex" xmlns:cx3="http://schemas.microsoft.com/office/drawing/2016/5/9/chartex" xmlns:cx4="http://schemas.microsoft.com/office/drawing/2016/5/10/chartex" xmlns:cx5="http://schemas.microsoft.com/office/drawing/2016/5/11/chartex" xmlns:cx6="http://schemas.microsoft.com/office/drawing/2016/5/12/chartex" xmlns:cx7="http://schemas.microsoft.com/office/drawing/2016/5/13/chartex" xmlns:cx8="http://schemas.microsoft.com/office/drawing/2016/5/14/chartex" xmlns:mc="http://schemas.openxmlformats.org/markup-compatibility/2006" xmlns:aink="http://schemas.microsoft.com/office/drawing/2016/ink" xmlns:am3d="http://schemas.microsoft.com/office/drawing/2017/model3d" xmlns:o="urn:schemas-microsoft-com:office:office" xmlns:oel="http://schemas.microsoft.com/office/2019/extlst" xmlns:r="http://schemas.openxmlformats.org/officeDocument/2006/relationships" xmlns:m="http://schemas.openxmlformats.org/officeDocument/2006/math" xmlns:v="urn:schemas-microsoft-com:vml" xmlns:wp14="http://schemas.microsoft.com/office/word/2010/wordprocessingDrawing" xmlns:wp="http://schemas.openxmlformats.org/drawingml/2006/wordprocessingDrawing" xmlns:w10="urn:schemas-microsoft-com:office:word" xmlns:w="http://schemas.openxmlformats.org/wordprocessingml/2006/main" xmlns:w14="http://schemas.microsoft.com/office/word/2010/wordml" xmlns:w15="http://schemas.microsoft.com/office/word/2012/wordml" xmlns:w16cex="http://schemas.microsoft.com/office/word/2018/wordml/cex" xmlns:w16cid="http://schemas.microsoft.com/office/word/2016/wordml/cid" xmlns:w16="http://schemas.microsoft.com/office/word/2018/wordml" xmlns:w16du="http://schemas.microsoft.com/office/word/2023/wordml/word16du" xmlns:w16sdtdh="http://schemas.microsoft.com/office/word/2020/wordml/sdtdatahash" xmlns:w16sdtfl="http://schemas.microsoft.com/office/word/2024/wordml/sdtformatlock" xmlns:w16se="http://schemas.microsoft.com/office/word/2015/wordml/symex" xmlns:wpg="http://schemas.microsoft.com/office/word/2010/wordprocessingGroup" xmlns:wpi="http://schemas.microsoft.com/office/word/2010/wordprocessingInk" xmlns:wne="http://schemas.microsoft.com/office/word/2006/wordml" xmlns:wps="http://schemas.microsoft.com/office/word/2010/wordprocessingShape" mc:Ignorable="w14 w15 w16se w16cid w16 w16cex w16sdtdh w16sdtfl w16du wp14">
+<w:hdr xmlns:wpc="http://schemas.microsoft.com/office/word/2010/wordprocessingCanvas" xmlns:cx="http://schemas.microsoft.com/office/drawing/2014/chartex" xmlns:cx1="http://schemas.microsoft.com/office/drawing/2015/9/8/chartex" xmlns:cx2="http://schemas.microsoft.com/office/drawing/2015/10/21/chartex" xmlns:cx3="http://schemas.microsoft.com/office/drawing/2016/5/9/chartex" xmlns:cx4="http://schemas.microsoft.com/office/drawing/2016/5/10/chartex" xmlns:cx5="http://schemas.microsoft.com/office/drawing/2016/5/11/chartex" xmlns:cx6="http://schemas.microsoft.com/office/drawing/2016/5/12/chartex" xmlns:cx7="http://schemas.microsoft.com/office/drawing/2016/5/13/chartex" xmlns:cx8="http://schemas.microsoft.com/office/drawing/2016/5/14/chartex" xmlns:mc="http://schemas.openxmlformats.org/markup-compatibility/2006" xmlns:aink="http://schemas.microsoft.com/office/drawing/2016/ink" xmlns:am3d="http://schemas.microsoft.com/office/drawing/2017/model3d" xmlns:o="urn:schemas-microsoft-com:office:office" xmlns:oel="http://schemas.microsoft.com/office/2019/extlst" xmlns:r="http://schemas.openxmlformats.org/officeDocument/2006/relationships" xmlns:m="http://schemas.openxmlformats.org/officeDocument/2006/math" xmlns:v="urn:schemas-microsoft-com:vml" xmlns:wp14="http://schemas.microsoft.com/office/word/2010/wordprocessingDrawing" xmlns:wp="http://schemas.openxmlformats.org/drawingml/2006/wordprocessingDrawing" xmlns:w10="urn:schemas-microsoft-com:office:word" xmlns:w="http://schemas.openxmlformats.org/wordprocessingml/2006/main" xmlns:w14="http://schemas.microsoft.com/office/word/2010/wordml" xmlns:w15="http://schemas.microsoft.com/office/word/2012/wordml" xmlns:w16cei="http://schemas.microsoft.com/office/word/2026/wordml/cei" xmlns:w16cex="http://schemas.microsoft.com/office/word/2018/wordml/cex" xmlns:w16cid="http://schemas.microsoft.com/office/word/2016/wordml/cid" xmlns:w16="http://schemas.microsoft.com/office/word/2018/wordml" xmlns:w16du="http://schemas.microsoft.com/office/word/2023/wordml/word16du" xmlns:w16sdtdh="http://schemas.microsoft.com/office/word/2020/wordml/sdtdatahash" xmlns:w16sdtfl="http://schemas.microsoft.com/office/word/2024/wordml/sdtformatlock" xmlns:w16se="http://schemas.microsoft.com/office/word/2015/wordml/symex" xmlns:wpg="http://schemas.microsoft.com/office/word/2010/wordprocessingGroup" xmlns:wpi="http://schemas.microsoft.com/office/word/2010/wordprocessingInk" xmlns:wne="http://schemas.microsoft.com/office/word/2006/wordml" xmlns:wps="http://schemas.microsoft.com/office/word/2010/wordprocessingShape" mc:Ignorable="w14 w15 w16se w16cid w16 w16cex w16sdtdh w16sdtfl w16du wp14">
   <w:p>
     <w:r>
       <w:cr/>
@@ -13994,7 +14018,7 @@
 </file>
 
 <file path=word/header2.xml><?xml version="1.0" encoding="utf-8"?>
-<w:hdr xmlns:wpc="http://schemas.microsoft.com/office/word/2010/wordprocessingCanvas" xmlns:cx="http://schemas.microsoft.com/office/drawing/2014/chartex" xmlns:cx1="http://schemas.microsoft.com/office/drawing/2015/9/8/chartex" xmlns:cx2="http://schemas.microsoft.com/office/drawing/2015/10/21/chartex" xmlns:cx3="http://schemas.microsoft.com/office/drawing/2016/5/9/chartex" xmlns:cx4="http://schemas.microsoft.com/office/drawing/2016/5/10/chartex" xmlns:cx5="http://schemas.microsoft.com/office/drawing/2016/5/11/chartex" xmlns:cx6="http://schemas.microsoft.com/office/drawing/2016/5/12/chartex" xmlns:cx7="http://schemas.microsoft.com/office/drawing/2016/5/13/chartex" xmlns:cx8="http://schemas.microsoft.com/office/drawing/2016/5/14/chartex" xmlns:mc="http://schemas.openxmlformats.org/markup-compatibility/2006" xmlns:aink="http://schemas.microsoft.com/office/drawing/2016/ink" xmlns:am3d="http://schemas.microsoft.com/office/drawing/2017/model3d" xmlns:o="urn:schemas-microsoft-com:office:office" xmlns:oel="http://schemas.microsoft.com/office/2019/extlst" xmlns:r="http://schemas.openxmlformats.org/officeDocument/2006/relationships" xmlns:m="http://schemas.openxmlformats.org/officeDocument/2006/math" xmlns:v="urn:schemas-microsoft-com:vml" xmlns:wp14="http://schemas.microsoft.com/office/word/2010/wordprocessingDrawing" xmlns:wp="http://schemas.openxmlformats.org/drawingml/2006/wordprocessingDrawing" xmlns:w10="urn:schemas-microsoft-com:office:word" xmlns:w="http://schemas.openxmlformats.org/wordprocessingml/2006/main" xmlns:w14="http://schemas.microsoft.com/office/word/2010/wordml" xmlns:w15="http://schemas.microsoft.com/office/word/2012/wordml" xmlns:w16cex="http://schemas.microsoft.com/office/word/2018/wordml/cex" xmlns:w16cid="http://schemas.microsoft.com/office/word/2016/wordml/cid" xmlns:w16="http://schemas.microsoft.com/office/word/2018/wordml" xmlns:w16du="http://schemas.microsoft.com/office/word/2023/wordml/word16du" xmlns:w16sdtdh="http://schemas.microsoft.com/office/word/2020/wordml/sdtdatahash" xmlns:w16sdtfl="http://schemas.microsoft.com/office/word/2024/wordml/sdtformatlock" xmlns:w16se="http://schemas.microsoft.com/office/word/2015/wordml/symex" xmlns:wpg="http://schemas.microsoft.com/office/word/2010/wordprocessingGroup" xmlns:wpi="http://schemas.microsoft.com/office/word/2010/wordprocessingInk" xmlns:wne="http://schemas.microsoft.com/office/word/2006/wordml" xmlns:wps="http://schemas.microsoft.com/office/word/2010/wordprocessingShape" mc:Ignorable="w14 w15 w16se w16cid w16 w16cex w16sdtdh w16sdtfl w16du wp14">
+<w:hdr xmlns:wpc="http://schemas.microsoft.com/office/word/2010/wordprocessingCanvas" xmlns:cx="http://schemas.microsoft.com/office/drawing/2014/chartex" xmlns:cx1="http://schemas.microsoft.com/office/drawing/2015/9/8/chartex" xmlns:cx2="http://schemas.microsoft.com/office/drawing/2015/10/21/chartex" xmlns:cx3="http://schemas.microsoft.com/office/drawing/2016/5/9/chartex" xmlns:cx4="http://schemas.microsoft.com/office/drawing/2016/5/10/chartex" xmlns:cx5="http://schemas.microsoft.com/office/drawing/2016/5/11/chartex" xmlns:cx6="http://schemas.microsoft.com/office/drawing/2016/5/12/chartex" xmlns:cx7="http://schemas.microsoft.com/office/drawing/2016/5/13/chartex" xmlns:cx8="http://schemas.microsoft.com/office/drawing/2016/5/14/chartex" xmlns:mc="http://schemas.openxmlformats.org/markup-compatibility/2006" xmlns:aink="http://schemas.microsoft.com/office/drawing/2016/ink" xmlns:am3d="http://schemas.microsoft.com/office/drawing/2017/model3d" xmlns:o="urn:schemas-microsoft-com:office:office" xmlns:oel="http://schemas.microsoft.com/office/2019/extlst" xmlns:r="http://schemas.openxmlformats.org/officeDocument/2006/relationships" xmlns:m="http://schemas.openxmlformats.org/officeDocument/2006/math" xmlns:v="urn:schemas-microsoft-com:vml" xmlns:wp14="http://schemas.microsoft.com/office/word/2010/wordprocessingDrawing" xmlns:wp="http://schemas.openxmlformats.org/drawingml/2006/wordprocessingDrawing" xmlns:w10="urn:schemas-microsoft-com:office:word" xmlns:w="http://schemas.openxmlformats.org/wordprocessingml/2006/main" xmlns:w14="http://schemas.microsoft.com/office/word/2010/wordml" xmlns:w15="http://schemas.microsoft.com/office/word/2012/wordml" xmlns:w16cei="http://schemas.microsoft.com/office/word/2026/wordml/cei" xmlns:w16cex="http://schemas.microsoft.com/office/word/2018/wordml/cex" xmlns:w16cid="http://schemas.microsoft.com/office/word/2016/wordml/cid" xmlns:w16="http://schemas.microsoft.com/office/word/2018/wordml" xmlns:w16du="http://schemas.microsoft.com/office/word/2023/wordml/word16du" xmlns:w16sdtdh="http://schemas.microsoft.com/office/word/2020/wordml/sdtdatahash" xmlns:w16sdtfl="http://schemas.microsoft.com/office/word/2024/wordml/sdtformatlock" xmlns:w16se="http://schemas.microsoft.com/office/word/2015/wordml/symex" xmlns:wpg="http://schemas.microsoft.com/office/word/2010/wordprocessingGroup" xmlns:wpi="http://schemas.microsoft.com/office/word/2010/wordprocessingInk" xmlns:wne="http://schemas.microsoft.com/office/word/2006/wordml" xmlns:wps="http://schemas.microsoft.com/office/word/2010/wordprocessingShape" mc:Ignorable="w14 w15 w16se w16cid w16 w16cex w16sdtdh w16sdtfl w16du wp14">
   <w:p>
     <w:pPr>
       <w:pBdr>
@@ -14144,7 +14168,7 @@
 </file>
 
 <file path=word/numbering.xml><?xml version="1.0" encoding="utf-8"?>
-<w:numbering xmlns:wpc="http://schemas.microsoft.com/office/word/2010/wordprocessingCanvas" xmlns:cx="http://schemas.microsoft.com/office/drawing/2014/chartex" xmlns:cx1="http://schemas.microsoft.com/office/drawing/2015/9/8/chartex" xmlns:cx2="http://schemas.microsoft.com/office/drawing/2015/10/21/chartex" xmlns:cx3="http://schemas.microsoft.com/office/drawing/2016/5/9/chartex" xmlns:cx4="http://schemas.microsoft.com/office/drawing/2016/5/10/chartex" xmlns:cx5="http://schemas.microsoft.com/office/drawing/2016/5/11/chartex" xmlns:cx6="http://schemas.microsoft.com/office/drawing/2016/5/12/chartex" xmlns:cx7="http://schemas.microsoft.com/office/drawing/2016/5/13/chartex" xmlns:cx8="http://schemas.microsoft.com/office/drawing/2016/5/14/chartex" xmlns:mc="http://schemas.openxmlformats.org/markup-compatibility/2006" xmlns:aink="http://schemas.microsoft.com/office/drawing/2016/ink" xmlns:am3d="http://schemas.microsoft.com/office/drawing/2017/model3d" xmlns:o="urn:schemas-microsoft-com:office:office" xmlns:oel="http://schemas.microsoft.com/office/2019/extlst" xmlns:r="http://schemas.openxmlformats.org/officeDocument/2006/relationships" xmlns:m="http://schemas.openxmlformats.org/officeDocument/2006/math" xmlns:v="urn:schemas-microsoft-com:vml" xmlns:wp14="http://schemas.microsoft.com/office/word/2010/wordprocessingDrawing" xmlns:wp="http://schemas.openxmlformats.org/drawingml/2006/wordprocessingDrawing" xmlns:w10="urn:schemas-microsoft-com:office:word" xmlns:w="http://schemas.openxmlformats.org/wordprocessingml/2006/main" xmlns:w14="http://schemas.microsoft.com/office/word/2010/wordml" xmlns:w15="http://schemas.microsoft.com/office/word/2012/wordml" xmlns:w16cex="http://schemas.microsoft.com/office/word/2018/wordml/cex" xmlns:w16cid="http://schemas.microsoft.com/office/word/2016/wordml/cid" xmlns:w16="http://schemas.microsoft.com/office/word/2018/wordml" xmlns:w16du="http://schemas.microsoft.com/office/word/2023/wordml/word16du" xmlns:w16sdtdh="http://schemas.microsoft.com/office/word/2020/wordml/sdtdatahash" xmlns:w16sdtfl="http://schemas.microsoft.com/office/word/2024/wordml/sdtformatlock" xmlns:w16se="http://schemas.microsoft.com/office/word/2015/wordml/symex" xmlns:wpg="http://schemas.microsoft.com/office/word/2010/wordprocessingGroup" xmlns:wpi="http://schemas.microsoft.com/office/word/2010/wordprocessingInk" xmlns:wne="http://schemas.microsoft.com/office/word/2006/wordml" xmlns:wps="http://schemas.microsoft.com/office/word/2010/wordprocessingShape" mc:Ignorable="w14 w15 w16se w16cid w16 w16cex w16sdtdh w16sdtfl w16du wp14">
+<w:numbering xmlns:wpc="http://schemas.microsoft.com/office/word/2010/wordprocessingCanvas" xmlns:cx="http://schemas.microsoft.com/office/drawing/2014/chartex" xmlns:cx1="http://schemas.microsoft.com/office/drawing/2015/9/8/chartex" xmlns:cx2="http://schemas.microsoft.com/office/drawing/2015/10/21/chartex" xmlns:cx3="http://schemas.microsoft.com/office/drawing/2016/5/9/chartex" xmlns:cx4="http://schemas.microsoft.com/office/drawing/2016/5/10/chartex" xmlns:cx5="http://schemas.microsoft.com/office/drawing/2016/5/11/chartex" xmlns:cx6="http://schemas.microsoft.com/office/drawing/2016/5/12/chartex" xmlns:cx7="http://schemas.microsoft.com/office/drawing/2016/5/13/chartex" xmlns:cx8="http://schemas.microsoft.com/office/drawing/2016/5/14/chartex" xmlns:mc="http://schemas.openxmlformats.org/markup-compatibility/2006" xmlns:aink="http://schemas.microsoft.com/office/drawing/2016/ink" xmlns:am3d="http://schemas.microsoft.com/office/drawing/2017/model3d" xmlns:o="urn:schemas-microsoft-com:office:office" xmlns:oel="http://schemas.microsoft.com/office/2019/extlst" xmlns:r="http://schemas.openxmlformats.org/officeDocument/2006/relationships" xmlns:m="http://schemas.openxmlformats.org/officeDocument/2006/math" xmlns:v="urn:schemas-microsoft-com:vml" xmlns:wp14="http://schemas.microsoft.com/office/word/2010/wordprocessingDrawing" xmlns:wp="http://schemas.openxmlformats.org/drawingml/2006/wordprocessingDrawing" xmlns:w10="urn:schemas-microsoft-com:office:word" xmlns:w="http://schemas.openxmlformats.org/wordprocessingml/2006/main" xmlns:w14="http://schemas.microsoft.com/office/word/2010/wordml" xmlns:w15="http://schemas.microsoft.com/office/word/2012/wordml" xmlns:w16cei="http://schemas.microsoft.com/office/word/2026/wordml/cei" xmlns:w16cex="http://schemas.microsoft.com/office/word/2018/wordml/cex" xmlns:w16cid="http://schemas.microsoft.com/office/word/2016/wordml/cid" xmlns:w16="http://schemas.microsoft.com/office/word/2018/wordml" xmlns:w16du="http://schemas.microsoft.com/office/word/2023/wordml/word16du" xmlns:w16sdtdh="http://schemas.microsoft.com/office/word/2020/wordml/sdtdatahash" xmlns:w16sdtfl="http://schemas.microsoft.com/office/word/2024/wordml/sdtformatlock" xmlns:w16se="http://schemas.microsoft.com/office/word/2015/wordml/symex" xmlns:wpg="http://schemas.microsoft.com/office/word/2010/wordprocessingGroup" xmlns:wpi="http://schemas.microsoft.com/office/word/2010/wordprocessingInk" xmlns:wne="http://schemas.microsoft.com/office/word/2006/wordml" xmlns:wps="http://schemas.microsoft.com/office/word/2010/wordprocessingShape" mc:Ignorable="w14 w15 w16se w16cid w16 w16cex w16sdtdh w16sdtfl w16du wp14">
   <w:abstractNum w:abstractNumId="0" w15:restartNumberingAfterBreak="0">
     <w:nsid w:val="0938575D"/>
     <w:multiLevelType w:val="hybridMultilevel"/>

</xml_diff>

<commit_message>
Rewrite documents with formal Indonesian keep technical terms untranslated and add proper cover with developer names
</commit_message>
<xml_diff>
--- a/ReqATK_Maintenance_Handoff_Document.docx
+++ b/ReqATK_Maintenance_Handoff_Document.docx
@@ -8,7 +8,7 @@
           <w:noProof/>
         </w:rPr>
         <w:drawing>
-          <wp:inline distT="0" distB="0" distL="0" distR="0" wp14:anchorId="7AD1CDE0" wp14:editId="5DD40D6C">
+          <wp:inline distT="0" distB="0" distL="0" distR="0" wp14:anchorId="5F6E07D2" wp14:editId="1B2EDB7B">
             <wp:extent cx="512399" cy="503999"/>
             <wp:effectExtent l="0" t="0" r="0" b="0"/>
             <wp:docPr id="1" name="Picture 1"/>
@@ -51,7 +51,7 @@
           <w:noProof/>
         </w:rPr>
         <w:drawing>
-          <wp:inline distT="0" distB="0" distL="0" distR="0" wp14:anchorId="2B13DC9A" wp14:editId="3402B6CB">
+          <wp:inline distT="0" distB="0" distL="0" distR="0" wp14:anchorId="6FA6CF81" wp14:editId="6D736F30">
             <wp:extent cx="790920" cy="468000"/>
             <wp:effectExtent l="0" t="0" r="0" b="0"/>
             <wp:docPr id="2" name="Picture 2"/>
@@ -96,7 +96,7 @@
           <w:noProof/>
         </w:rPr>
         <w:drawing>
-          <wp:inline distT="0" distB="0" distL="0" distR="0" wp14:anchorId="672B6216" wp14:editId="065EC5C1">
+          <wp:inline distT="0" distB="0" distL="0" distR="0" wp14:anchorId="007D70DD" wp14:editId="675F7B77">
             <wp:extent cx="1423013" cy="342000"/>
             <wp:effectExtent l="0" t="0" r="0" b="0"/>
             <wp:docPr id="3" name="Picture 3"/>
@@ -132,10 +132,9 @@
         </w:drawing>
       </w:r>
     </w:p>
-    <w:p/>
-    <w:p>
-      <w:pPr>
-        <w:spacing w:after="120"/>
+    <w:p>
+      <w:pPr>
+        <w:spacing w:before="680" w:after="200"/>
       </w:pPr>
       <w:r>
         <w:rPr>
@@ -151,7 +150,7 @@
         <w:rPr>
           <w:b/>
           <w:color w:val="16365C"/>
-          <w:sz w:val="58"/>
+          <w:sz w:val="60"/>
         </w:rPr>
         <w:t xml:space="preserve">SISTEM </w:t>
       </w:r>
@@ -159,27 +158,27 @@
         <w:rPr>
           <w:b/>
           <w:color w:val="2F6FB5"/>
-          <w:sz w:val="58"/>
+          <w:sz w:val="60"/>
         </w:rPr>
         <w:t>PERMINTAAN</w:t>
       </w:r>
     </w:p>
     <w:p>
       <w:pPr>
-        <w:spacing w:after="80"/>
+        <w:spacing w:after="160"/>
       </w:pPr>
       <w:r>
         <w:rPr>
           <w:b/>
           <w:color w:val="2F6FB5"/>
-          <w:sz w:val="58"/>
+          <w:sz w:val="60"/>
         </w:rPr>
         <w:t>ALAT TULIS KANTOR</w:t>
       </w:r>
     </w:p>
     <w:p>
       <w:pPr>
-        <w:spacing w:after="280"/>
+        <w:spacing w:after="200"/>
       </w:pPr>
       <w:r>
         <w:rPr>
@@ -191,9 +190,6 @@
       </w:r>
     </w:p>
     <w:p>
-      <w:pPr>
-        <w:spacing w:after="320"/>
-      </w:pPr>
       <w:r>
         <w:rPr>
           <w:color w:val="2B435C"/>
@@ -204,14 +200,120 @@
     </w:p>
     <w:p>
       <w:pPr>
-        <w:spacing w:after="120"/>
+        <w:spacing w:before="3800" w:after="200"/>
       </w:pPr>
       <w:r>
         <w:rPr>
           <w:b/>
           <w:color w:val="16365C"/>
+          <w:sz w:val="23"/>
         </w:rPr>
-        <w:t>INFORMASI DOKUMEN</w:t>
+        <w:t>DISUSUN OLEH</w:t>
+      </w:r>
+    </w:p>
+    <w:p>
+      <w:pPr>
+        <w:spacing w:after="60"/>
+      </w:pPr>
+      <w:r>
+        <w:rPr>
+          <w:sz w:val="25"/>
+        </w:rPr>
+        <w:t>Adi Septriansyah</w:t>
+      </w:r>
+    </w:p>
+    <w:p>
+      <w:pPr>
+        <w:spacing w:after="60"/>
+      </w:pPr>
+      <w:r>
+        <w:rPr>
+          <w:sz w:val="25"/>
+        </w:rPr>
+        <w:t>Anselmus Herpin Hasugian</w:t>
+      </w:r>
+    </w:p>
+    <w:p>
+      <w:pPr>
+        <w:spacing w:after="60"/>
+      </w:pPr>
+      <w:r>
+        <w:rPr>
+          <w:sz w:val="25"/>
+        </w:rPr>
+        <w:t>Febrian Valentino Nugroho</w:t>
+      </w:r>
+    </w:p>
+    <w:p>
+      <w:pPr>
+        <w:spacing w:before="440"/>
+      </w:pPr>
+      <w:r>
+        <w:rPr>
+          <w:color w:val="4A5A70"/>
+          <w:sz w:val="22"/>
+        </w:rPr>
+        <w:t>Versi 1.0  |  Juli 2026</w:t>
+      </w:r>
+    </w:p>
+    <w:p>
+      <w:pPr>
+        <w:sectPr>
+          <w:headerReference w:type="default" r:id="rId10"/>
+          <w:footerReference w:type="default" r:id="rId11"/>
+          <w:pgSz w:w="11906" w:h="16838"/>
+          <w:pgMar w:top="1250" w:right="1135" w:bottom="1470" w:left="1475" w:header="480" w:footer="600" w:gutter="0"/>
+          <w:cols w:space="720"/>
+          <w:docGrid w:linePitch="360"/>
+        </w:sectPr>
+      </w:pPr>
+    </w:p>
+    <w:p>
+      <w:pPr>
+        <w:spacing w:after="360"/>
+        <w:jc w:val="center"/>
+      </w:pPr>
+      <w:r>
+        <w:rPr>
+          <w:b/>
+          <w:color w:val="16365C"/>
+          <w:sz w:val="34"/>
+        </w:rPr>
+        <w:lastRenderedPageBreak/>
+        <w:t>TENTANG DOKUMEN INI</w:t>
+      </w:r>
+    </w:p>
+    <w:p>
+      <w:pPr>
+        <w:spacing w:after="120" w:line="372" w:lineRule="auto"/>
+        <w:ind w:firstLine="624"/>
+        <w:jc w:val="both"/>
+      </w:pPr>
+      <w:r>
+        <w:t>Dokumen ini merangkum seluruh keterangan teknis yang diperlukan untuk memelihara dan mengembangkan ReqATK setelah pengembang awal tidak lagi menangani aplikasi. Isinya mencakup arsitektur, penelusuran struktur kode, cara menyiapkan lingkungan pengembangan, prosedur deployment, dokumentasi basis data, daftar masalah yang sudah diketahui, serta prosedur pemeliharaan sehari-hari.</w:t>
+      </w:r>
+    </w:p>
+    <w:p>
+      <w:pPr>
+        <w:spacing w:after="120" w:line="372" w:lineRule="auto"/>
+        <w:ind w:firstLine="624"/>
+        <w:jc w:val="both"/>
+      </w:pPr>
+      <w:r>
+        <w:t>Untuk panduan pemakaian aplikasi dari sisi pengguna, silakan merujuk pada dokumen terpisah berjudul Buku Petunjuk Penggunaan Aplikasi.</w:t>
+      </w:r>
+    </w:p>
+    <w:p>
+      <w:pPr>
+        <w:spacing w:before="200" w:after="160"/>
+      </w:pPr>
+      <w:r>
+        <w:rPr>
+          <w:b/>
+          <w:color w:val="16365C"/>
+          <w:sz w:val="25"/>
+        </w:rPr>
+        <w:t>Informasi Dokumen</w:t>
       </w:r>
     </w:p>
     <w:tbl>
@@ -288,7 +390,7 @@
               <w:rPr>
                 <w:sz w:val="21"/>
               </w:rPr>
-              <w:t>ReqATK — Sistem Permintaan Alat Tulis Kantor</w:t>
+              <w:t>ReqATK, Sistem Permintaan Alat Tulis Kantor</w:t>
             </w:r>
           </w:p>
         </w:tc>
@@ -321,7 +423,7 @@
                 <w:color w:val="16365C"/>
                 <w:sz w:val="21"/>
               </w:rPr>
-              <w:t>Situs Resmi</w:t>
+              <w:t>Alamat Produksi</w:t>
             </w:r>
           </w:p>
         </w:tc>
@@ -482,6 +584,17 @@
               <w:rPr>
                 <w:sz w:val="21"/>
               </w:rPr>
+              <w:t>Anselmus Herpin Hasugian</w:t>
+            </w:r>
+          </w:p>
+          <w:p>
+            <w:pPr>
+              <w:spacing w:line="264" w:lineRule="auto"/>
+            </w:pPr>
+            <w:r>
+              <w:rPr>
+                <w:sz w:val="21"/>
+              </w:rPr>
               <w:t>Febrian Valentino Nugroho</w:t>
             </w:r>
           </w:p>
@@ -604,21 +717,21 @@
               <w:rPr>
                 <w:sz w:val="21"/>
               </w:rPr>
-              <w:t>1.0  ·  Juli 2026</w:t>
+              <w:t>Versi 1.0  |  Juli 2026</w:t>
             </w:r>
           </w:p>
         </w:tc>
       </w:tr>
     </w:tbl>
-    <w:p/>
-    <w:p>
-      <w:pPr>
-        <w:spacing w:after="120"/>
+    <w:p>
+      <w:pPr>
+        <w:spacing w:before="240" w:after="160"/>
       </w:pPr>
       <w:r>
         <w:rPr>
           <w:b/>
           <w:color w:val="16365C"/>
+          <w:sz w:val="25"/>
         </w:rPr>
         <w:t>Dokumen Ini Ditujukan Untuk</w:t>
       </w:r>
@@ -645,7 +758,7 @@
         <w:t>Developer atau tim baru</w:t>
       </w:r>
       <w:r>
-        <w:t xml:space="preserve"> yang mengambil alih pemeliharaan aplikasi ReqATK tanpa konteks sebelumnya.</w:t>
+        <w:t xml:space="preserve"> yang mengambil alih pemeliharaan aplikasi ReqATK tanpa mengetahui riwayat pengembangannya.</w:t>
       </w:r>
     </w:p>
     <w:p>
@@ -699,16 +812,9 @@
       </w:r>
     </w:p>
     <w:p>
-      <w:pPr>
-        <w:sectPr>
-          <w:headerReference w:type="default" r:id="rId10"/>
-          <w:footerReference w:type="default" r:id="rId11"/>
-          <w:pgSz w:w="11906" w:h="16838"/>
-          <w:pgMar w:top="1250" w:right="1135" w:bottom="1470" w:left="1475" w:header="480" w:footer="600" w:gutter="0"/>
-          <w:cols w:space="720"/>
-          <w:docGrid w:linePitch="360"/>
-        </w:sectPr>
-      </w:pPr>
+      <w:r>
+        <w:br w:type="page"/>
+      </w:r>
     </w:p>
     <w:p>
       <w:pPr>
@@ -748,7 +854,7 @@
       <w:r>
         <w:fldChar w:fldCharType="separate"/>
       </w:r>
-      <w:hyperlink w:anchor="_Toc236150816" w:history="1">
+      <w:hyperlink w:anchor="_Toc236207440" w:history="1">
         <w:r>
           <w:rPr>
             <w:rStyle w:val="Hyperlink"/>
@@ -772,7 +878,7 @@
           <w:rPr>
             <w:noProof/>
           </w:rPr>
-          <w:instrText xml:space="preserve"> PAGEREF _Toc236150816 \h </w:instrText>
+          <w:instrText xml:space="preserve"> PAGEREF _Toc236207440 \h </w:instrText>
         </w:r>
         <w:r>
           <w:rPr>
@@ -789,7 +895,7 @@
           <w:rPr>
             <w:noProof/>
           </w:rPr>
-          <w:t>3</w:t>
+          <w:t>4</w:t>
         </w:r>
         <w:r>
           <w:rPr>
@@ -813,7 +919,7 @@
           <w14:ligatures w14:val="standardContextual"/>
         </w:rPr>
       </w:pPr>
-      <w:hyperlink w:anchor="_Toc236150817" w:history="1">
+      <w:hyperlink w:anchor="_Toc236207441" w:history="1">
         <w:r>
           <w:rPr>
             <w:rStyle w:val="Hyperlink"/>
@@ -837,7 +943,7 @@
           <w:rPr>
             <w:noProof/>
           </w:rPr>
-          <w:instrText xml:space="preserve"> PAGEREF _Toc236150817 \h </w:instrText>
+          <w:instrText xml:space="preserve"> PAGEREF _Toc236207441 \h </w:instrText>
         </w:r>
         <w:r>
           <w:rPr>
@@ -854,7 +960,7 @@
           <w:rPr>
             <w:noProof/>
           </w:rPr>
-          <w:t>4</w:t>
+          <w:t>5</w:t>
         </w:r>
         <w:r>
           <w:rPr>
@@ -878,7 +984,7 @@
           <w14:ligatures w14:val="standardContextual"/>
         </w:rPr>
       </w:pPr>
-      <w:hyperlink w:anchor="_Toc236150818" w:history="1">
+      <w:hyperlink w:anchor="_Toc236207442" w:history="1">
         <w:r>
           <w:rPr>
             <w:rStyle w:val="Hyperlink"/>
@@ -902,7 +1008,7 @@
           <w:rPr>
             <w:noProof/>
           </w:rPr>
-          <w:instrText xml:space="preserve"> PAGEREF _Toc236150818 \h </w:instrText>
+          <w:instrText xml:space="preserve"> PAGEREF _Toc236207442 \h </w:instrText>
         </w:r>
         <w:r>
           <w:rPr>
@@ -919,7 +1025,7 @@
           <w:rPr>
             <w:noProof/>
           </w:rPr>
-          <w:t>5</w:t>
+          <w:t>6</w:t>
         </w:r>
         <w:r>
           <w:rPr>
@@ -943,7 +1049,7 @@
           <w14:ligatures w14:val="standardContextual"/>
         </w:rPr>
       </w:pPr>
-      <w:hyperlink w:anchor="_Toc236150819" w:history="1">
+      <w:hyperlink w:anchor="_Toc236207443" w:history="1">
         <w:r>
           <w:rPr>
             <w:rStyle w:val="Hyperlink"/>
@@ -967,7 +1073,7 @@
           <w:rPr>
             <w:noProof/>
           </w:rPr>
-          <w:instrText xml:space="preserve"> PAGEREF _Toc236150819 \h </w:instrText>
+          <w:instrText xml:space="preserve"> PAGEREF _Toc236207443 \h </w:instrText>
         </w:r>
         <w:r>
           <w:rPr>
@@ -984,7 +1090,7 @@
           <w:rPr>
             <w:noProof/>
           </w:rPr>
-          <w:t>6</w:t>
+          <w:t>7</w:t>
         </w:r>
         <w:r>
           <w:rPr>
@@ -1008,7 +1114,7 @@
           <w14:ligatures w14:val="standardContextual"/>
         </w:rPr>
       </w:pPr>
-      <w:hyperlink w:anchor="_Toc236150820" w:history="1">
+      <w:hyperlink w:anchor="_Toc236207444" w:history="1">
         <w:r>
           <w:rPr>
             <w:rStyle w:val="Hyperlink"/>
@@ -1032,7 +1138,7 @@
           <w:rPr>
             <w:noProof/>
           </w:rPr>
-          <w:instrText xml:space="preserve"> PAGEREF _Toc236150820 \h </w:instrText>
+          <w:instrText xml:space="preserve"> PAGEREF _Toc236207444 \h </w:instrText>
         </w:r>
         <w:r>
           <w:rPr>
@@ -1049,7 +1155,7 @@
           <w:rPr>
             <w:noProof/>
           </w:rPr>
-          <w:t>6</w:t>
+          <w:t>7</w:t>
         </w:r>
         <w:r>
           <w:rPr>
@@ -1073,7 +1179,7 @@
           <w14:ligatures w14:val="standardContextual"/>
         </w:rPr>
       </w:pPr>
-      <w:hyperlink w:anchor="_Toc236150821" w:history="1">
+      <w:hyperlink w:anchor="_Toc236207445" w:history="1">
         <w:r>
           <w:rPr>
             <w:rStyle w:val="Hyperlink"/>
@@ -1097,7 +1203,7 @@
           <w:rPr>
             <w:noProof/>
           </w:rPr>
-          <w:instrText xml:space="preserve"> PAGEREF _Toc236150821 \h </w:instrText>
+          <w:instrText xml:space="preserve"> PAGEREF _Toc236207445 \h </w:instrText>
         </w:r>
         <w:r>
           <w:rPr>
@@ -1114,7 +1220,7 @@
           <w:rPr>
             <w:noProof/>
           </w:rPr>
-          <w:t>7</w:t>
+          <w:t>8</w:t>
         </w:r>
         <w:r>
           <w:rPr>
@@ -1138,7 +1244,7 @@
           <w14:ligatures w14:val="standardContextual"/>
         </w:rPr>
       </w:pPr>
-      <w:hyperlink w:anchor="_Toc236150822" w:history="1">
+      <w:hyperlink w:anchor="_Toc236207446" w:history="1">
         <w:r>
           <w:rPr>
             <w:rStyle w:val="Hyperlink"/>
@@ -1162,7 +1268,7 @@
           <w:rPr>
             <w:noProof/>
           </w:rPr>
-          <w:instrText xml:space="preserve"> PAGEREF _Toc236150822 \h </w:instrText>
+          <w:instrText xml:space="preserve"> PAGEREF _Toc236207446 \h </w:instrText>
         </w:r>
         <w:r>
           <w:rPr>
@@ -1179,7 +1285,7 @@
           <w:rPr>
             <w:noProof/>
           </w:rPr>
-          <w:t>7</w:t>
+          <w:t>8</w:t>
         </w:r>
         <w:r>
           <w:rPr>
@@ -1203,7 +1309,7 @@
           <w14:ligatures w14:val="standardContextual"/>
         </w:rPr>
       </w:pPr>
-      <w:hyperlink w:anchor="_Toc236150823" w:history="1">
+      <w:hyperlink w:anchor="_Toc236207447" w:history="1">
         <w:r>
           <w:rPr>
             <w:rStyle w:val="Hyperlink"/>
@@ -1227,7 +1333,7 @@
           <w:rPr>
             <w:noProof/>
           </w:rPr>
-          <w:instrText xml:space="preserve"> PAGEREF _Toc236150823 \h </w:instrText>
+          <w:instrText xml:space="preserve"> PAGEREF _Toc236207447 \h </w:instrText>
         </w:r>
         <w:r>
           <w:rPr>
@@ -1244,7 +1350,7 @@
           <w:rPr>
             <w:noProof/>
           </w:rPr>
-          <w:t>8</w:t>
+          <w:t>9</w:t>
         </w:r>
         <w:r>
           <w:rPr>
@@ -1268,7 +1374,7 @@
           <w14:ligatures w14:val="standardContextual"/>
         </w:rPr>
       </w:pPr>
-      <w:hyperlink w:anchor="_Toc236150824" w:history="1">
+      <w:hyperlink w:anchor="_Toc236207448" w:history="1">
         <w:r>
           <w:rPr>
             <w:rStyle w:val="Hyperlink"/>
@@ -1292,7 +1398,7 @@
           <w:rPr>
             <w:noProof/>
           </w:rPr>
-          <w:instrText xml:space="preserve"> PAGEREF _Toc236150824 \h </w:instrText>
+          <w:instrText xml:space="preserve"> PAGEREF _Toc236207448 \h </w:instrText>
         </w:r>
         <w:r>
           <w:rPr>
@@ -1309,7 +1415,7 @@
           <w:rPr>
             <w:noProof/>
           </w:rPr>
-          <w:t>10</w:t>
+          <w:t>11</w:t>
         </w:r>
         <w:r>
           <w:rPr>
@@ -1333,7 +1439,7 @@
           <w14:ligatures w14:val="standardContextual"/>
         </w:rPr>
       </w:pPr>
-      <w:hyperlink w:anchor="_Toc236150825" w:history="1">
+      <w:hyperlink w:anchor="_Toc236207449" w:history="1">
         <w:r>
           <w:rPr>
             <w:rStyle w:val="Hyperlink"/>
@@ -1357,7 +1463,7 @@
           <w:rPr>
             <w:noProof/>
           </w:rPr>
-          <w:instrText xml:space="preserve"> PAGEREF _Toc236150825 \h </w:instrText>
+          <w:instrText xml:space="preserve"> PAGEREF _Toc236207449 \h </w:instrText>
         </w:r>
         <w:r>
           <w:rPr>
@@ -1374,7 +1480,7 @@
           <w:rPr>
             <w:noProof/>
           </w:rPr>
-          <w:t>10</w:t>
+          <w:t>11</w:t>
         </w:r>
         <w:r>
           <w:rPr>
@@ -1398,7 +1504,7 @@
           <w14:ligatures w14:val="standardContextual"/>
         </w:rPr>
       </w:pPr>
-      <w:hyperlink w:anchor="_Toc236150826" w:history="1">
+      <w:hyperlink w:anchor="_Toc236207450" w:history="1">
         <w:r>
           <w:rPr>
             <w:rStyle w:val="Hyperlink"/>
@@ -1422,7 +1528,7 @@
           <w:rPr>
             <w:noProof/>
           </w:rPr>
-          <w:instrText xml:space="preserve"> PAGEREF _Toc236150826 \h </w:instrText>
+          <w:instrText xml:space="preserve"> PAGEREF _Toc236207450 \h </w:instrText>
         </w:r>
         <w:r>
           <w:rPr>
@@ -1439,7 +1545,7 @@
           <w:rPr>
             <w:noProof/>
           </w:rPr>
-          <w:t>11</w:t>
+          <w:t>12</w:t>
         </w:r>
         <w:r>
           <w:rPr>
@@ -1463,7 +1569,7 @@
           <w14:ligatures w14:val="standardContextual"/>
         </w:rPr>
       </w:pPr>
-      <w:hyperlink w:anchor="_Toc236150827" w:history="1">
+      <w:hyperlink w:anchor="_Toc236207451" w:history="1">
         <w:r>
           <w:rPr>
             <w:rStyle w:val="Hyperlink"/>
@@ -1487,7 +1593,7 @@
           <w:rPr>
             <w:noProof/>
           </w:rPr>
-          <w:instrText xml:space="preserve"> PAGEREF _Toc236150827 \h </w:instrText>
+          <w:instrText xml:space="preserve"> PAGEREF _Toc236207451 \h </w:instrText>
         </w:r>
         <w:r>
           <w:rPr>
@@ -1504,7 +1610,7 @@
           <w:rPr>
             <w:noProof/>
           </w:rPr>
-          <w:t>12</w:t>
+          <w:t>13</w:t>
         </w:r>
         <w:r>
           <w:rPr>
@@ -1528,7 +1634,7 @@
           <w14:ligatures w14:val="standardContextual"/>
         </w:rPr>
       </w:pPr>
-      <w:hyperlink w:anchor="_Toc236150828" w:history="1">
+      <w:hyperlink w:anchor="_Toc236207452" w:history="1">
         <w:r>
           <w:rPr>
             <w:rStyle w:val="Hyperlink"/>
@@ -1552,7 +1658,7 @@
           <w:rPr>
             <w:noProof/>
           </w:rPr>
-          <w:instrText xml:space="preserve"> PAGEREF _Toc236150828 \h </w:instrText>
+          <w:instrText xml:space="preserve"> PAGEREF _Toc236207452 \h </w:instrText>
         </w:r>
         <w:r>
           <w:rPr>
@@ -1569,7 +1675,7 @@
           <w:rPr>
             <w:noProof/>
           </w:rPr>
-          <w:t>12</w:t>
+          <w:t>13</w:t>
         </w:r>
         <w:r>
           <w:rPr>
@@ -1593,7 +1699,7 @@
           <w14:ligatures w14:val="standardContextual"/>
         </w:rPr>
       </w:pPr>
-      <w:hyperlink w:anchor="_Toc236150829" w:history="1">
+      <w:hyperlink w:anchor="_Toc236207453" w:history="1">
         <w:r>
           <w:rPr>
             <w:rStyle w:val="Hyperlink"/>
@@ -1617,7 +1723,7 @@
           <w:rPr>
             <w:noProof/>
           </w:rPr>
-          <w:instrText xml:space="preserve"> PAGEREF _Toc236150829 \h </w:instrText>
+          <w:instrText xml:space="preserve"> PAGEREF _Toc236207453 \h </w:instrText>
         </w:r>
         <w:r>
           <w:rPr>
@@ -1634,7 +1740,7 @@
           <w:rPr>
             <w:noProof/>
           </w:rPr>
-          <w:t>12</w:t>
+          <w:t>13</w:t>
         </w:r>
         <w:r>
           <w:rPr>
@@ -1658,7 +1764,7 @@
           <w14:ligatures w14:val="standardContextual"/>
         </w:rPr>
       </w:pPr>
-      <w:hyperlink w:anchor="_Toc236150830" w:history="1">
+      <w:hyperlink w:anchor="_Toc236207454" w:history="1">
         <w:r>
           <w:rPr>
             <w:rStyle w:val="Hyperlink"/>
@@ -1682,7 +1788,7 @@
           <w:rPr>
             <w:noProof/>
           </w:rPr>
-          <w:instrText xml:space="preserve"> PAGEREF _Toc236150830 \h </w:instrText>
+          <w:instrText xml:space="preserve"> PAGEREF _Toc236207454 \h </w:instrText>
         </w:r>
         <w:r>
           <w:rPr>
@@ -1699,7 +1805,7 @@
           <w:rPr>
             <w:noProof/>
           </w:rPr>
-          <w:t>14</w:t>
+          <w:t>15</w:t>
         </w:r>
         <w:r>
           <w:rPr>
@@ -1723,7 +1829,7 @@
           <w14:ligatures w14:val="standardContextual"/>
         </w:rPr>
       </w:pPr>
-      <w:hyperlink w:anchor="_Toc236150831" w:history="1">
+      <w:hyperlink w:anchor="_Toc236207455" w:history="1">
         <w:r>
           <w:rPr>
             <w:rStyle w:val="Hyperlink"/>
@@ -1747,7 +1853,7 @@
           <w:rPr>
             <w:noProof/>
           </w:rPr>
-          <w:instrText xml:space="preserve"> PAGEREF _Toc236150831 \h </w:instrText>
+          <w:instrText xml:space="preserve"> PAGEREF _Toc236207455 \h </w:instrText>
         </w:r>
         <w:r>
           <w:rPr>
@@ -1764,7 +1870,7 @@
           <w:rPr>
             <w:noProof/>
           </w:rPr>
-          <w:t>14</w:t>
+          <w:t>15</w:t>
         </w:r>
         <w:r>
           <w:rPr>
@@ -1788,7 +1894,7 @@
           <w14:ligatures w14:val="standardContextual"/>
         </w:rPr>
       </w:pPr>
-      <w:hyperlink w:anchor="_Toc236150832" w:history="1">
+      <w:hyperlink w:anchor="_Toc236207456" w:history="1">
         <w:r>
           <w:rPr>
             <w:rStyle w:val="Hyperlink"/>
@@ -1812,7 +1918,7 @@
           <w:rPr>
             <w:noProof/>
           </w:rPr>
-          <w:instrText xml:space="preserve"> PAGEREF _Toc236150832 \h </w:instrText>
+          <w:instrText xml:space="preserve"> PAGEREF _Toc236207456 \h </w:instrText>
         </w:r>
         <w:r>
           <w:rPr>
@@ -1829,7 +1935,7 @@
           <w:rPr>
             <w:noProof/>
           </w:rPr>
-          <w:t>15</w:t>
+          <w:t>16</w:t>
         </w:r>
         <w:r>
           <w:rPr>
@@ -1853,7 +1959,7 @@
           <w14:ligatures w14:val="standardContextual"/>
         </w:rPr>
       </w:pPr>
-      <w:hyperlink w:anchor="_Toc236150833" w:history="1">
+      <w:hyperlink w:anchor="_Toc236207457" w:history="1">
         <w:r>
           <w:rPr>
             <w:rStyle w:val="Hyperlink"/>
@@ -1877,7 +1983,7 @@
           <w:rPr>
             <w:noProof/>
           </w:rPr>
-          <w:instrText xml:space="preserve"> PAGEREF _Toc236150833 \h </w:instrText>
+          <w:instrText xml:space="preserve"> PAGEREF _Toc236207457 \h </w:instrText>
         </w:r>
         <w:r>
           <w:rPr>
@@ -1894,7 +2000,7 @@
           <w:rPr>
             <w:noProof/>
           </w:rPr>
-          <w:t>16</w:t>
+          <w:t>17</w:t>
         </w:r>
         <w:r>
           <w:rPr>
@@ -1918,7 +2024,7 @@
           <w14:ligatures w14:val="standardContextual"/>
         </w:rPr>
       </w:pPr>
-      <w:hyperlink w:anchor="_Toc236150834" w:history="1">
+      <w:hyperlink w:anchor="_Toc236207458" w:history="1">
         <w:r>
           <w:rPr>
             <w:rStyle w:val="Hyperlink"/>
@@ -1942,7 +2048,7 @@
           <w:rPr>
             <w:noProof/>
           </w:rPr>
-          <w:instrText xml:space="preserve"> PAGEREF _Toc236150834 \h </w:instrText>
+          <w:instrText xml:space="preserve"> PAGEREF _Toc236207458 \h </w:instrText>
         </w:r>
         <w:r>
           <w:rPr>
@@ -1959,7 +2065,7 @@
           <w:rPr>
             <w:noProof/>
           </w:rPr>
-          <w:t>16</w:t>
+          <w:t>17</w:t>
         </w:r>
         <w:r>
           <w:rPr>
@@ -1983,7 +2089,7 @@
           <w14:ligatures w14:val="standardContextual"/>
         </w:rPr>
       </w:pPr>
-      <w:hyperlink w:anchor="_Toc236150835" w:history="1">
+      <w:hyperlink w:anchor="_Toc236207459" w:history="1">
         <w:r>
           <w:rPr>
             <w:rStyle w:val="Hyperlink"/>
@@ -2007,7 +2113,7 @@
           <w:rPr>
             <w:noProof/>
           </w:rPr>
-          <w:instrText xml:space="preserve"> PAGEREF _Toc236150835 \h </w:instrText>
+          <w:instrText xml:space="preserve"> PAGEREF _Toc236207459 \h </w:instrText>
         </w:r>
         <w:r>
           <w:rPr>
@@ -2024,7 +2130,7 @@
           <w:rPr>
             <w:noProof/>
           </w:rPr>
-          <w:t>17</w:t>
+          <w:t>18</w:t>
         </w:r>
         <w:r>
           <w:rPr>
@@ -2048,7 +2154,7 @@
           <w14:ligatures w14:val="standardContextual"/>
         </w:rPr>
       </w:pPr>
-      <w:hyperlink w:anchor="_Toc236150836" w:history="1">
+      <w:hyperlink w:anchor="_Toc236207460" w:history="1">
         <w:r>
           <w:rPr>
             <w:rStyle w:val="Hyperlink"/>
@@ -2072,7 +2178,7 @@
           <w:rPr>
             <w:noProof/>
           </w:rPr>
-          <w:instrText xml:space="preserve"> PAGEREF _Toc236150836 \h </w:instrText>
+          <w:instrText xml:space="preserve"> PAGEREF _Toc236207460 \h </w:instrText>
         </w:r>
         <w:r>
           <w:rPr>
@@ -2089,7 +2195,7 @@
           <w:rPr>
             <w:noProof/>
           </w:rPr>
-          <w:t>19</w:t>
+          <w:t>20</w:t>
         </w:r>
         <w:r>
           <w:rPr>
@@ -2113,7 +2219,7 @@
           <w14:ligatures w14:val="standardContextual"/>
         </w:rPr>
       </w:pPr>
-      <w:hyperlink w:anchor="_Toc236150837" w:history="1">
+      <w:hyperlink w:anchor="_Toc236207461" w:history="1">
         <w:r>
           <w:rPr>
             <w:rStyle w:val="Hyperlink"/>
@@ -2137,7 +2243,7 @@
           <w:rPr>
             <w:noProof/>
           </w:rPr>
-          <w:instrText xml:space="preserve"> PAGEREF _Toc236150837 \h </w:instrText>
+          <w:instrText xml:space="preserve"> PAGEREF _Toc236207461 \h </w:instrText>
         </w:r>
         <w:r>
           <w:rPr>
@@ -2154,7 +2260,7 @@
           <w:rPr>
             <w:noProof/>
           </w:rPr>
-          <w:t>20</w:t>
+          <w:t>21</w:t>
         </w:r>
         <w:r>
           <w:rPr>
@@ -2178,7 +2284,7 @@
           <w14:ligatures w14:val="standardContextual"/>
         </w:rPr>
       </w:pPr>
-      <w:hyperlink w:anchor="_Toc236150838" w:history="1">
+      <w:hyperlink w:anchor="_Toc236207462" w:history="1">
         <w:r>
           <w:rPr>
             <w:rStyle w:val="Hyperlink"/>
@@ -2202,7 +2308,7 @@
           <w:rPr>
             <w:noProof/>
           </w:rPr>
-          <w:instrText xml:space="preserve"> PAGEREF _Toc236150838 \h </w:instrText>
+          <w:instrText xml:space="preserve"> PAGEREF _Toc236207462 \h </w:instrText>
         </w:r>
         <w:r>
           <w:rPr>
@@ -2219,7 +2325,7 @@
           <w:rPr>
             <w:noProof/>
           </w:rPr>
-          <w:t>21</w:t>
+          <w:t>22</w:t>
         </w:r>
         <w:r>
           <w:rPr>
@@ -2243,7 +2349,7 @@
           <w14:ligatures w14:val="standardContextual"/>
         </w:rPr>
       </w:pPr>
-      <w:hyperlink w:anchor="_Toc236150839" w:history="1">
+      <w:hyperlink w:anchor="_Toc236207463" w:history="1">
         <w:r>
           <w:rPr>
             <w:rStyle w:val="Hyperlink"/>
@@ -2267,7 +2373,7 @@
           <w:rPr>
             <w:noProof/>
           </w:rPr>
-          <w:instrText xml:space="preserve"> PAGEREF _Toc236150839 \h </w:instrText>
+          <w:instrText xml:space="preserve"> PAGEREF _Toc236207463 \h </w:instrText>
         </w:r>
         <w:r>
           <w:rPr>
@@ -2284,7 +2390,7 @@
           <w:rPr>
             <w:noProof/>
           </w:rPr>
-          <w:t>21</w:t>
+          <w:t>22</w:t>
         </w:r>
         <w:r>
           <w:rPr>
@@ -2308,7 +2414,7 @@
           <w14:ligatures w14:val="standardContextual"/>
         </w:rPr>
       </w:pPr>
-      <w:hyperlink w:anchor="_Toc236150840" w:history="1">
+      <w:hyperlink w:anchor="_Toc236207464" w:history="1">
         <w:r>
           <w:rPr>
             <w:rStyle w:val="Hyperlink"/>
@@ -2332,7 +2438,7 @@
           <w:rPr>
             <w:noProof/>
           </w:rPr>
-          <w:instrText xml:space="preserve"> PAGEREF _Toc236150840 \h </w:instrText>
+          <w:instrText xml:space="preserve"> PAGEREF _Toc236207464 \h </w:instrText>
         </w:r>
         <w:r>
           <w:rPr>
@@ -2349,7 +2455,7 @@
           <w:rPr>
             <w:noProof/>
           </w:rPr>
-          <w:t>21</w:t>
+          <w:t>22</w:t>
         </w:r>
         <w:r>
           <w:rPr>
@@ -2373,7 +2479,7 @@
           <w14:ligatures w14:val="standardContextual"/>
         </w:rPr>
       </w:pPr>
-      <w:hyperlink w:anchor="_Toc236150841" w:history="1">
+      <w:hyperlink w:anchor="_Toc236207465" w:history="1">
         <w:r>
           <w:rPr>
             <w:rStyle w:val="Hyperlink"/>
@@ -2397,7 +2503,7 @@
           <w:rPr>
             <w:noProof/>
           </w:rPr>
-          <w:instrText xml:space="preserve"> PAGEREF _Toc236150841 \h </w:instrText>
+          <w:instrText xml:space="preserve"> PAGEREF _Toc236207465 \h </w:instrText>
         </w:r>
         <w:r>
           <w:rPr>
@@ -2414,7 +2520,7 @@
           <w:rPr>
             <w:noProof/>
           </w:rPr>
-          <w:t>23</w:t>
+          <w:t>24</w:t>
         </w:r>
         <w:r>
           <w:rPr>
@@ -2438,7 +2544,7 @@
           <w14:ligatures w14:val="standardContextual"/>
         </w:rPr>
       </w:pPr>
-      <w:hyperlink w:anchor="_Toc236150842" w:history="1">
+      <w:hyperlink w:anchor="_Toc236207466" w:history="1">
         <w:r>
           <w:rPr>
             <w:rStyle w:val="Hyperlink"/>
@@ -2462,7 +2568,7 @@
           <w:rPr>
             <w:noProof/>
           </w:rPr>
-          <w:instrText xml:space="preserve"> PAGEREF _Toc236150842 \h </w:instrText>
+          <w:instrText xml:space="preserve"> PAGEREF _Toc236207466 \h </w:instrText>
         </w:r>
         <w:r>
           <w:rPr>
@@ -2479,7 +2585,7 @@
           <w:rPr>
             <w:noProof/>
           </w:rPr>
-          <w:t>23</w:t>
+          <w:t>24</w:t>
         </w:r>
         <w:r>
           <w:rPr>
@@ -2503,7 +2609,7 @@
           <w14:ligatures w14:val="standardContextual"/>
         </w:rPr>
       </w:pPr>
-      <w:hyperlink w:anchor="_Toc236150843" w:history="1">
+      <w:hyperlink w:anchor="_Toc236207467" w:history="1">
         <w:r>
           <w:rPr>
             <w:rStyle w:val="Hyperlink"/>
@@ -2527,7 +2633,7 @@
           <w:rPr>
             <w:noProof/>
           </w:rPr>
-          <w:instrText xml:space="preserve"> PAGEREF _Toc236150843 \h </w:instrText>
+          <w:instrText xml:space="preserve"> PAGEREF _Toc236207467 \h </w:instrText>
         </w:r>
         <w:r>
           <w:rPr>
@@ -2544,7 +2650,7 @@
           <w:rPr>
             <w:noProof/>
           </w:rPr>
-          <w:t>23</w:t>
+          <w:t>24</w:t>
         </w:r>
         <w:r>
           <w:rPr>
@@ -2568,7 +2674,7 @@
       <w:pPr>
         <w:pStyle w:val="Heading1"/>
       </w:pPr>
-      <w:bookmarkStart w:id="0" w:name="_Toc236150816"/>
+      <w:bookmarkStart w:id="0" w:name="_Toc236207440"/>
       <w:r>
         <w:lastRenderedPageBreak/>
         <w:t>Bab I   Gambaran Umum Sistem dan Arsitektur</w:t>
@@ -2644,7 +2750,7 @@
                 <w:color w:val="1D4677"/>
                 <w:sz w:val="19"/>
               </w:rPr>
-              <w:t>Peramban    : React Server Components + Client Components (src/app, src/components)</w:t>
+              <w:t>Browser    : React Server Components + Client Components (src/app, src/components)</w:t>
             </w:r>
           </w:p>
           <w:p>
@@ -2657,7 +2763,7 @@
                 <w:color w:val="1D4677"/>
                 <w:sz w:val="19"/>
               </w:rPr>
-              <w:t>Middleware  : src/middleware.ts — penjaga rute per peran, berjalan di Edge</w:t>
+              <w:t>Middleware  : src/middleware.ts, penjaga rute per peran, berjalan di Edge</w:t>
             </w:r>
           </w:p>
           <w:p>
@@ -2670,7 +2776,7 @@
                 <w:color w:val="1D4677"/>
                 <w:sz w:val="19"/>
               </w:rPr>
-              <w:t>Aksi data   : src/lib/actions.ts — seluruh Server Action (login, CRUD, persetujuan)</w:t>
+              <w:t>Aksi data   : src/lib/actions.ts, seluruh Server Action (login, CRUD, persetujuan)</w:t>
             </w:r>
           </w:p>
           <w:p>
@@ -2725,7 +2831,7 @@
           <w:color w:val="4A5A70"/>
           <w:sz w:val="19"/>
         </w:rPr>
-        <w:t>Lapisan aplikasi dari peramban sampai basis data.</w:t>
+        <w:t>Lapisan aplikasi dari browser sampai basis data.</w:t>
       </w:r>
     </w:p>
     <w:p>
@@ -3442,7 +3548,7 @@
               <w:rPr>
                 <w:sz w:val="21"/>
               </w:rPr>
-              <w:t>—</w:t>
+              <w:t>layanan</w:t>
             </w:r>
           </w:p>
         </w:tc>
@@ -4151,7 +4257,7 @@
               <w:rPr>
                 <w:sz w:val="21"/>
               </w:rPr>
-              <w:t>—</w:t>
+              <w:t>Google Fonts</w:t>
             </w:r>
           </w:p>
         </w:tc>
@@ -4194,7 +4300,7 @@
       <w:pPr>
         <w:pStyle w:val="Heading2"/>
       </w:pPr>
-      <w:bookmarkStart w:id="1" w:name="_Toc236150817"/>
+      <w:bookmarkStart w:id="1" w:name="_Toc236207441"/>
       <w:r>
         <w:t>Keputusan Desain Utama</w:t>
       </w:r>
@@ -4207,7 +4313,7 @@
         <w:jc w:val="both"/>
       </w:pPr>
       <w:r>
-        <w:t>Beberapa keputusan desain melatarbelakangi bentuk kode saat ini. Pertama, autentikasi ditulis sendiri tanpa NextAuth. Kata sandi disimpan sebagai hash bcrypt dengan sepuluh putaran, sedangkan sesi berupa JWT HS256 yang ditandatangani AUTH_SECRET, berlaku delapan jam, dan disimpan pada kuki httpOnly bernama pinjamatk_session. Modul src/lib/session.ts sengaja dijaga bebas dependensi Node agar dapat dipakai baik oleh Edge Middleware maupun oleh Server Action.</w:t>
+        <w:t>Beberapa keputusan desain melatarbelakangi bentuk kode saat ini. Pertama, autentikasi ditulis sendiri tanpa NextAuth. Kata sandi disimpan sebagai hash bcrypt dengan sepuluh putaran, sedangkan sesi berupa JWT HS256 yang ditandatangani AUTH_SECRET, berlaku delapan jam, dan disimpan pada cookie httpOnly bernama pinjamatk_session. Modul src/lib/session.ts sengaja dijaga bebas dependensi Node agar dapat dipakai baik oleh Edge Middleware maupun oleh Server Action.</w:t>
       </w:r>
     </w:p>
     <w:p>
@@ -4266,7 +4372,7 @@
                 <w:color w:val="1D4677"/>
                 <w:sz w:val="19"/>
               </w:rPr>
-              <w:t>// src/lib/actions.ts — aktivasiAkun</w:t>
+              <w:t>// src/lib/actions.ts, fungsi aktivasiAkun</w:t>
             </w:r>
           </w:p>
           <w:p>
@@ -4388,7 +4494,7 @@
       <w:pPr>
         <w:pStyle w:val="Heading2"/>
       </w:pPr>
-      <w:bookmarkStart w:id="2" w:name="_Toc236150818"/>
+      <w:bookmarkStart w:id="2" w:name="_Toc236207442"/>
       <w:r>
         <w:t>Layanan Eksternal</w:t>
       </w:r>
@@ -4793,7 +4899,7 @@
       <w:pPr>
         <w:pStyle w:val="Heading1"/>
       </w:pPr>
-      <w:bookmarkStart w:id="3" w:name="_Toc236150819"/>
+      <w:bookmarkStart w:id="3" w:name="_Toc236207443"/>
       <w:r>
         <w:lastRenderedPageBreak/>
         <w:t>Bab II   Penelusuran Struktur Kode</w:t>
@@ -5435,7 +5541,7 @@
       <w:pPr>
         <w:pStyle w:val="Heading2"/>
       </w:pPr>
-      <w:bookmarkStart w:id="4" w:name="_Toc236150820"/>
+      <w:bookmarkStart w:id="4" w:name="_Toc236207444"/>
       <w:r>
         <w:t>Rute dan Pembagian Peran</w:t>
       </w:r>
@@ -6741,7 +6847,7 @@
       <w:pPr>
         <w:pStyle w:val="Heading2"/>
       </w:pPr>
-      <w:bookmarkStart w:id="5" w:name="_Toc236150821"/>
+      <w:bookmarkStart w:id="5" w:name="_Toc236207445"/>
       <w:r>
         <w:t>Modul Server yang Perlu Dikenali</w:t>
       </w:r>
@@ -7038,7 +7144,7 @@
               <w:rPr>
                 <w:sz w:val="21"/>
               </w:rPr>
-              <w:t>Kuki sesi beserta penjaga requireSession dan requireAdmin</w:t>
+              <w:t>Cookie sesi beserta penjaga requireSession dan requireAdmin</w:t>
             </w:r>
           </w:p>
         </w:tc>
@@ -7769,7 +7875,7 @@
       <w:pPr>
         <w:pStyle w:val="Heading2"/>
       </w:pPr>
-      <w:bookmarkStart w:id="6" w:name="_Toc236150822"/>
+      <w:bookmarkStart w:id="6" w:name="_Toc236207446"/>
       <w:r>
         <w:t>Logika Bisnis yang Perlu Diperhatikan</w:t>
       </w:r>
@@ -7835,7 +7941,7 @@
                 <w:sz w:val="19"/>
               </w:rPr>
               <w:lastRenderedPageBreak/>
-              <w:t>// src/lib/actions.ts — setujuiPermintaan</w:t>
+              <w:t>// src/lib/actions.ts, fungsi setujuiPermintaan</w:t>
             </w:r>
           </w:p>
           <w:p>
@@ -8031,7 +8137,7 @@
         <w:jc w:val="both"/>
       </w:pPr>
       <w:r>
-        <w:t xml:space="preserve">–  </w:t>
+        <w:t xml:space="preserve">•  </w:t>
       </w:r>
       <w:r>
         <w:rPr>
@@ -8041,7 +8147,7 @@
         <w:t>Keranjang dipecah.</w:t>
       </w:r>
       <w:r>
-        <w:t xml:space="preserve"> ajukanPermintaan menerima cart_data berupa JSON, memeriksa stok seluruh item lebih dahulu, lalu menyisipkan satu baris permintaan untuk tiap barang. Bila satu item saja gagal pemeriksaan, tidak ada baris yang tersimpan.</w:t>
+        <w:t xml:space="preserve"> ajukanPermintaan menerima cart_data berupa JSON, memeriksa stok seluruh item lebih dahulu, lalu menambahkan satu baris permintaan untuk tiap barang. Bila satu item saja gagal pemeriksaan, tidak ada baris yang tersimpan.</w:t>
       </w:r>
     </w:p>
     <w:p>
@@ -8052,7 +8158,7 @@
         <w:jc w:val="both"/>
       </w:pPr>
       <w:r>
-        <w:t xml:space="preserve">–  </w:t>
+        <w:t xml:space="preserve">•  </w:t>
       </w:r>
       <w:r>
         <w:rPr>
@@ -8073,7 +8179,7 @@
         <w:jc w:val="both"/>
       </w:pPr>
       <w:r>
-        <w:t xml:space="preserve">–  </w:t>
+        <w:t xml:space="preserve">•  </w:t>
       </w:r>
       <w:r>
         <w:rPr>
@@ -8094,7 +8200,7 @@
         <w:jc w:val="both"/>
       </w:pPr>
       <w:r>
-        <w:t xml:space="preserve">–  </w:t>
+        <w:t xml:space="preserve">•  </w:t>
       </w:r>
       <w:r>
         <w:rPr>
@@ -8115,7 +8221,7 @@
         <w:jc w:val="both"/>
       </w:pPr>
       <w:r>
-        <w:t xml:space="preserve">–  </w:t>
+        <w:t xml:space="preserve">•  </w:t>
       </w:r>
       <w:r>
         <w:rPr>
@@ -8132,7 +8238,7 @@
       <w:pPr>
         <w:pStyle w:val="Heading2"/>
       </w:pPr>
-      <w:bookmarkStart w:id="7" w:name="_Toc236150823"/>
+      <w:bookmarkStart w:id="7" w:name="_Toc236207447"/>
       <w:r>
         <w:t>Urutan Membaca yang Disarankan</w:t>
       </w:r>
@@ -8256,7 +8362,7 @@
       <w:pPr>
         <w:pStyle w:val="Heading1"/>
       </w:pPr>
-      <w:bookmarkStart w:id="8" w:name="_Toc236150824"/>
+      <w:bookmarkStart w:id="8" w:name="_Toc236207448"/>
       <w:r>
         <w:lastRenderedPageBreak/>
         <w:t>Bab III   Panduan Persiapan Lingkungan</w:t>
@@ -8377,7 +8483,7 @@
       <w:pPr>
         <w:pStyle w:val="Heading2"/>
       </w:pPr>
-      <w:bookmarkStart w:id="9" w:name="_Toc236150825"/>
+      <w:bookmarkStart w:id="9" w:name="_Toc236207449"/>
       <w:r>
         <w:t>Variabel Environment</w:t>
       </w:r>
@@ -8674,7 +8780,7 @@
               <w:rPr>
                 <w:sz w:val="21"/>
               </w:rPr>
-              <w:t>Kunci penanda tangan JWT HS256, minimal 16 karakter dan sebaiknya 32 karakter acak. Tanpa variabel ini seluruh alur sesi melempar kesalahan.</w:t>
+              <w:t>Kunci kunci penanda tangan JWT HS256, minimal 16 karakter dan sebaiknya 32 karakter acak. Tanpa variabel ini seluruh alur sesi melempar kesalahan.</w:t>
             </w:r>
           </w:p>
         </w:tc>
@@ -8812,7 +8918,7 @@
       <w:pPr>
         <w:pStyle w:val="Heading2"/>
       </w:pPr>
-      <w:bookmarkStart w:id="10" w:name="_Toc236150826"/>
+      <w:bookmarkStart w:id="10" w:name="_Toc236207450"/>
       <w:r>
         <w:t>Perintah npm</w:t>
       </w:r>
@@ -9232,7 +9338,7 @@
       <w:pPr>
         <w:pStyle w:val="Heading1"/>
       </w:pPr>
-      <w:bookmarkStart w:id="11" w:name="_Toc236150827"/>
+      <w:bookmarkStart w:id="11" w:name="_Toc236207451"/>
       <w:r>
         <w:lastRenderedPageBreak/>
         <w:t>Bab IV   Deployment dan Infrastruktur</w:t>
@@ -9263,7 +9369,7 @@
       <w:pPr>
         <w:pStyle w:val="Heading2"/>
       </w:pPr>
-      <w:bookmarkStart w:id="12" w:name="_Toc236150828"/>
+      <w:bookmarkStart w:id="12" w:name="_Toc236207452"/>
       <w:r>
         <w:t>Konfigurasi vercel.json</w:t>
       </w:r>
@@ -9389,7 +9495,7 @@
       <w:pPr>
         <w:pStyle w:val="Heading2"/>
       </w:pPr>
-      <w:bookmarkStart w:id="13" w:name="_Toc236150829"/>
+      <w:bookmarkStart w:id="13" w:name="_Toc236207453"/>
       <w:r>
         <w:t>Variabel Produksi dan Rollback</w:t>
       </w:r>
@@ -9416,7 +9522,7 @@
         <w:jc w:val="both"/>
       </w:pPr>
       <w:r>
-        <w:t>Satu hal yang perlu diingat ketika mengganti AUTH_SECRET: seluruh sesi yang sedang berjalan akan langsung tidak berlaku dan setiap pengguna harus masuk kembali. Hal ini tidak menghapus data apa pun, tetapi sebaiknya dijadwalkan di luar jam sibuk.</w:t>
+        <w:t>Satu hal yang perlu diingat ketika mengganti AUTH_SECRET: seluruh sesi yang sedang berjalan akan langsung tidak berlaku dan setiap pengguna harus login kembali. Hal ini tidak menghapus data apa pun, tetapi sebaiknya dijadwalkan di luar jam sibuk.</w:t>
       </w:r>
     </w:p>
     <w:p>
@@ -9428,7 +9534,7 @@
       <w:pPr>
         <w:pStyle w:val="Heading1"/>
       </w:pPr>
-      <w:bookmarkStart w:id="14" w:name="_Toc236150830"/>
+      <w:bookmarkStart w:id="14" w:name="_Toc236207454"/>
       <w:r>
         <w:lastRenderedPageBreak/>
         <w:t>Bab V   Dokumentasi Basis Data</w:t>
@@ -9854,7 +9960,7 @@
       <w:pPr>
         <w:pStyle w:val="Heading2"/>
       </w:pPr>
-      <w:bookmarkStart w:id="15" w:name="_Toc236150831"/>
+      <w:bookmarkStart w:id="15" w:name="_Toc236207455"/>
       <w:r>
         <w:t>Skema sebagai Kode</w:t>
       </w:r>
@@ -10070,7 +10176,7 @@
       <w:pPr>
         <w:pStyle w:val="Heading2"/>
       </w:pPr>
-      <w:bookmarkStart w:id="16" w:name="_Toc236150832"/>
+      <w:bookmarkStart w:id="16" w:name="_Toc236207456"/>
       <w:r>
         <w:t>Karakteristik Data yang Perlu Diketahui</w:t>
       </w:r>
@@ -10084,7 +10190,7 @@
         <w:jc w:val="both"/>
       </w:pPr>
       <w:r>
-        <w:t xml:space="preserve">–  </w:t>
+        <w:t xml:space="preserve">•  </w:t>
       </w:r>
       <w:r>
         <w:t>Kolom barang.kode berisi gabungan kode jenis sepuluh digit dan nomor urut tiga digit, misalnya 1010301001001 untuk Pena Standard. Kode tersebut dibentuk oleh seed-from-excel.mjs dari hierarki pada berkas Excel dan bukan penomoran bebas.</w:t>
@@ -10098,7 +10204,7 @@
         <w:jc w:val="both"/>
       </w:pPr>
       <w:r>
-        <w:t xml:space="preserve">–  </w:t>
+        <w:t xml:space="preserve">•  </w:t>
       </w:r>
       <w:r>
         <w:t>Katalog berisi 897 barang dalam empat kategori, yaitu Barang Konsumsi dengan 755 barang, Bahan Baku 99, Suku Cadang 28, dan Bahan untuk Pemeliharaan 15, yang seluruhnya terbagi lagi ke dalam 53 jenis.</w:t>
@@ -10112,7 +10218,7 @@
         <w:jc w:val="both"/>
       </w:pPr>
       <w:r>
-        <w:t xml:space="preserve">–  </w:t>
+        <w:t xml:space="preserve">•  </w:t>
       </w:r>
       <w:r>
         <w:t>Seluruh barang hasil seed masuk dengan stok nol; pengisian stok awal dilakukan lewat tombol penyesuaian stok cepat di halaman admin atau melalui impor Excel.</w:t>
@@ -10126,10 +10232,10 @@
         <w:jc w:val="both"/>
       </w:pPr>
       <w:r>
-        <w:t xml:space="preserve">–  </w:t>
-      </w:r>
-      <w:r>
-        <w:t>Kolom stok merupakan angka yang berdiri sendiri, bukan nilai turunan. Tidak ada mekanisme rekonsiliasi otomatis, sehingga penyuntingan stok langsung di basis data akan bertahan apa adanya.</w:t>
+        <w:t xml:space="preserve">•  </w:t>
+      </w:r>
+      <w:r>
+        <w:t>Kolom stok merupakan angka yang berdiri sendiri, bukan nilai turunan. Tidak ada mekanisme rekonsiliasi otomatis, sehingga penyuntingan stok langsung di basis data akan tetap tersimpan.</w:t>
       </w:r>
     </w:p>
     <w:p>
@@ -10140,7 +10246,7 @@
         <w:jc w:val="both"/>
       </w:pPr>
       <w:r>
-        <w:t xml:space="preserve">–  </w:t>
+        <w:t xml:space="preserve">•  </w:t>
       </w:r>
       <w:r>
         <w:t>Akun awal hasil seed memakai NIP 199001012015011001 untuk admin dan 199002022016012002 untuk pegawai, dengan kata sandi admin123 dan user123. Kedua kata sandi tersebut wajib diganti segera setelah pemasangan.</w:t>
@@ -10154,7 +10260,7 @@
         <w:jc w:val="both"/>
       </w:pPr>
       <w:r>
-        <w:t xml:space="preserve">–  </w:t>
+        <w:t xml:space="preserve">•  </w:t>
       </w:r>
       <w:r>
         <w:t>Gambar tidak disimpan di basis data sama sekali; aplikasi ini memang tidak menyimpan foto barang maupun avatar pengguna.</w:t>
@@ -10169,7 +10275,7 @@
       <w:pPr>
         <w:pStyle w:val="Heading1"/>
       </w:pPr>
-      <w:bookmarkStart w:id="17" w:name="_Toc236150833"/>
+      <w:bookmarkStart w:id="17" w:name="_Toc236207457"/>
       <w:r>
         <w:lastRenderedPageBreak/>
         <w:t>Bab VI   Masalah yang Diketahui dan Utang Teknis</w:t>
@@ -10190,7 +10296,7 @@
       <w:pPr>
         <w:pStyle w:val="Heading2"/>
       </w:pPr>
-      <w:bookmarkStart w:id="18" w:name="_Toc236150834"/>
+      <w:bookmarkStart w:id="18" w:name="_Toc236207458"/>
       <w:r>
         <w:t>Telah Diselesaikan pada Serah Terima Ini</w:t>
       </w:r>
@@ -10204,20 +10310,20 @@
         <w:jc w:val="both"/>
       </w:pPr>
       <w:r>
-        <w:t xml:space="preserve">–  </w:t>
+        <w:t xml:space="preserve">•  </w:t>
       </w:r>
       <w:r>
         <w:rPr>
           <w:b/>
           <w:color w:val="16365C"/>
         </w:rPr>
-        <w:t>Penyisipan SQL pada penyaring catatan aktivitas ditutup.</w:t>
-      </w:r>
-      <w:r>
-        <w:t xml:space="preserve"> Fungsi getActivityLogs di src/lib/audit.ts sebelumnya menyusun klausa WHERE dengan menyambung string, termasuk nilai ?action= dari URL, lalu menjalankannya lewat sql.unsafe. Seluruh saringan kini dikirim sebagai parameter tagged template memakai pola (${nilai}::tipe IS NULL OR kolom = ${nilai}), sehingga nilai dari URL tidak pernah lagi menyentuh teks query. Sebagai lapis kedua, parameter ?action= disaring lebih dahulu oleh parseActionType dan hanya diteruskan bila cocok dengan salah satu aksi yang dikenal</w:t>
-      </w:r>
-      <w:r>
-        <w:t>. Pemanggilan sql.unsafe sudah tidak ada lagi di seluruh basis kode.</w:t>
+        <w:t>SQL injection pada penyaring catatan aktivitas ditutup.</w:t>
+      </w:r>
+      <w:r>
+        <w:t xml:space="preserve"> Fungsi getActivityLogs di src/lib/audit.ts sebelumnya menyusun klausa WHERE dengan menyambung string, termasuk nilai ?action= dari URL, lalu menjalankannya lewat sql.unsafe. Seluruh saringan kini dikirim sebagai parameter tagged template memakai pola (${nilai}::tipe IS NULL OR kolom = ${nilai}), sehingga nilai dari URL tidak lagi menjadi bagian dari teks query. Sebagai lapis kedua, parameter ?action= disaring lebih dahulu oleh parseActionType dan hanya diteruskan bila cocok dengan salah satu aksi yang dike</w:t>
+      </w:r>
+      <w:r>
+        <w:t>nal. Pemanggilan sql.unsafe sudah tidak ada lagi di seluruh basis kode.</w:t>
       </w:r>
     </w:p>
     <w:p>
@@ -10228,7 +10334,7 @@
         <w:jc w:val="both"/>
       </w:pPr>
       <w:r>
-        <w:t xml:space="preserve">–  </w:t>
+        <w:t xml:space="preserve">•  </w:t>
       </w:r>
       <w:r>
         <w:rPr>
@@ -10249,7 +10355,7 @@
         <w:jc w:val="both"/>
       </w:pPr>
       <w:r>
-        <w:t xml:space="preserve">–  </w:t>
+        <w:t xml:space="preserve">•  </w:t>
       </w:r>
       <w:r>
         <w:rPr>
@@ -10259,10 +10365,10 @@
         <w:t>Kebocoran otorisasi pada aksi pemberitahuan ditutup.</w:t>
       </w:r>
       <w:r>
-        <w:t xml:space="preserve"> Ketiga Server Action pemberitahuan di src/lib/actions.ts, yaitu getNotifications, markNotificationAsRead, dan markAllNotificationsAsRead, sama sekali tidak memeriksa sesi dan menerima id pengguna sebagai argumen. Karena setiap Server Action sesungguhnya adalah endpoint POST yang dapat dipanggil siapa pun, siapa saja bisa membaca seluruh pemberitahuan milik pegawai lain atau menandainya sudah dibaca hanya dengan menebak angka id. Sekarang ketiganya memanggil requireSession dan pemilik pemberitahuan selalu d</w:t>
-      </w:r>
-      <w:r>
-        <w:t>iambil dari sesi, bukan dari argumen; perintah UPDATE pada satu pemberitahuan juga dibatasi dengan syarat user_id sehingga baris milik orang lain tidak mungkin tersentuh. Sebagai aturan umum, jangan pernah mempercayai id pengguna yang datang sebagai parameter Server Action.</w:t>
+        <w:t xml:space="preserve"> Ketiga Server Action pemberitahuan di src/lib/actions.ts, yaitu getNotifications, markNotificationAsRead, dan markAllNotificationsAsRead, sama sekali tidak memeriksa sesi dan menerima id pengguna sebagai argumen. Karena setiap Server Action pada dasarnya merupakan endpoint POST yang dapat dipanggil siapa pun, siapa saja bisa membaca seluruh pemberitahuan milik pegawai lain atau menandainya sudah dibaca hanya dengan menebak angka id. Sekarang ketiganya memanggil requireSession dan pemilik pemberitahuan sela</w:t>
+      </w:r>
+      <w:r>
+        <w:t>lu diambil dari sesi, bukan dari argumen; perintah UPDATE pada satu pemberitahuan juga dibatasi dengan syarat user_id sehingga baris milik pengguna lain tidak dapat diubah. Sebagai aturan umum, jangan pernah mempercayai id pengguna yang datang sebagai parameter Server Action.</w:t>
       </w:r>
     </w:p>
     <w:p>
@@ -10274,7 +10380,7 @@
       </w:pPr>
       <w:r>
         <w:lastRenderedPageBreak/>
-        <w:t xml:space="preserve">–  </w:t>
+        <w:t xml:space="preserve">•  </w:t>
       </w:r>
       <w:r>
         <w:rPr>
@@ -10295,7 +10401,7 @@
         <w:jc w:val="both"/>
       </w:pPr>
       <w:r>
-        <w:t xml:space="preserve">–  </w:t>
+        <w:t xml:space="preserve">•  </w:t>
       </w:r>
       <w:r>
         <w:rPr>
@@ -10316,7 +10422,7 @@
         <w:jc w:val="both"/>
       </w:pPr>
       <w:r>
-        <w:t xml:space="preserve">–  </w:t>
+        <w:t xml:space="preserve">•  </w:t>
       </w:r>
       <w:r>
         <w:rPr>
@@ -10337,7 +10443,7 @@
         <w:jc w:val="both"/>
       </w:pPr>
       <w:r>
-        <w:t xml:space="preserve">–  </w:t>
+        <w:t xml:space="preserve">•  </w:t>
       </w:r>
       <w:r>
         <w:rPr>
@@ -10358,7 +10464,7 @@
         <w:jc w:val="both"/>
       </w:pPr>
       <w:r>
-        <w:t xml:space="preserve">–  </w:t>
+        <w:t xml:space="preserve">•  </w:t>
       </w:r>
       <w:r>
         <w:rPr>
@@ -10375,7 +10481,7 @@
       <w:pPr>
         <w:pStyle w:val="Heading2"/>
       </w:pPr>
-      <w:bookmarkStart w:id="19" w:name="_Toc236150835"/>
+      <w:bookmarkStart w:id="19" w:name="_Toc236207459"/>
       <w:r>
         <w:t>Utang Teknis yang Masih Tersisa</w:t>
       </w:r>
@@ -10389,7 +10495,7 @@
         <w:jc w:val="both"/>
       </w:pPr>
       <w:r>
-        <w:t xml:space="preserve">–  </w:t>
+        <w:t xml:space="preserve">•  </w:t>
       </w:r>
       <w:r>
         <w:rPr>
@@ -10399,7 +10505,7 @@
         <w:t>Kredensial awal masih berupa kata sandi umum.</w:t>
       </w:r>
       <w:r>
-        <w:t xml:space="preserve"> scripts/setup-db.mjs tetap menanam akun admin dan pegawai dengan kata sandi admin123 dan user123 agar pemasangan pertama tetap mudah. Peringatannya sudah dipertegas di README, tetapi penggantian kata sandi di lingkungan produksi tetap harus dikerjakan manual dan wajib diperiksa oleh pemelihara baru.</w:t>
+        <w:t xml:space="preserve"> scripts/setup-db.mjs tetap membuat akun admin dan pegawai dengan kata sandi admin123 dan user123 agar pemasangan pertama tetap mudah. Peringatannya sudah dipertegas di README, tetapi penggantian kata sandi di lingkungan produksi tetap harus dikerjakan manual dan wajib diperiksa oleh pemelihara baru.</w:t>
       </w:r>
     </w:p>
     <w:p>
@@ -10410,7 +10516,7 @@
         <w:jc w:val="both"/>
       </w:pPr>
       <w:r>
-        <w:t xml:space="preserve">–  </w:t>
+        <w:t xml:space="preserve">•  </w:t>
       </w:r>
       <w:r>
         <w:rPr>
@@ -10432,7 +10538,7 @@
       </w:pPr>
       <w:r>
         <w:lastRenderedPageBreak/>
-        <w:t xml:space="preserve">–  </w:t>
+        <w:t xml:space="preserve">•  </w:t>
       </w:r>
       <w:r>
         <w:rPr>
@@ -10453,7 +10559,7 @@
         <w:jc w:val="both"/>
       </w:pPr>
       <w:r>
-        <w:t xml:space="preserve">–  </w:t>
+        <w:t xml:space="preserve">•  </w:t>
       </w:r>
       <w:r>
         <w:rPr>
@@ -10463,7 +10569,7 @@
         <w:t>Nama internal masih memakai merek lama.</w:t>
       </w:r>
       <w:r>
-        <w:t xml:space="preserve"> Kuki sesi bernama pinjamatk_session dan kunci localStorage bernama sesdian_theme serta sesdian_font_size. Keduanya sengaja tidak diganti bersamaan dengan perubahan merek menjadi ReqATK, karena mengganti nama kuki akan memutus seluruh sesi yang sedang berjalan dan mengganti kunci localStorage akan menghapus preferensi tema serta ukuran huruf setiap pengguna. Jadwalkan penggantian ini bersamaan dengan pekerjaan lain yang memang menuntut pengguna masuk kembali.</w:t>
+        <w:t xml:space="preserve"> Cookie sesi bernama pinjamatk_session dan kunci localStorage bernama sesdian_theme serta sesdian_font_size. Keduanya sengaja tidak diganti bersamaan dengan perubahan merek menjadi ReqATK, karena mengganti nama cookie akan memutus seluruh sesi yang sedang berjalan dan mengganti kunci localStorage akan menghapus preferensi tema serta ukuran huruf setiap pengguna. Jadwalkan penggantian ini bersamaan dengan pekerjaan lain yang memang mengharuskan pengguna login kembali.</w:t>
       </w:r>
     </w:p>
     <w:p>
@@ -10474,7 +10580,7 @@
         <w:jc w:val="both"/>
       </w:pPr>
       <w:r>
-        <w:t xml:space="preserve">–  </w:t>
+        <w:t xml:space="preserve">•  </w:t>
       </w:r>
       <w:r>
         <w:rPr>
@@ -10484,7 +10590,7 @@
         <w:t>Pemberitahuan belum keluar dari aplikasi.</w:t>
       </w:r>
       <w:r>
-        <w:t xml:space="preserve"> Pemberitahuan hanya muncul pada lonceng di dalam aplikasi. Kerangka pengiriman surel yang dulu ada sudah dihapus karena tidak pernah dipanggil, sehingga bila kabar lewat surel atau WhatsApp dibutuhkan, jalurnya perlu dibangun dari awal.</w:t>
+        <w:t xml:space="preserve"> Pemberitahuan hanya muncul pada lonceng di dalam aplikasi. Kerangka pengiriman email yang dulu ada sudah dihapus karena tidak pernah dipanggil, sehingga bila kabar lewat email atau WhatsApp dibutuhkan, jalurnya perlu dibangun dari awal.</w:t>
       </w:r>
     </w:p>
     <w:p>
@@ -10495,7 +10601,7 @@
         <w:jc w:val="both"/>
       </w:pPr>
       <w:r>
-        <w:t xml:space="preserve">–  </w:t>
+        <w:t xml:space="preserve">•  </w:t>
       </w:r>
       <w:r>
         <w:rPr>
@@ -10505,7 +10611,7 @@
         <w:t>Query berulang pada pengajuan permintaan.</w:t>
       </w:r>
       <w:r>
-        <w:t xml:space="preserve"> Fungsi ajukanPermintaan membaca tabel barang dua kali untuk setiap item keranjang, yaitu sekali pada perulangan validasi dan sekali lagi pada perulangan penyisipan. Untuk keranjang berisi banyak barang, keduanya dapat digabung menjadi satu pembacaan.</w:t>
+        <w:t xml:space="preserve"> Fungsi ajukanPermintaan membaca tabel barang dua kali untuk setiap item keranjang, yaitu sekali pada perulangan validasi dan sekali lagi pada perulangan INSERT. Untuk keranjang berisi banyak barang, keduanya dapat digabung menjadi satu pembacaan.</w:t>
       </w:r>
     </w:p>
     <w:p>
@@ -10516,7 +10622,7 @@
         <w:jc w:val="both"/>
       </w:pPr>
       <w:r>
-        <w:t xml:space="preserve">–  </w:t>
+        <w:t xml:space="preserve">•  </w:t>
       </w:r>
       <w:r>
         <w:rPr>
@@ -10537,7 +10643,7 @@
         <w:jc w:val="both"/>
       </w:pPr>
       <w:r>
-        <w:t xml:space="preserve">–  </w:t>
+        <w:t xml:space="preserve">•  </w:t>
       </w:r>
       <w:r>
         <w:rPr>
@@ -10558,7 +10664,7 @@
         <w:jc w:val="both"/>
       </w:pPr>
       <w:r>
-        <w:t xml:space="preserve">–  </w:t>
+        <w:t xml:space="preserve">•  </w:t>
       </w:r>
       <w:r>
         <w:rPr>
@@ -10568,7 +10674,7 @@
         <w:t>Perubahan peran baru berlaku pada sesi berikutnya.</w:t>
       </w:r>
       <w:r>
-        <w:t xml:space="preserve"> Peran ikut tersimpan di dalam JWT, sehingga pengguna yang perannya diubah administrator harus keluar dan masuk kembali agar menu barunya muncul.</w:t>
+        <w:t xml:space="preserve"> Peran ikut tersimpan di dalam JWT, sehingga pengguna yang perannya diubah administrator harus logout lalu login kembali agar menu barunya muncul.</w:t>
       </w:r>
     </w:p>
     <w:p>
@@ -10580,7 +10686,7 @@
       <w:pPr>
         <w:pStyle w:val="Heading1"/>
       </w:pPr>
-      <w:bookmarkStart w:id="20" w:name="_Toc236150836"/>
+      <w:bookmarkStart w:id="20" w:name="_Toc236207460"/>
       <w:r>
         <w:lastRenderedPageBreak/>
         <w:t>Bab VII   Pengujian</w:t>
@@ -11137,7 +11243,7 @@
               <w:rPr>
                 <w:sz w:val="21"/>
               </w:rPr>
-              <w:t>Alur ujung ke ujung dengan Playwright</w:t>
+              <w:t>Pengujian menyeluruh dengan Playwright</w:t>
             </w:r>
           </w:p>
         </w:tc>
@@ -11195,7 +11301,7 @@
       <w:pPr>
         <w:pStyle w:val="Heading1"/>
       </w:pPr>
-      <w:bookmarkStart w:id="21" w:name="_Toc236150837"/>
+      <w:bookmarkStart w:id="21" w:name="_Toc236207461"/>
       <w:r>
         <w:lastRenderedPageBreak/>
         <w:t>Bab VIII   Dependensi Pihak Ketiga dan Lisensi</w:t>
@@ -13352,7 +13458,7 @@
               <w:rPr>
                 <w:sz w:val="21"/>
               </w:rPr>
-              <w:t>—</w:t>
+              <w:t>menyesuaikan</w:t>
             </w:r>
           </w:p>
         </w:tc>
@@ -13469,7 +13575,7 @@
       <w:pPr>
         <w:pStyle w:val="Heading1"/>
       </w:pPr>
-      <w:bookmarkStart w:id="22" w:name="_Toc236150838"/>
+      <w:bookmarkStart w:id="22" w:name="_Toc236207462"/>
       <w:r>
         <w:lastRenderedPageBreak/>
         <w:t>Bab IX   Runbook Pemeliharaan</w:t>
@@ -13490,7 +13596,7 @@
       <w:pPr>
         <w:pStyle w:val="Heading2"/>
       </w:pPr>
-      <w:bookmarkStart w:id="23" w:name="_Toc236150839"/>
+      <w:bookmarkStart w:id="23" w:name="_Toc236207463"/>
       <w:r>
         <w:t>Prosedur Rutin</w:t>
       </w:r>
@@ -13504,7 +13610,7 @@
         <w:jc w:val="both"/>
       </w:pPr>
       <w:r>
-        <w:t xml:space="preserve">–  </w:t>
+        <w:t xml:space="preserve">•  </w:t>
       </w:r>
       <w:r>
         <w:rPr>
@@ -13525,7 +13631,7 @@
         <w:jc w:val="both"/>
       </w:pPr>
       <w:r>
-        <w:t xml:space="preserve">–  </w:t>
+        <w:t xml:space="preserve">•  </w:t>
       </w:r>
       <w:r>
         <w:rPr>
@@ -13546,7 +13652,7 @@
         <w:jc w:val="both"/>
       </w:pPr>
       <w:r>
-        <w:t xml:space="preserve">–  </w:t>
+        <w:t xml:space="preserve">•  </w:t>
       </w:r>
       <w:r>
         <w:rPr>
@@ -13567,7 +13673,7 @@
         <w:jc w:val="both"/>
       </w:pPr>
       <w:r>
-        <w:t xml:space="preserve">–  </w:t>
+        <w:t xml:space="preserve">•  </w:t>
       </w:r>
       <w:r>
         <w:rPr>
@@ -13577,7 +13683,7 @@
         <w:t>Menambah administrator baru.</w:t>
       </w:r>
       <w:r>
-        <w:t xml:space="preserve"> Daftarkan NIP-nya lebih dahulu, minta pemiliknya melakukan aktivasi, baru kemudian ubah perannya menjadi Admin lewat tombol Ubah. Peran baru berlaku setelah yang bersangkutan keluar dan masuk kembali.</w:t>
+        <w:t xml:space="preserve"> Daftarkan NIP-nya lebih dahulu, minta pemiliknya melakukan aktivasi, baru kemudian ubah perannya menjadi Admin lewat tombol Ubah. Peran baru berlaku setelah yang bersangkutan logout lalu login kembali.</w:t>
       </w:r>
     </w:p>
     <w:p>
@@ -13588,7 +13694,7 @@
         <w:jc w:val="both"/>
       </w:pPr>
       <w:r>
-        <w:t xml:space="preserve">–  </w:t>
+        <w:t xml:space="preserve">•  </w:t>
       </w:r>
       <w:r>
         <w:rPr>
@@ -13609,7 +13715,7 @@
         <w:jc w:val="both"/>
       </w:pPr>
       <w:r>
-        <w:t xml:space="preserve">–  </w:t>
+        <w:t xml:space="preserve">•  </w:t>
       </w:r>
       <w:r>
         <w:rPr>
@@ -13630,7 +13736,7 @@
         <w:jc w:val="both"/>
       </w:pPr>
       <w:r>
-        <w:t xml:space="preserve">–  </w:t>
+        <w:t xml:space="preserve">•  </w:t>
       </w:r>
       <w:r>
         <w:rPr>
@@ -13647,7 +13753,7 @@
       <w:pPr>
         <w:pStyle w:val="Heading2"/>
       </w:pPr>
-      <w:bookmarkStart w:id="24" w:name="_Toc236150840"/>
+      <w:bookmarkStart w:id="24" w:name="_Toc236207464"/>
       <w:r>
         <w:t>Logging, Pemantauan, dan Pencadangan</w:t>
       </w:r>
@@ -13689,7 +13795,7 @@
       <w:pPr>
         <w:pStyle w:val="Heading1"/>
       </w:pPr>
-      <w:bookmarkStart w:id="25" w:name="_Toc236150841"/>
+      <w:bookmarkStart w:id="25" w:name="_Toc236207465"/>
       <w:r>
         <w:lastRenderedPageBreak/>
         <w:t>Bab X   Ringkasan Serah Terima dan Langkah Selanjutnya</w:t>
@@ -13703,10 +13809,10 @@
         <w:jc w:val="both"/>
       </w:pPr>
       <w:r>
-        <w:t xml:space="preserve">Yang diserahterimakan adalah aplikasi yang utuh dan sudah berjalan: 63 berkas sumber dengan sekitar 8.800 baris kode di dalam src, sebelas dependensi runtime, dan build produksi yang lulus tanpa peringatan. Cakupannya meliputi login dua tahap berbasis NIP beserta alur aktivasi mandiri, katalog 897 barang hasil impor dari daftar persediaan resmi, formulir permintaan berbentuk keranjang yang menampung banyak barang sekaligus, persetujuan dengan pengurangan stok yang atomik beserta persetujuan massal, laporan </w:t>
-      </w:r>
-      <w:r>
-        <w:t>yang dapat diekspor ke PDF, Excel, dan CSV, pemberitahuan dalam aplikasi, jejak audit, serta antarmuka bertema terang dan gelap yang mengikuti design system pada docs/style.md.</w:t>
+        <w:t>Aplikasi yang diserahterimakan berupa aplikasi yang utuh dan sudah berjalan: 63 berkas sumber dengan sekitar 8.800 baris kode di dalam src, sebelas dependensi runtime, dan build produksi yang lulus tanpa peringatan. Cakupannya meliputi login dua tahap berbasis NIP beserta alur aktivasi mandiri, katalog 897 barang hasil impor dari daftar persediaan resmi, formulir permintaan berbentuk keranjang yang menampung banyak barang sekaligus, persetujuan dengan pengurangan stok yang atomik beserta persetujuan massal,</w:t>
+      </w:r>
+      <w:r>
+        <w:t xml:space="preserve"> laporan yang dapat diekspor ke PDF, Excel, dan CSV, pemberitahuan dalam aplikasi, jejak audit, serta antarmuka bertema terang dan gelap yang mengikuti design system pada docs/style.md.</w:t>
       </w:r>
     </w:p>
     <w:p>
@@ -13723,7 +13829,7 @@
       <w:pPr>
         <w:pStyle w:val="Heading2"/>
       </w:pPr>
-      <w:bookmarkStart w:id="26" w:name="_Toc236150842"/>
+      <w:bookmarkStart w:id="26" w:name="_Toc236207466"/>
       <w:r>
         <w:t>Tiga Langkah Pertama bagi Pemelihara Baru</w:t>
       </w:r>
@@ -13762,7 +13868,7 @@
         <w:t xml:space="preserve">2.  </w:t>
       </w:r>
       <w:r>
-        <w:t>Minta akses akun Vercel dan Neon kepada Adi Septriansyah selaku pemegang akun saat ini melalui alamat surel yang tercantum pada halaman sampul, kemudian pastikan variabel DATABASE_URL dan AUTH_SECRET tercatat di tempat penyimpanan rahasia milik instansi, bukan hanya di dashboard Vercel.</w:t>
+        <w:t>Minta akses akun Vercel dan Neon kepada Adi Septriansyah selaku pemegang akun saat ini melalui alamat email yang tercantum pada halaman sampul, kemudian pastikan variabel DATABASE_URL dan AUTH_SECRET tercatat di tempat penyimpanan rahasia milik instansi, bukan hanya di dashboard Vercel.</w:t>
       </w:r>
     </w:p>
     <w:p>
@@ -13787,7 +13893,7 @@
       <w:pPr>
         <w:pStyle w:val="Heading2"/>
       </w:pPr>
-      <w:bookmarkStart w:id="27" w:name="_Toc236150843"/>
+      <w:bookmarkStart w:id="27" w:name="_Toc236207467"/>
       <w:r>
         <w:t>Pekerjaan Lanjutan yang Disarankan</w:t>
       </w:r>
@@ -13801,7 +13907,7 @@
         <w:jc w:val="both"/>
       </w:pPr>
       <w:r>
-        <w:t xml:space="preserve">–  </w:t>
+        <w:t xml:space="preserve">•  </w:t>
       </w:r>
       <w:r>
         <w:rPr>
@@ -13823,7 +13929,7 @@
       </w:pPr>
       <w:r>
         <w:lastRenderedPageBreak/>
-        <w:t xml:space="preserve">–  </w:t>
+        <w:t xml:space="preserve">•  </w:t>
       </w:r>
       <w:r>
         <w:rPr>
@@ -13833,7 +13939,7 @@
         <w:t>Penyeragaman nama internal.</w:t>
       </w:r>
       <w:r>
-        <w:t xml:space="preserve"> Menyeragamkan nama kuki dan kunci localStorage menjadi reqatk. Dijadwalkan tersendiri karena menuntut seluruh pengguna masuk kembali dan menghapus preferensi tema mereka.</w:t>
+        <w:t xml:space="preserve"> Menyeragamkan nama cookie dan kunci localStorage menjadi reqatk. Dijadwalkan tersendiri karena menuntut seluruh pengguna masuk kembali dan menghapus preferensi tema mereka.</w:t>
       </w:r>
     </w:p>
     <w:p>
@@ -13844,7 +13950,7 @@
         <w:jc w:val="both"/>
       </w:pPr>
       <w:r>
-        <w:t xml:space="preserve">–  </w:t>
+        <w:t xml:space="preserve">•  </w:t>
       </w:r>
       <w:r>
         <w:rPr>
@@ -13865,7 +13971,7 @@
         <w:jc w:val="both"/>
       </w:pPr>
       <w:r>
-        <w:t xml:space="preserve">–  </w:t>
+        <w:t xml:space="preserve">•  </w:t>
       </w:r>
       <w:r>
         <w:rPr>
@@ -13875,7 +13981,7 @@
         <w:t>Pemberitahuan ke luar aplikasi.</w:t>
       </w:r>
       <w:r>
-        <w:t xml:space="preserve"> Membangun jalur surel atau gateway WhatsApp sebagaimana dipakai sistem sejenis di lingkungan yang sama, bila kabar di dalam aplikasi dirasa belum cukup.</w:t>
+        <w:t xml:space="preserve"> Membangun jalur email atau gateway WhatsApp sebagaimana dipakai sistem sejenis di lingkungan yang sama, bila kabar di dalam aplikasi dirasa belum cukup.</w:t>
       </w:r>
     </w:p>
     <w:p>
@@ -13885,7 +13991,7 @@
         <w:jc w:val="both"/>
       </w:pPr>
       <w:r>
-        <w:t>Di luar itu, daftar pada Bab VI merupakan peta pekerjaan lanjutan yang sudah tersusun menurut prioritas. Sebagian besar jawaban atas pertanyaan teknis terdapat di dalam repositori itu sendiri, terutama pada README.md dan docs/style.md, dan sisanya telah ditandai dengan jelas pada dokumen ini.</w:t>
+        <w:t>Di luar itu, daftar pada Bab VI merupakan daftar pekerjaan lanjutan yang sudah tersusun menurut prioritas. Sebagian besar jawaban atas pertanyaan teknis terdapat di dalam repositori itu sendiri, terutama pada README.md dan docs/style.md, dan sisanya telah ditandai dengan jelas pada dokumen ini.</w:t>
       </w:r>
     </w:p>
     <w:sectPr>

</xml_diff>

<commit_message>
Replace interface mockups with real screenshots captured from the running application
</commit_message>
<xml_diff>
--- a/ReqATK_Maintenance_Handoff_Document.docx
+++ b/ReqATK_Maintenance_Handoff_Document.docx
@@ -8,7 +8,7 @@
           <w:noProof/>
         </w:rPr>
         <w:drawing>
-          <wp:inline distT="0" distB="0" distL="0" distR="0" wp14:anchorId="5F6E07D2" wp14:editId="1B2EDB7B">
+          <wp:inline distT="0" distB="0" distL="0" distR="0" wp14:anchorId="148EA27A" wp14:editId="3EFBEDA0">
             <wp:extent cx="512399" cy="503999"/>
             <wp:effectExtent l="0" t="0" r="0" b="0"/>
             <wp:docPr id="1" name="Picture 1"/>
@@ -51,7 +51,7 @@
           <w:noProof/>
         </w:rPr>
         <w:drawing>
-          <wp:inline distT="0" distB="0" distL="0" distR="0" wp14:anchorId="6FA6CF81" wp14:editId="6D736F30">
+          <wp:inline distT="0" distB="0" distL="0" distR="0" wp14:anchorId="61D7DBA7" wp14:editId="31128F47">
             <wp:extent cx="790920" cy="468000"/>
             <wp:effectExtent l="0" t="0" r="0" b="0"/>
             <wp:docPr id="2" name="Picture 2"/>
@@ -96,7 +96,7 @@
           <w:noProof/>
         </w:rPr>
         <w:drawing>
-          <wp:inline distT="0" distB="0" distL="0" distR="0" wp14:anchorId="007D70DD" wp14:editId="675F7B77">
+          <wp:inline distT="0" distB="0" distL="0" distR="0" wp14:anchorId="300F6911" wp14:editId="5A3E7596">
             <wp:extent cx="1423013" cy="342000"/>
             <wp:effectExtent l="0" t="0" r="0" b="0"/>
             <wp:docPr id="3" name="Picture 3"/>
@@ -854,7 +854,7 @@
       <w:r>
         <w:fldChar w:fldCharType="separate"/>
       </w:r>
-      <w:hyperlink w:anchor="_Toc236207440" w:history="1">
+      <w:hyperlink w:anchor="_Toc236209556" w:history="1">
         <w:r>
           <w:rPr>
             <w:rStyle w:val="Hyperlink"/>
@@ -878,7 +878,7 @@
           <w:rPr>
             <w:noProof/>
           </w:rPr>
-          <w:instrText xml:space="preserve"> PAGEREF _Toc236207440 \h </w:instrText>
+          <w:instrText xml:space="preserve"> PAGEREF _Toc236209556 \h </w:instrText>
         </w:r>
         <w:r>
           <w:rPr>
@@ -919,7 +919,7 @@
           <w14:ligatures w14:val="standardContextual"/>
         </w:rPr>
       </w:pPr>
-      <w:hyperlink w:anchor="_Toc236207441" w:history="1">
+      <w:hyperlink w:anchor="_Toc236209557" w:history="1">
         <w:r>
           <w:rPr>
             <w:rStyle w:val="Hyperlink"/>
@@ -943,7 +943,7 @@
           <w:rPr>
             <w:noProof/>
           </w:rPr>
-          <w:instrText xml:space="preserve"> PAGEREF _Toc236207441 \h </w:instrText>
+          <w:instrText xml:space="preserve"> PAGEREF _Toc236209557 \h </w:instrText>
         </w:r>
         <w:r>
           <w:rPr>
@@ -984,7 +984,7 @@
           <w14:ligatures w14:val="standardContextual"/>
         </w:rPr>
       </w:pPr>
-      <w:hyperlink w:anchor="_Toc236207442" w:history="1">
+      <w:hyperlink w:anchor="_Toc236209558" w:history="1">
         <w:r>
           <w:rPr>
             <w:rStyle w:val="Hyperlink"/>
@@ -1008,7 +1008,7 @@
           <w:rPr>
             <w:noProof/>
           </w:rPr>
-          <w:instrText xml:space="preserve"> PAGEREF _Toc236207442 \h </w:instrText>
+          <w:instrText xml:space="preserve"> PAGEREF _Toc236209558 \h </w:instrText>
         </w:r>
         <w:r>
           <w:rPr>
@@ -1049,7 +1049,7 @@
           <w14:ligatures w14:val="standardContextual"/>
         </w:rPr>
       </w:pPr>
-      <w:hyperlink w:anchor="_Toc236207443" w:history="1">
+      <w:hyperlink w:anchor="_Toc236209559" w:history="1">
         <w:r>
           <w:rPr>
             <w:rStyle w:val="Hyperlink"/>
@@ -1073,7 +1073,7 @@
           <w:rPr>
             <w:noProof/>
           </w:rPr>
-          <w:instrText xml:space="preserve"> PAGEREF _Toc236207443 \h </w:instrText>
+          <w:instrText xml:space="preserve"> PAGEREF _Toc236209559 \h </w:instrText>
         </w:r>
         <w:r>
           <w:rPr>
@@ -1090,7 +1090,7 @@
           <w:rPr>
             <w:noProof/>
           </w:rPr>
-          <w:t>7</w:t>
+          <w:t>8</w:t>
         </w:r>
         <w:r>
           <w:rPr>
@@ -1114,7 +1114,7 @@
           <w14:ligatures w14:val="standardContextual"/>
         </w:rPr>
       </w:pPr>
-      <w:hyperlink w:anchor="_Toc236207444" w:history="1">
+      <w:hyperlink w:anchor="_Toc236209560" w:history="1">
         <w:r>
           <w:rPr>
             <w:rStyle w:val="Hyperlink"/>
@@ -1138,7 +1138,7 @@
           <w:rPr>
             <w:noProof/>
           </w:rPr>
-          <w:instrText xml:space="preserve"> PAGEREF _Toc236207444 \h </w:instrText>
+          <w:instrText xml:space="preserve"> PAGEREF _Toc236209560 \h </w:instrText>
         </w:r>
         <w:r>
           <w:rPr>
@@ -1155,7 +1155,7 @@
           <w:rPr>
             <w:noProof/>
           </w:rPr>
-          <w:t>7</w:t>
+          <w:t>8</w:t>
         </w:r>
         <w:r>
           <w:rPr>
@@ -1179,7 +1179,7 @@
           <w14:ligatures w14:val="standardContextual"/>
         </w:rPr>
       </w:pPr>
-      <w:hyperlink w:anchor="_Toc236207445" w:history="1">
+      <w:hyperlink w:anchor="_Toc236209561" w:history="1">
         <w:r>
           <w:rPr>
             <w:rStyle w:val="Hyperlink"/>
@@ -1203,7 +1203,7 @@
           <w:rPr>
             <w:noProof/>
           </w:rPr>
-          <w:instrText xml:space="preserve"> PAGEREF _Toc236207445 \h </w:instrText>
+          <w:instrText xml:space="preserve"> PAGEREF _Toc236209561 \h </w:instrText>
         </w:r>
         <w:r>
           <w:rPr>
@@ -1220,7 +1220,7 @@
           <w:rPr>
             <w:noProof/>
           </w:rPr>
-          <w:t>8</w:t>
+          <w:t>9</w:t>
         </w:r>
         <w:r>
           <w:rPr>
@@ -1244,7 +1244,7 @@
           <w14:ligatures w14:val="standardContextual"/>
         </w:rPr>
       </w:pPr>
-      <w:hyperlink w:anchor="_Toc236207446" w:history="1">
+      <w:hyperlink w:anchor="_Toc236209562" w:history="1">
         <w:r>
           <w:rPr>
             <w:rStyle w:val="Hyperlink"/>
@@ -1268,7 +1268,7 @@
           <w:rPr>
             <w:noProof/>
           </w:rPr>
-          <w:instrText xml:space="preserve"> PAGEREF _Toc236207446 \h </w:instrText>
+          <w:instrText xml:space="preserve"> PAGEREF _Toc236209562 \h </w:instrText>
         </w:r>
         <w:r>
           <w:rPr>
@@ -1285,7 +1285,7 @@
           <w:rPr>
             <w:noProof/>
           </w:rPr>
-          <w:t>8</w:t>
+          <w:t>9</w:t>
         </w:r>
         <w:r>
           <w:rPr>
@@ -1309,7 +1309,7 @@
           <w14:ligatures w14:val="standardContextual"/>
         </w:rPr>
       </w:pPr>
-      <w:hyperlink w:anchor="_Toc236207447" w:history="1">
+      <w:hyperlink w:anchor="_Toc236209563" w:history="1">
         <w:r>
           <w:rPr>
             <w:rStyle w:val="Hyperlink"/>
@@ -1333,7 +1333,7 @@
           <w:rPr>
             <w:noProof/>
           </w:rPr>
-          <w:instrText xml:space="preserve"> PAGEREF _Toc236207447 \h </w:instrText>
+          <w:instrText xml:space="preserve"> PAGEREF _Toc236209563 \h </w:instrText>
         </w:r>
         <w:r>
           <w:rPr>
@@ -1350,7 +1350,7 @@
           <w:rPr>
             <w:noProof/>
           </w:rPr>
-          <w:t>9</w:t>
+          <w:t>10</w:t>
         </w:r>
         <w:r>
           <w:rPr>
@@ -1374,7 +1374,7 @@
           <w14:ligatures w14:val="standardContextual"/>
         </w:rPr>
       </w:pPr>
-      <w:hyperlink w:anchor="_Toc236207448" w:history="1">
+      <w:hyperlink w:anchor="_Toc236209564" w:history="1">
         <w:r>
           <w:rPr>
             <w:rStyle w:val="Hyperlink"/>
@@ -1398,7 +1398,7 @@
           <w:rPr>
             <w:noProof/>
           </w:rPr>
-          <w:instrText xml:space="preserve"> PAGEREF _Toc236207448 \h </w:instrText>
+          <w:instrText xml:space="preserve"> PAGEREF _Toc236209564 \h </w:instrText>
         </w:r>
         <w:r>
           <w:rPr>
@@ -1415,7 +1415,7 @@
           <w:rPr>
             <w:noProof/>
           </w:rPr>
-          <w:t>11</w:t>
+          <w:t>12</w:t>
         </w:r>
         <w:r>
           <w:rPr>
@@ -1439,7 +1439,7 @@
           <w14:ligatures w14:val="standardContextual"/>
         </w:rPr>
       </w:pPr>
-      <w:hyperlink w:anchor="_Toc236207449" w:history="1">
+      <w:hyperlink w:anchor="_Toc236209565" w:history="1">
         <w:r>
           <w:rPr>
             <w:rStyle w:val="Hyperlink"/>
@@ -1463,7 +1463,7 @@
           <w:rPr>
             <w:noProof/>
           </w:rPr>
-          <w:instrText xml:space="preserve"> PAGEREF _Toc236207449 \h </w:instrText>
+          <w:instrText xml:space="preserve"> PAGEREF _Toc236209565 \h </w:instrText>
         </w:r>
         <w:r>
           <w:rPr>
@@ -1480,7 +1480,7 @@
           <w:rPr>
             <w:noProof/>
           </w:rPr>
-          <w:t>11</w:t>
+          <w:t>12</w:t>
         </w:r>
         <w:r>
           <w:rPr>
@@ -1504,7 +1504,7 @@
           <w14:ligatures w14:val="standardContextual"/>
         </w:rPr>
       </w:pPr>
-      <w:hyperlink w:anchor="_Toc236207450" w:history="1">
+      <w:hyperlink w:anchor="_Toc236209566" w:history="1">
         <w:r>
           <w:rPr>
             <w:rStyle w:val="Hyperlink"/>
@@ -1528,7 +1528,7 @@
           <w:rPr>
             <w:noProof/>
           </w:rPr>
-          <w:instrText xml:space="preserve"> PAGEREF _Toc236207450 \h </w:instrText>
+          <w:instrText xml:space="preserve"> PAGEREF _Toc236209566 \h </w:instrText>
         </w:r>
         <w:r>
           <w:rPr>
@@ -1545,7 +1545,7 @@
           <w:rPr>
             <w:noProof/>
           </w:rPr>
-          <w:t>12</w:t>
+          <w:t>13</w:t>
         </w:r>
         <w:r>
           <w:rPr>
@@ -1569,7 +1569,7 @@
           <w14:ligatures w14:val="standardContextual"/>
         </w:rPr>
       </w:pPr>
-      <w:hyperlink w:anchor="_Toc236207451" w:history="1">
+      <w:hyperlink w:anchor="_Toc236209567" w:history="1">
         <w:r>
           <w:rPr>
             <w:rStyle w:val="Hyperlink"/>
@@ -1593,7 +1593,7 @@
           <w:rPr>
             <w:noProof/>
           </w:rPr>
-          <w:instrText xml:space="preserve"> PAGEREF _Toc236207451 \h </w:instrText>
+          <w:instrText xml:space="preserve"> PAGEREF _Toc236209567 \h </w:instrText>
         </w:r>
         <w:r>
           <w:rPr>
@@ -1610,7 +1610,7 @@
           <w:rPr>
             <w:noProof/>
           </w:rPr>
-          <w:t>13</w:t>
+          <w:t>14</w:t>
         </w:r>
         <w:r>
           <w:rPr>
@@ -1634,7 +1634,7 @@
           <w14:ligatures w14:val="standardContextual"/>
         </w:rPr>
       </w:pPr>
-      <w:hyperlink w:anchor="_Toc236207452" w:history="1">
+      <w:hyperlink w:anchor="_Toc236209568" w:history="1">
         <w:r>
           <w:rPr>
             <w:rStyle w:val="Hyperlink"/>
@@ -1658,7 +1658,7 @@
           <w:rPr>
             <w:noProof/>
           </w:rPr>
-          <w:instrText xml:space="preserve"> PAGEREF _Toc236207452 \h </w:instrText>
+          <w:instrText xml:space="preserve"> PAGEREF _Toc236209568 \h </w:instrText>
         </w:r>
         <w:r>
           <w:rPr>
@@ -1675,7 +1675,7 @@
           <w:rPr>
             <w:noProof/>
           </w:rPr>
-          <w:t>13</w:t>
+          <w:t>14</w:t>
         </w:r>
         <w:r>
           <w:rPr>
@@ -1699,7 +1699,7 @@
           <w14:ligatures w14:val="standardContextual"/>
         </w:rPr>
       </w:pPr>
-      <w:hyperlink w:anchor="_Toc236207453" w:history="1">
+      <w:hyperlink w:anchor="_Toc236209569" w:history="1">
         <w:r>
           <w:rPr>
             <w:rStyle w:val="Hyperlink"/>
@@ -1723,7 +1723,7 @@
           <w:rPr>
             <w:noProof/>
           </w:rPr>
-          <w:instrText xml:space="preserve"> PAGEREF _Toc236207453 \h </w:instrText>
+          <w:instrText xml:space="preserve"> PAGEREF _Toc236209569 \h </w:instrText>
         </w:r>
         <w:r>
           <w:rPr>
@@ -1740,7 +1740,7 @@
           <w:rPr>
             <w:noProof/>
           </w:rPr>
-          <w:t>13</w:t>
+          <w:t>14</w:t>
         </w:r>
         <w:r>
           <w:rPr>
@@ -1764,7 +1764,7 @@
           <w14:ligatures w14:val="standardContextual"/>
         </w:rPr>
       </w:pPr>
-      <w:hyperlink w:anchor="_Toc236207454" w:history="1">
+      <w:hyperlink w:anchor="_Toc236209570" w:history="1">
         <w:r>
           <w:rPr>
             <w:rStyle w:val="Hyperlink"/>
@@ -1788,7 +1788,7 @@
           <w:rPr>
             <w:noProof/>
           </w:rPr>
-          <w:instrText xml:space="preserve"> PAGEREF _Toc236207454 \h </w:instrText>
+          <w:instrText xml:space="preserve"> PAGEREF _Toc236209570 \h </w:instrText>
         </w:r>
         <w:r>
           <w:rPr>
@@ -1805,7 +1805,7 @@
           <w:rPr>
             <w:noProof/>
           </w:rPr>
-          <w:t>15</w:t>
+          <w:t>16</w:t>
         </w:r>
         <w:r>
           <w:rPr>
@@ -1829,7 +1829,7 @@
           <w14:ligatures w14:val="standardContextual"/>
         </w:rPr>
       </w:pPr>
-      <w:hyperlink w:anchor="_Toc236207455" w:history="1">
+      <w:hyperlink w:anchor="_Toc236209571" w:history="1">
         <w:r>
           <w:rPr>
             <w:rStyle w:val="Hyperlink"/>
@@ -1853,7 +1853,7 @@
           <w:rPr>
             <w:noProof/>
           </w:rPr>
-          <w:instrText xml:space="preserve"> PAGEREF _Toc236207455 \h </w:instrText>
+          <w:instrText xml:space="preserve"> PAGEREF _Toc236209571 \h </w:instrText>
         </w:r>
         <w:r>
           <w:rPr>
@@ -1870,7 +1870,7 @@
           <w:rPr>
             <w:noProof/>
           </w:rPr>
-          <w:t>15</w:t>
+          <w:t>16</w:t>
         </w:r>
         <w:r>
           <w:rPr>
@@ -1894,7 +1894,7 @@
           <w14:ligatures w14:val="standardContextual"/>
         </w:rPr>
       </w:pPr>
-      <w:hyperlink w:anchor="_Toc236207456" w:history="1">
+      <w:hyperlink w:anchor="_Toc236209572" w:history="1">
         <w:r>
           <w:rPr>
             <w:rStyle w:val="Hyperlink"/>
@@ -1918,7 +1918,7 @@
           <w:rPr>
             <w:noProof/>
           </w:rPr>
-          <w:instrText xml:space="preserve"> PAGEREF _Toc236207456 \h </w:instrText>
+          <w:instrText xml:space="preserve"> PAGEREF _Toc236209572 \h </w:instrText>
         </w:r>
         <w:r>
           <w:rPr>
@@ -1935,7 +1935,7 @@
           <w:rPr>
             <w:noProof/>
           </w:rPr>
-          <w:t>16</w:t>
+          <w:t>17</w:t>
         </w:r>
         <w:r>
           <w:rPr>
@@ -1959,7 +1959,7 @@
           <w14:ligatures w14:val="standardContextual"/>
         </w:rPr>
       </w:pPr>
-      <w:hyperlink w:anchor="_Toc236207457" w:history="1">
+      <w:hyperlink w:anchor="_Toc236209573" w:history="1">
         <w:r>
           <w:rPr>
             <w:rStyle w:val="Hyperlink"/>
@@ -1983,7 +1983,7 @@
           <w:rPr>
             <w:noProof/>
           </w:rPr>
-          <w:instrText xml:space="preserve"> PAGEREF _Toc236207457 \h </w:instrText>
+          <w:instrText xml:space="preserve"> PAGEREF _Toc236209573 \h </w:instrText>
         </w:r>
         <w:r>
           <w:rPr>
@@ -2000,7 +2000,7 @@
           <w:rPr>
             <w:noProof/>
           </w:rPr>
-          <w:t>17</w:t>
+          <w:t>18</w:t>
         </w:r>
         <w:r>
           <w:rPr>
@@ -2024,7 +2024,7 @@
           <w14:ligatures w14:val="standardContextual"/>
         </w:rPr>
       </w:pPr>
-      <w:hyperlink w:anchor="_Toc236207458" w:history="1">
+      <w:hyperlink w:anchor="_Toc236209574" w:history="1">
         <w:r>
           <w:rPr>
             <w:rStyle w:val="Hyperlink"/>
@@ -2048,7 +2048,7 @@
           <w:rPr>
             <w:noProof/>
           </w:rPr>
-          <w:instrText xml:space="preserve"> PAGEREF _Toc236207458 \h </w:instrText>
+          <w:instrText xml:space="preserve"> PAGEREF _Toc236209574 \h </w:instrText>
         </w:r>
         <w:r>
           <w:rPr>
@@ -2065,7 +2065,7 @@
           <w:rPr>
             <w:noProof/>
           </w:rPr>
-          <w:t>17</w:t>
+          <w:t>18</w:t>
         </w:r>
         <w:r>
           <w:rPr>
@@ -2089,7 +2089,7 @@
           <w14:ligatures w14:val="standardContextual"/>
         </w:rPr>
       </w:pPr>
-      <w:hyperlink w:anchor="_Toc236207459" w:history="1">
+      <w:hyperlink w:anchor="_Toc236209575" w:history="1">
         <w:r>
           <w:rPr>
             <w:rStyle w:val="Hyperlink"/>
@@ -2113,7 +2113,7 @@
           <w:rPr>
             <w:noProof/>
           </w:rPr>
-          <w:instrText xml:space="preserve"> PAGEREF _Toc236207459 \h </w:instrText>
+          <w:instrText xml:space="preserve"> PAGEREF _Toc236209575 \h </w:instrText>
         </w:r>
         <w:r>
           <w:rPr>
@@ -2130,7 +2130,7 @@
           <w:rPr>
             <w:noProof/>
           </w:rPr>
-          <w:t>18</w:t>
+          <w:t>19</w:t>
         </w:r>
         <w:r>
           <w:rPr>
@@ -2154,7 +2154,7 @@
           <w14:ligatures w14:val="standardContextual"/>
         </w:rPr>
       </w:pPr>
-      <w:hyperlink w:anchor="_Toc236207460" w:history="1">
+      <w:hyperlink w:anchor="_Toc236209576" w:history="1">
         <w:r>
           <w:rPr>
             <w:rStyle w:val="Hyperlink"/>
@@ -2178,7 +2178,7 @@
           <w:rPr>
             <w:noProof/>
           </w:rPr>
-          <w:instrText xml:space="preserve"> PAGEREF _Toc236207460 \h </w:instrText>
+          <w:instrText xml:space="preserve"> PAGEREF _Toc236209576 \h </w:instrText>
         </w:r>
         <w:r>
           <w:rPr>
@@ -2195,7 +2195,7 @@
           <w:rPr>
             <w:noProof/>
           </w:rPr>
-          <w:t>20</w:t>
+          <w:t>21</w:t>
         </w:r>
         <w:r>
           <w:rPr>
@@ -2219,7 +2219,7 @@
           <w14:ligatures w14:val="standardContextual"/>
         </w:rPr>
       </w:pPr>
-      <w:hyperlink w:anchor="_Toc236207461" w:history="1">
+      <w:hyperlink w:anchor="_Toc236209577" w:history="1">
         <w:r>
           <w:rPr>
             <w:rStyle w:val="Hyperlink"/>
@@ -2243,7 +2243,7 @@
           <w:rPr>
             <w:noProof/>
           </w:rPr>
-          <w:instrText xml:space="preserve"> PAGEREF _Toc236207461 \h </w:instrText>
+          <w:instrText xml:space="preserve"> PAGEREF _Toc236209577 \h </w:instrText>
         </w:r>
         <w:r>
           <w:rPr>
@@ -2260,7 +2260,7 @@
           <w:rPr>
             <w:noProof/>
           </w:rPr>
-          <w:t>21</w:t>
+          <w:t>22</w:t>
         </w:r>
         <w:r>
           <w:rPr>
@@ -2284,7 +2284,7 @@
           <w14:ligatures w14:val="standardContextual"/>
         </w:rPr>
       </w:pPr>
-      <w:hyperlink w:anchor="_Toc236207462" w:history="1">
+      <w:hyperlink w:anchor="_Toc236209578" w:history="1">
         <w:r>
           <w:rPr>
             <w:rStyle w:val="Hyperlink"/>
@@ -2308,7 +2308,7 @@
           <w:rPr>
             <w:noProof/>
           </w:rPr>
-          <w:instrText xml:space="preserve"> PAGEREF _Toc236207462 \h </w:instrText>
+          <w:instrText xml:space="preserve"> PAGEREF _Toc236209578 \h </w:instrText>
         </w:r>
         <w:r>
           <w:rPr>
@@ -2325,7 +2325,7 @@
           <w:rPr>
             <w:noProof/>
           </w:rPr>
-          <w:t>22</w:t>
+          <w:t>23</w:t>
         </w:r>
         <w:r>
           <w:rPr>
@@ -2349,7 +2349,7 @@
           <w14:ligatures w14:val="standardContextual"/>
         </w:rPr>
       </w:pPr>
-      <w:hyperlink w:anchor="_Toc236207463" w:history="1">
+      <w:hyperlink w:anchor="_Toc236209579" w:history="1">
         <w:r>
           <w:rPr>
             <w:rStyle w:val="Hyperlink"/>
@@ -2373,7 +2373,7 @@
           <w:rPr>
             <w:noProof/>
           </w:rPr>
-          <w:instrText xml:space="preserve"> PAGEREF _Toc236207463 \h </w:instrText>
+          <w:instrText xml:space="preserve"> PAGEREF _Toc236209579 \h </w:instrText>
         </w:r>
         <w:r>
           <w:rPr>
@@ -2390,7 +2390,7 @@
           <w:rPr>
             <w:noProof/>
           </w:rPr>
-          <w:t>22</w:t>
+          <w:t>23</w:t>
         </w:r>
         <w:r>
           <w:rPr>
@@ -2414,7 +2414,7 @@
           <w14:ligatures w14:val="standardContextual"/>
         </w:rPr>
       </w:pPr>
-      <w:hyperlink w:anchor="_Toc236207464" w:history="1">
+      <w:hyperlink w:anchor="_Toc236209580" w:history="1">
         <w:r>
           <w:rPr>
             <w:rStyle w:val="Hyperlink"/>
@@ -2438,7 +2438,7 @@
           <w:rPr>
             <w:noProof/>
           </w:rPr>
-          <w:instrText xml:space="preserve"> PAGEREF _Toc236207464 \h </w:instrText>
+          <w:instrText xml:space="preserve"> PAGEREF _Toc236209580 \h </w:instrText>
         </w:r>
         <w:r>
           <w:rPr>
@@ -2455,7 +2455,7 @@
           <w:rPr>
             <w:noProof/>
           </w:rPr>
-          <w:t>22</w:t>
+          <w:t>23</w:t>
         </w:r>
         <w:r>
           <w:rPr>
@@ -2479,7 +2479,7 @@
           <w14:ligatures w14:val="standardContextual"/>
         </w:rPr>
       </w:pPr>
-      <w:hyperlink w:anchor="_Toc236207465" w:history="1">
+      <w:hyperlink w:anchor="_Toc236209581" w:history="1">
         <w:r>
           <w:rPr>
             <w:rStyle w:val="Hyperlink"/>
@@ -2503,7 +2503,7 @@
           <w:rPr>
             <w:noProof/>
           </w:rPr>
-          <w:instrText xml:space="preserve"> PAGEREF _Toc236207465 \h </w:instrText>
+          <w:instrText xml:space="preserve"> PAGEREF _Toc236209581 \h </w:instrText>
         </w:r>
         <w:r>
           <w:rPr>
@@ -2520,7 +2520,7 @@
           <w:rPr>
             <w:noProof/>
           </w:rPr>
-          <w:t>24</w:t>
+          <w:t>25</w:t>
         </w:r>
         <w:r>
           <w:rPr>
@@ -2544,7 +2544,7 @@
           <w14:ligatures w14:val="standardContextual"/>
         </w:rPr>
       </w:pPr>
-      <w:hyperlink w:anchor="_Toc236207466" w:history="1">
+      <w:hyperlink w:anchor="_Toc236209582" w:history="1">
         <w:r>
           <w:rPr>
             <w:rStyle w:val="Hyperlink"/>
@@ -2568,7 +2568,7 @@
           <w:rPr>
             <w:noProof/>
           </w:rPr>
-          <w:instrText xml:space="preserve"> PAGEREF _Toc236207466 \h </w:instrText>
+          <w:instrText xml:space="preserve"> PAGEREF _Toc236209582 \h </w:instrText>
         </w:r>
         <w:r>
           <w:rPr>
@@ -2585,7 +2585,7 @@
           <w:rPr>
             <w:noProof/>
           </w:rPr>
-          <w:t>24</w:t>
+          <w:t>25</w:t>
         </w:r>
         <w:r>
           <w:rPr>
@@ -2609,7 +2609,7 @@
           <w14:ligatures w14:val="standardContextual"/>
         </w:rPr>
       </w:pPr>
-      <w:hyperlink w:anchor="_Toc236207467" w:history="1">
+      <w:hyperlink w:anchor="_Toc236209583" w:history="1">
         <w:r>
           <w:rPr>
             <w:rStyle w:val="Hyperlink"/>
@@ -2633,7 +2633,7 @@
           <w:rPr>
             <w:noProof/>
           </w:rPr>
-          <w:instrText xml:space="preserve"> PAGEREF _Toc236207467 \h </w:instrText>
+          <w:instrText xml:space="preserve"> PAGEREF _Toc236209583 \h </w:instrText>
         </w:r>
         <w:r>
           <w:rPr>
@@ -2650,7 +2650,7 @@
           <w:rPr>
             <w:noProof/>
           </w:rPr>
-          <w:t>24</w:t>
+          <w:t>25</w:t>
         </w:r>
         <w:r>
           <w:rPr>
@@ -2674,7 +2674,7 @@
       <w:pPr>
         <w:pStyle w:val="Heading1"/>
       </w:pPr>
-      <w:bookmarkStart w:id="0" w:name="_Toc236207440"/>
+      <w:bookmarkStart w:id="0" w:name="_Toc236209556"/>
       <w:r>
         <w:lastRenderedPageBreak/>
         <w:t>Bab I   Gambaran Umum Sistem dan Arsitektur</w:t>
@@ -2750,7 +2750,7 @@
                 <w:color w:val="1D4677"/>
                 <w:sz w:val="19"/>
               </w:rPr>
-              <w:t>Browser    : React Server Components + Client Components (src/app, src/components)</w:t>
+              <w:t>Browser    : React Server Components dan Client Components (src/app, src/components)</w:t>
             </w:r>
           </w:p>
           <w:p>
@@ -2832,6 +2832,77 @@
           <w:sz w:val="19"/>
         </w:rPr>
         <w:t>Lapisan aplikasi dari browser sampai basis data.</w:t>
+      </w:r>
+    </w:p>
+    <w:p>
+      <w:pPr>
+        <w:spacing w:after="120" w:line="372" w:lineRule="auto"/>
+        <w:ind w:firstLine="624"/>
+        <w:jc w:val="both"/>
+      </w:pPr>
+      <w:r>
+        <w:t>Sebagai gambaran wujud jadinya, berikut tampilan beranda administrator pada lingkungan produksi. Seluruh gambar di dokumen ini diambil langsung dari aplikasi yang sedang berjalan.</w:t>
+      </w:r>
+    </w:p>
+    <w:p>
+      <w:pPr>
+        <w:spacing w:before="120" w:after="80"/>
+        <w:jc w:val="center"/>
+      </w:pPr>
+      <w:r>
+        <w:rPr>
+          <w:noProof/>
+        </w:rPr>
+        <w:lastRenderedPageBreak/>
+        <w:drawing>
+          <wp:inline distT="0" distB="0" distL="0" distR="0" wp14:anchorId="2931CF1D" wp14:editId="76E35A48">
+            <wp:extent cx="5112000" cy="3382941"/>
+            <wp:effectExtent l="0" t="0" r="0" b="0"/>
+            <wp:docPr id="4" name="Picture 4"/>
+            <wp:cNvGraphicFramePr>
+              <a:graphicFrameLocks xmlns:a="http://schemas.openxmlformats.org/drawingml/2006/main" noChangeAspect="1"/>
+            </wp:cNvGraphicFramePr>
+            <a:graphic xmlns:a="http://schemas.openxmlformats.org/drawingml/2006/main">
+              <a:graphicData uri="http://schemas.openxmlformats.org/drawingml/2006/picture">
+                <pic:pic xmlns:pic="http://schemas.openxmlformats.org/drawingml/2006/picture">
+                  <pic:nvPicPr>
+                    <pic:cNvPr id="0" name="ss_admin_dashboard.png"/>
+                    <pic:cNvPicPr/>
+                  </pic:nvPicPr>
+                  <pic:blipFill>
+                    <a:blip r:embed="rId12"/>
+                    <a:stretch>
+                      <a:fillRect/>
+                    </a:stretch>
+                  </pic:blipFill>
+                  <pic:spPr>
+                    <a:xfrm>
+                      <a:off x="0" y="0"/>
+                      <a:ext cx="5112000" cy="3382941"/>
+                    </a:xfrm>
+                    <a:prstGeom prst="rect">
+                      <a:avLst/>
+                    </a:prstGeom>
+                  </pic:spPr>
+                </pic:pic>
+              </a:graphicData>
+            </a:graphic>
+          </wp:inline>
+        </w:drawing>
+      </w:r>
+    </w:p>
+    <w:p>
+      <w:pPr>
+        <w:spacing w:after="200"/>
+        <w:jc w:val="center"/>
+      </w:pPr>
+      <w:r>
+        <w:rPr>
+          <w:i/>
+          <w:color w:val="4A5A70"/>
+          <w:sz w:val="19"/>
+        </w:rPr>
+        <w:t>Gambar 1. Beranda administrator pada lingkungan produksi</w:t>
       </w:r>
     </w:p>
     <w:p>
@@ -3728,7 +3799,6 @@
                 <w:color w:val="16365C"/>
                 <w:sz w:val="21"/>
               </w:rPr>
-              <w:lastRenderedPageBreak/>
               <w:t>Autentikasi</w:t>
             </w:r>
           </w:p>
@@ -3757,7 +3827,7 @@
               <w:rPr>
                 <w:sz w:val="21"/>
               </w:rPr>
-              <w:t>JWT HS256 (jose) + bcryptjs</w:t>
+              <w:t>JWT HS256 (jose) dan bcryptjs</w:t>
             </w:r>
           </w:p>
         </w:tc>
@@ -3875,7 +3945,7 @@
               <w:rPr>
                 <w:sz w:val="21"/>
               </w:rPr>
-              <w:t>jspdf + jspdf-autotable</w:t>
+              <w:t>jspdf dan jspdf-autotable</w:t>
             </w:r>
           </w:p>
         </w:tc>
@@ -4111,7 +4181,7 @@
               <w:rPr>
                 <w:sz w:val="21"/>
               </w:rPr>
-              <w:t>chart.js + react-chartjs-2</w:t>
+              <w:t>chart.js dan react-chartjs-2</w:t>
             </w:r>
           </w:p>
         </w:tc>
@@ -4300,7 +4370,7 @@
       <w:pPr>
         <w:pStyle w:val="Heading2"/>
       </w:pPr>
-      <w:bookmarkStart w:id="1" w:name="_Toc236207441"/>
+      <w:bookmarkStart w:id="1" w:name="_Toc236209557"/>
       <w:r>
         <w:t>Keputusan Desain Utama</w:t>
       </w:r>
@@ -4313,6 +4383,7 @@
         <w:jc w:val="both"/>
       </w:pPr>
       <w:r>
+        <w:lastRenderedPageBreak/>
         <w:t>Beberapa keputusan desain melatarbelakangi bentuk kode saat ini. Pertama, autentikasi ditulis sendiri tanpa NextAuth. Kata sandi disimpan sebagai hash bcrypt dengan sepuluh putaran, sedangkan sesi berupa JWT HS256 yang ditandatangani AUTH_SECRET, berlaku delapan jam, dan disimpan pada cookie httpOnly bernama pinjamatk_session. Modul src/lib/session.ts sengaja dijaga bebas dependensi Node agar dapat dipakai baik oleh Edge Middleware maupun oleh Server Action.</w:t>
       </w:r>
     </w:p>
@@ -4486,7 +4557,6 @@
         <w:jc w:val="both"/>
       </w:pPr>
       <w:r>
-        <w:lastRenderedPageBreak/>
         <w:t>Keempat, satu pengajuan yang memuat beberapa barang dipecah menjadi beberapa baris pada tabel permintaan, masing-masing satu barang, yang berbagi keperluan dan tanggal yang sama. Pemecahan ini membuat administrator dapat menyetujui sebagian barang dan menolak sebagian lainnya. Kelima, skema basis data diperlakukan sebagai kode: seluruh definisi tabel berada di scripts/setup-db.mjs yang ditulis idempoten dengan CREATE TABLE IF NOT EXISTS dan blok DO $$ pemeriksa kolom, sehingga aman dijalankan berulang kali.</w:t>
       </w:r>
     </w:p>
@@ -4494,7 +4564,7 @@
       <w:pPr>
         <w:pStyle w:val="Heading2"/>
       </w:pPr>
-      <w:bookmarkStart w:id="2" w:name="_Toc236207442"/>
+      <w:bookmarkStart w:id="2" w:name="_Toc236209558"/>
       <w:r>
         <w:t>Layanan Eksternal</w:t>
       </w:r>
@@ -4550,6 +4620,7 @@
                 <w:color w:val="FFFFFF"/>
                 <w:sz w:val="21"/>
               </w:rPr>
+              <w:lastRenderedPageBreak/>
               <w:t>Layanan</w:t>
             </w:r>
           </w:p>
@@ -4899,7 +4970,7 @@
       <w:pPr>
         <w:pStyle w:val="Heading1"/>
       </w:pPr>
-      <w:bookmarkStart w:id="3" w:name="_Toc236207443"/>
+      <w:bookmarkStart w:id="3" w:name="_Toc236209559"/>
       <w:r>
         <w:lastRenderedPageBreak/>
         <w:t>Bab II   Penelusuran Struktur Kode</w:t>
@@ -5408,7 +5479,7 @@
               <w:rPr>
                 <w:sz w:val="21"/>
               </w:rPr>
-              <w:t>Berkas sumber katalog 897 barang; dibaca oleh scripts/seed-from-excel.mjs</w:t>
+              <w:t>Berkas sumber katalog barang; dibaca oleh scripts/seed-from-excel.mjs</w:t>
             </w:r>
           </w:p>
         </w:tc>
@@ -5541,7 +5612,7 @@
       <w:pPr>
         <w:pStyle w:val="Heading2"/>
       </w:pPr>
-      <w:bookmarkStart w:id="4" w:name="_Toc236207444"/>
+      <w:bookmarkStart w:id="4" w:name="_Toc236209560"/>
       <w:r>
         <w:t>Rute dan Pembagian Peran</w:t>
       </w:r>
@@ -6847,7 +6918,7 @@
       <w:pPr>
         <w:pStyle w:val="Heading2"/>
       </w:pPr>
-      <w:bookmarkStart w:id="5" w:name="_Toc236207445"/>
+      <w:bookmarkStart w:id="5" w:name="_Toc236209561"/>
       <w:r>
         <w:t>Modul Server yang Perlu Dikenali</w:t>
       </w:r>
@@ -7875,7 +7946,7 @@
       <w:pPr>
         <w:pStyle w:val="Heading2"/>
       </w:pPr>
-      <w:bookmarkStart w:id="6" w:name="_Toc236207446"/>
+      <w:bookmarkStart w:id="6" w:name="_Toc236209562"/>
       <w:r>
         <w:t>Logika Bisnis yang Perlu Diperhatikan</w:t>
       </w:r>
@@ -8238,7 +8309,7 @@
       <w:pPr>
         <w:pStyle w:val="Heading2"/>
       </w:pPr>
-      <w:bookmarkStart w:id="7" w:name="_Toc236207447"/>
+      <w:bookmarkStart w:id="7" w:name="_Toc236209563"/>
       <w:r>
         <w:t>Urutan Membaca yang Disarankan</w:t>
       </w:r>
@@ -8362,7 +8433,7 @@
       <w:pPr>
         <w:pStyle w:val="Heading1"/>
       </w:pPr>
-      <w:bookmarkStart w:id="8" w:name="_Toc236207448"/>
+      <w:bookmarkStart w:id="8" w:name="_Toc236209564"/>
       <w:r>
         <w:lastRenderedPageBreak/>
         <w:t>Bab III   Panduan Persiapan Lingkungan</w:t>
@@ -8483,7 +8554,7 @@
       <w:pPr>
         <w:pStyle w:val="Heading2"/>
       </w:pPr>
-      <w:bookmarkStart w:id="9" w:name="_Toc236207449"/>
+      <w:bookmarkStart w:id="9" w:name="_Toc236209565"/>
       <w:r>
         <w:t>Variabel Environment</w:t>
       </w:r>
@@ -8918,7 +8989,7 @@
       <w:pPr>
         <w:pStyle w:val="Heading2"/>
       </w:pPr>
-      <w:bookmarkStart w:id="10" w:name="_Toc236207450"/>
+      <w:bookmarkStart w:id="10" w:name="_Toc236209566"/>
       <w:r>
         <w:t>Perintah npm</w:t>
       </w:r>
@@ -9338,7 +9409,7 @@
       <w:pPr>
         <w:pStyle w:val="Heading1"/>
       </w:pPr>
-      <w:bookmarkStart w:id="11" w:name="_Toc236207451"/>
+      <w:bookmarkStart w:id="11" w:name="_Toc236209567"/>
       <w:r>
         <w:lastRenderedPageBreak/>
         <w:t>Bab IV   Deployment dan Infrastruktur</w:t>
@@ -9369,7 +9440,7 @@
       <w:pPr>
         <w:pStyle w:val="Heading2"/>
       </w:pPr>
-      <w:bookmarkStart w:id="12" w:name="_Toc236207452"/>
+      <w:bookmarkStart w:id="12" w:name="_Toc236209568"/>
       <w:r>
         <w:t>Konfigurasi vercel.json</w:t>
       </w:r>
@@ -9495,7 +9566,7 @@
       <w:pPr>
         <w:pStyle w:val="Heading2"/>
       </w:pPr>
-      <w:bookmarkStart w:id="13" w:name="_Toc236207453"/>
+      <w:bookmarkStart w:id="13" w:name="_Toc236209569"/>
       <w:r>
         <w:t>Variabel Produksi dan Rollback</w:t>
       </w:r>
@@ -9534,7 +9605,7 @@
       <w:pPr>
         <w:pStyle w:val="Heading1"/>
       </w:pPr>
-      <w:bookmarkStart w:id="14" w:name="_Toc236207454"/>
+      <w:bookmarkStart w:id="14" w:name="_Toc236209570"/>
       <w:r>
         <w:lastRenderedPageBreak/>
         <w:t>Bab V   Dokumentasi Basis Data</w:t>
@@ -9960,7 +10031,7 @@
       <w:pPr>
         <w:pStyle w:val="Heading2"/>
       </w:pPr>
-      <w:bookmarkStart w:id="15" w:name="_Toc236207455"/>
+      <w:bookmarkStart w:id="15" w:name="_Toc236209571"/>
       <w:r>
         <w:t>Skema sebagai Kode</w:t>
       </w:r>
@@ -10176,7 +10247,7 @@
       <w:pPr>
         <w:pStyle w:val="Heading2"/>
       </w:pPr>
-      <w:bookmarkStart w:id="16" w:name="_Toc236207456"/>
+      <w:bookmarkStart w:id="16" w:name="_Toc236209572"/>
       <w:r>
         <w:t>Karakteristik Data yang Perlu Diketahui</w:t>
       </w:r>
@@ -10207,7 +10278,7 @@
         <w:t xml:space="preserve">•  </w:t>
       </w:r>
       <w:r>
-        <w:t>Katalog berisi 897 barang dalam empat kategori, yaitu Barang Konsumsi dengan 755 barang, Bahan Baku 99, Suku Cadang 28, dan Bahan untuk Pemeliharaan 15, yang seluruhnya terbagi lagi ke dalam 53 jenis.</w:t>
+        <w:t>Berkas Excel memuat 897 barang dalam empat kategori, yaitu Barang Konsumsi dengan 755 barang, Bahan Baku 99, Suku Cadang 28, dan Bahan untuk Pemeliharaan 15, yang seluruhnya terbagi lagi ke dalam 53 jenis. Katalog produksi saat ini menampilkan 898 barang karena masih menyisakan satu baris lama berkode ATK-004 yang tidak berasal dari berkas Excel.</w:t>
       </w:r>
     </w:p>
     <w:p>
@@ -10275,7 +10346,7 @@
       <w:pPr>
         <w:pStyle w:val="Heading1"/>
       </w:pPr>
-      <w:bookmarkStart w:id="17" w:name="_Toc236207457"/>
+      <w:bookmarkStart w:id="17" w:name="_Toc236209573"/>
       <w:r>
         <w:lastRenderedPageBreak/>
         <w:t>Bab VI   Masalah yang Diketahui dan Utang Teknis</w:t>
@@ -10296,7 +10367,7 @@
       <w:pPr>
         <w:pStyle w:val="Heading2"/>
       </w:pPr>
-      <w:bookmarkStart w:id="18" w:name="_Toc236207458"/>
+      <w:bookmarkStart w:id="18" w:name="_Toc236209574"/>
       <w:r>
         <w:t>Telah Diselesaikan pada Serah Terima Ini</w:t>
       </w:r>
@@ -10481,7 +10552,7 @@
       <w:pPr>
         <w:pStyle w:val="Heading2"/>
       </w:pPr>
-      <w:bookmarkStart w:id="19" w:name="_Toc236207459"/>
+      <w:bookmarkStart w:id="19" w:name="_Toc236209575"/>
       <w:r>
         <w:t>Utang Teknis yang Masih Tersisa</w:t>
       </w:r>
@@ -10653,7 +10724,7 @@
         <w:t>Halaman daftar memuat seluruh baris sekaligus.</w:t>
       </w:r>
       <w:r>
-        <w:t xml:space="preserve"> Katalog barang, laporan, dan halaman persetujuan mengambil semua baris tanpa LIMIT. Untuk 897 barang hal ini masih wajar, tetapi perlu ditinjau ulang bila data transaksi bertambah besar.</w:t>
+        <w:t xml:space="preserve"> Katalog barang, laporan, dan halaman persetujuan mengambil semua baris tanpa LIMIT. Untuk 898 barang hal ini masih wajar, tetapi perlu ditinjau ulang bila data transaksi bertambah besar.</w:t>
       </w:r>
     </w:p>
     <w:p>
@@ -10686,7 +10757,7 @@
       <w:pPr>
         <w:pStyle w:val="Heading1"/>
       </w:pPr>
-      <w:bookmarkStart w:id="20" w:name="_Toc236207460"/>
+      <w:bookmarkStart w:id="20" w:name="_Toc236209576"/>
       <w:r>
         <w:lastRenderedPageBreak/>
         <w:t>Bab VII   Pengujian</w:t>
@@ -11301,7 +11372,7 @@
       <w:pPr>
         <w:pStyle w:val="Heading1"/>
       </w:pPr>
-      <w:bookmarkStart w:id="21" w:name="_Toc236207461"/>
+      <w:bookmarkStart w:id="21" w:name="_Toc236209577"/>
       <w:r>
         <w:lastRenderedPageBreak/>
         <w:t>Bab VIII   Dependensi Pihak Ketiga dan Lisensi</w:t>
@@ -13575,7 +13646,7 @@
       <w:pPr>
         <w:pStyle w:val="Heading1"/>
       </w:pPr>
-      <w:bookmarkStart w:id="22" w:name="_Toc236207462"/>
+      <w:bookmarkStart w:id="22" w:name="_Toc236209578"/>
       <w:r>
         <w:lastRenderedPageBreak/>
         <w:t>Bab IX   Runbook Pemeliharaan</w:t>
@@ -13596,7 +13667,7 @@
       <w:pPr>
         <w:pStyle w:val="Heading2"/>
       </w:pPr>
-      <w:bookmarkStart w:id="23" w:name="_Toc236207463"/>
+      <w:bookmarkStart w:id="23" w:name="_Toc236209579"/>
       <w:r>
         <w:t>Prosedur Rutin</w:t>
       </w:r>
@@ -13753,7 +13824,7 @@
       <w:pPr>
         <w:pStyle w:val="Heading2"/>
       </w:pPr>
-      <w:bookmarkStart w:id="24" w:name="_Toc236207464"/>
+      <w:bookmarkStart w:id="24" w:name="_Toc236209580"/>
       <w:r>
         <w:t>Logging, Pemantauan, dan Pencadangan</w:t>
       </w:r>
@@ -13795,7 +13866,7 @@
       <w:pPr>
         <w:pStyle w:val="Heading1"/>
       </w:pPr>
-      <w:bookmarkStart w:id="25" w:name="_Toc236207465"/>
+      <w:bookmarkStart w:id="25" w:name="_Toc236209581"/>
       <w:r>
         <w:lastRenderedPageBreak/>
         <w:t>Bab X   Ringkasan Serah Terima dan Langkah Selanjutnya</w:t>
@@ -13809,7 +13880,7 @@
         <w:jc w:val="both"/>
       </w:pPr>
       <w:r>
-        <w:t>Aplikasi yang diserahterimakan berupa aplikasi yang utuh dan sudah berjalan: 63 berkas sumber dengan sekitar 8.800 baris kode di dalam src, sebelas dependensi runtime, dan build produksi yang lulus tanpa peringatan. Cakupannya meliputi login dua tahap berbasis NIP beserta alur aktivasi mandiri, katalog 897 barang hasil impor dari daftar persediaan resmi, formulir permintaan berbentuk keranjang yang menampung banyak barang sekaligus, persetujuan dengan pengurangan stok yang atomik beserta persetujuan massal,</w:t>
+        <w:t>Aplikasi yang diserahterimakan berupa aplikasi yang utuh dan sudah berjalan: 63 berkas sumber dengan sekitar 8.800 baris kode di dalam src, sebelas dependensi runtime, dan build produksi yang lulus tanpa peringatan. Cakupannya meliputi login dua tahap berbasis NIP beserta alur aktivasi mandiri, katalog 898 barang hasil impor dari daftar persediaan resmi, formulir permintaan berbentuk keranjang yang menampung banyak barang sekaligus, persetujuan dengan pengurangan stok yang atomik beserta persetujuan massal,</w:t>
       </w:r>
       <w:r>
         <w:t xml:space="preserve"> laporan yang dapat diekspor ke PDF, Excel, dan CSV, pemberitahuan dalam aplikasi, jejak audit, serta antarmuka bertema terang dan gelap yang mengikuti design system pada docs/style.md.</w:t>
@@ -13829,7 +13900,7 @@
       <w:pPr>
         <w:pStyle w:val="Heading2"/>
       </w:pPr>
-      <w:bookmarkStart w:id="26" w:name="_Toc236207466"/>
+      <w:bookmarkStart w:id="26" w:name="_Toc236209582"/>
       <w:r>
         <w:t>Tiga Langkah Pertama bagi Pemelihara Baru</w:t>
       </w:r>
@@ -13893,7 +13964,7 @@
       <w:pPr>
         <w:pStyle w:val="Heading2"/>
       </w:pPr>
-      <w:bookmarkStart w:id="27" w:name="_Toc236207467"/>
+      <w:bookmarkStart w:id="27" w:name="_Toc236209583"/>
       <w:r>
         <w:t>Pekerjaan Lanjutan yang Disarankan</w:t>
       </w:r>
@@ -13995,8 +14066,8 @@
       </w:r>
     </w:p>
     <w:sectPr>
-      <w:headerReference w:type="default" r:id="rId12"/>
-      <w:footerReference w:type="default" r:id="rId13"/>
+      <w:headerReference w:type="default" r:id="rId13"/>
+      <w:footerReference w:type="default" r:id="rId14"/>
       <w:pgSz w:w="11906" w:h="16838"/>
       <w:pgMar w:top="1800" w:right="1135" w:bottom="1470" w:left="1475" w:header="480" w:footer="600" w:gutter="0"/>
       <w:cols w:space="720"/>

</xml_diff>

<commit_message>
Use real activation page screenshot after registering employee NIP as pending accounts
</commit_message>
<xml_diff>
--- a/ReqATK_Maintenance_Handoff_Document.docx
+++ b/ReqATK_Maintenance_Handoff_Document.docx
@@ -8,7 +8,7 @@
           <w:noProof/>
         </w:rPr>
         <w:drawing>
-          <wp:inline distT="0" distB="0" distL="0" distR="0" wp14:anchorId="148EA27A" wp14:editId="3EFBEDA0">
+          <wp:inline distT="0" distB="0" distL="0" distR="0" wp14:anchorId="65C4B45D" wp14:editId="46482E00">
             <wp:extent cx="512399" cy="503999"/>
             <wp:effectExtent l="0" t="0" r="0" b="0"/>
             <wp:docPr id="1" name="Picture 1"/>
@@ -51,7 +51,7 @@
           <w:noProof/>
         </w:rPr>
         <w:drawing>
-          <wp:inline distT="0" distB="0" distL="0" distR="0" wp14:anchorId="61D7DBA7" wp14:editId="31128F47">
+          <wp:inline distT="0" distB="0" distL="0" distR="0" wp14:anchorId="5A198426" wp14:editId="1FEF90F4">
             <wp:extent cx="790920" cy="468000"/>
             <wp:effectExtent l="0" t="0" r="0" b="0"/>
             <wp:docPr id="2" name="Picture 2"/>
@@ -96,7 +96,7 @@
           <w:noProof/>
         </w:rPr>
         <w:drawing>
-          <wp:inline distT="0" distB="0" distL="0" distR="0" wp14:anchorId="300F6911" wp14:editId="5A3E7596">
+          <wp:inline distT="0" distB="0" distL="0" distR="0" wp14:anchorId="4498B0BD" wp14:editId="30C1232B">
             <wp:extent cx="1423013" cy="342000"/>
             <wp:effectExtent l="0" t="0" r="0" b="0"/>
             <wp:docPr id="3" name="Picture 3"/>
@@ -854,7 +854,7 @@
       <w:r>
         <w:fldChar w:fldCharType="separate"/>
       </w:r>
-      <w:hyperlink w:anchor="_Toc236209556" w:history="1">
+      <w:hyperlink w:anchor="_Toc236210993" w:history="1">
         <w:r>
           <w:rPr>
             <w:rStyle w:val="Hyperlink"/>
@@ -878,7 +878,7 @@
           <w:rPr>
             <w:noProof/>
           </w:rPr>
-          <w:instrText xml:space="preserve"> PAGEREF _Toc236209556 \h </w:instrText>
+          <w:instrText xml:space="preserve"> PAGEREF _Toc236210993 \h </w:instrText>
         </w:r>
         <w:r>
           <w:rPr>
@@ -919,7 +919,7 @@
           <w14:ligatures w14:val="standardContextual"/>
         </w:rPr>
       </w:pPr>
-      <w:hyperlink w:anchor="_Toc236209557" w:history="1">
+      <w:hyperlink w:anchor="_Toc236210994" w:history="1">
         <w:r>
           <w:rPr>
             <w:rStyle w:val="Hyperlink"/>
@@ -943,7 +943,7 @@
           <w:rPr>
             <w:noProof/>
           </w:rPr>
-          <w:instrText xml:space="preserve"> PAGEREF _Toc236209557 \h </w:instrText>
+          <w:instrText xml:space="preserve"> PAGEREF _Toc236210994 \h </w:instrText>
         </w:r>
         <w:r>
           <w:rPr>
@@ -984,7 +984,7 @@
           <w14:ligatures w14:val="standardContextual"/>
         </w:rPr>
       </w:pPr>
-      <w:hyperlink w:anchor="_Toc236209558" w:history="1">
+      <w:hyperlink w:anchor="_Toc236210995" w:history="1">
         <w:r>
           <w:rPr>
             <w:rStyle w:val="Hyperlink"/>
@@ -1008,7 +1008,7 @@
           <w:rPr>
             <w:noProof/>
           </w:rPr>
-          <w:instrText xml:space="preserve"> PAGEREF _Toc236209558 \h </w:instrText>
+          <w:instrText xml:space="preserve"> PAGEREF _Toc236210995 \h </w:instrText>
         </w:r>
         <w:r>
           <w:rPr>
@@ -1049,7 +1049,7 @@
           <w14:ligatures w14:val="standardContextual"/>
         </w:rPr>
       </w:pPr>
-      <w:hyperlink w:anchor="_Toc236209559" w:history="1">
+      <w:hyperlink w:anchor="_Toc236210996" w:history="1">
         <w:r>
           <w:rPr>
             <w:rStyle w:val="Hyperlink"/>
@@ -1073,7 +1073,7 @@
           <w:rPr>
             <w:noProof/>
           </w:rPr>
-          <w:instrText xml:space="preserve"> PAGEREF _Toc236209559 \h </w:instrText>
+          <w:instrText xml:space="preserve"> PAGEREF _Toc236210996 \h </w:instrText>
         </w:r>
         <w:r>
           <w:rPr>
@@ -1114,7 +1114,7 @@
           <w14:ligatures w14:val="standardContextual"/>
         </w:rPr>
       </w:pPr>
-      <w:hyperlink w:anchor="_Toc236209560" w:history="1">
+      <w:hyperlink w:anchor="_Toc236210997" w:history="1">
         <w:r>
           <w:rPr>
             <w:rStyle w:val="Hyperlink"/>
@@ -1138,7 +1138,7 @@
           <w:rPr>
             <w:noProof/>
           </w:rPr>
-          <w:instrText xml:space="preserve"> PAGEREF _Toc236209560 \h </w:instrText>
+          <w:instrText xml:space="preserve"> PAGEREF _Toc236210997 \h </w:instrText>
         </w:r>
         <w:r>
           <w:rPr>
@@ -1179,7 +1179,7 @@
           <w14:ligatures w14:val="standardContextual"/>
         </w:rPr>
       </w:pPr>
-      <w:hyperlink w:anchor="_Toc236209561" w:history="1">
+      <w:hyperlink w:anchor="_Toc236210998" w:history="1">
         <w:r>
           <w:rPr>
             <w:rStyle w:val="Hyperlink"/>
@@ -1203,7 +1203,7 @@
           <w:rPr>
             <w:noProof/>
           </w:rPr>
-          <w:instrText xml:space="preserve"> PAGEREF _Toc236209561 \h </w:instrText>
+          <w:instrText xml:space="preserve"> PAGEREF _Toc236210998 \h </w:instrText>
         </w:r>
         <w:r>
           <w:rPr>
@@ -1244,7 +1244,7 @@
           <w14:ligatures w14:val="standardContextual"/>
         </w:rPr>
       </w:pPr>
-      <w:hyperlink w:anchor="_Toc236209562" w:history="1">
+      <w:hyperlink w:anchor="_Toc236210999" w:history="1">
         <w:r>
           <w:rPr>
             <w:rStyle w:val="Hyperlink"/>
@@ -1268,7 +1268,7 @@
           <w:rPr>
             <w:noProof/>
           </w:rPr>
-          <w:instrText xml:space="preserve"> PAGEREF _Toc236209562 \h </w:instrText>
+          <w:instrText xml:space="preserve"> PAGEREF _Toc236210999 \h </w:instrText>
         </w:r>
         <w:r>
           <w:rPr>
@@ -1309,7 +1309,7 @@
           <w14:ligatures w14:val="standardContextual"/>
         </w:rPr>
       </w:pPr>
-      <w:hyperlink w:anchor="_Toc236209563" w:history="1">
+      <w:hyperlink w:anchor="_Toc236211000" w:history="1">
         <w:r>
           <w:rPr>
             <w:rStyle w:val="Hyperlink"/>
@@ -1333,7 +1333,7 @@
           <w:rPr>
             <w:noProof/>
           </w:rPr>
-          <w:instrText xml:space="preserve"> PAGEREF _Toc236209563 \h </w:instrText>
+          <w:instrText xml:space="preserve"> PAGEREF _Toc236211000 \h </w:instrText>
         </w:r>
         <w:r>
           <w:rPr>
@@ -1374,7 +1374,7 @@
           <w14:ligatures w14:val="standardContextual"/>
         </w:rPr>
       </w:pPr>
-      <w:hyperlink w:anchor="_Toc236209564" w:history="1">
+      <w:hyperlink w:anchor="_Toc236211001" w:history="1">
         <w:r>
           <w:rPr>
             <w:rStyle w:val="Hyperlink"/>
@@ -1398,7 +1398,7 @@
           <w:rPr>
             <w:noProof/>
           </w:rPr>
-          <w:instrText xml:space="preserve"> PAGEREF _Toc236209564 \h </w:instrText>
+          <w:instrText xml:space="preserve"> PAGEREF _Toc236211001 \h </w:instrText>
         </w:r>
         <w:r>
           <w:rPr>
@@ -1439,7 +1439,7 @@
           <w14:ligatures w14:val="standardContextual"/>
         </w:rPr>
       </w:pPr>
-      <w:hyperlink w:anchor="_Toc236209565" w:history="1">
+      <w:hyperlink w:anchor="_Toc236211002" w:history="1">
         <w:r>
           <w:rPr>
             <w:rStyle w:val="Hyperlink"/>
@@ -1463,7 +1463,7 @@
           <w:rPr>
             <w:noProof/>
           </w:rPr>
-          <w:instrText xml:space="preserve"> PAGEREF _Toc236209565 \h </w:instrText>
+          <w:instrText xml:space="preserve"> PAGEREF _Toc236211002 \h </w:instrText>
         </w:r>
         <w:r>
           <w:rPr>
@@ -1504,7 +1504,7 @@
           <w14:ligatures w14:val="standardContextual"/>
         </w:rPr>
       </w:pPr>
-      <w:hyperlink w:anchor="_Toc236209566" w:history="1">
+      <w:hyperlink w:anchor="_Toc236211003" w:history="1">
         <w:r>
           <w:rPr>
             <w:rStyle w:val="Hyperlink"/>
@@ -1528,7 +1528,7 @@
           <w:rPr>
             <w:noProof/>
           </w:rPr>
-          <w:instrText xml:space="preserve"> PAGEREF _Toc236209566 \h </w:instrText>
+          <w:instrText xml:space="preserve"> PAGEREF _Toc236211003 \h </w:instrText>
         </w:r>
         <w:r>
           <w:rPr>
@@ -1569,7 +1569,7 @@
           <w14:ligatures w14:val="standardContextual"/>
         </w:rPr>
       </w:pPr>
-      <w:hyperlink w:anchor="_Toc236209567" w:history="1">
+      <w:hyperlink w:anchor="_Toc236211004" w:history="1">
         <w:r>
           <w:rPr>
             <w:rStyle w:val="Hyperlink"/>
@@ -1593,7 +1593,7 @@
           <w:rPr>
             <w:noProof/>
           </w:rPr>
-          <w:instrText xml:space="preserve"> PAGEREF _Toc236209567 \h </w:instrText>
+          <w:instrText xml:space="preserve"> PAGEREF _Toc236211004 \h </w:instrText>
         </w:r>
         <w:r>
           <w:rPr>
@@ -1634,7 +1634,7 @@
           <w14:ligatures w14:val="standardContextual"/>
         </w:rPr>
       </w:pPr>
-      <w:hyperlink w:anchor="_Toc236209568" w:history="1">
+      <w:hyperlink w:anchor="_Toc236211005" w:history="1">
         <w:r>
           <w:rPr>
             <w:rStyle w:val="Hyperlink"/>
@@ -1658,7 +1658,7 @@
           <w:rPr>
             <w:noProof/>
           </w:rPr>
-          <w:instrText xml:space="preserve"> PAGEREF _Toc236209568 \h </w:instrText>
+          <w:instrText xml:space="preserve"> PAGEREF _Toc236211005 \h </w:instrText>
         </w:r>
         <w:r>
           <w:rPr>
@@ -1699,7 +1699,7 @@
           <w14:ligatures w14:val="standardContextual"/>
         </w:rPr>
       </w:pPr>
-      <w:hyperlink w:anchor="_Toc236209569" w:history="1">
+      <w:hyperlink w:anchor="_Toc236211006" w:history="1">
         <w:r>
           <w:rPr>
             <w:rStyle w:val="Hyperlink"/>
@@ -1723,7 +1723,7 @@
           <w:rPr>
             <w:noProof/>
           </w:rPr>
-          <w:instrText xml:space="preserve"> PAGEREF _Toc236209569 \h </w:instrText>
+          <w:instrText xml:space="preserve"> PAGEREF _Toc236211006 \h </w:instrText>
         </w:r>
         <w:r>
           <w:rPr>
@@ -1764,7 +1764,7 @@
           <w14:ligatures w14:val="standardContextual"/>
         </w:rPr>
       </w:pPr>
-      <w:hyperlink w:anchor="_Toc236209570" w:history="1">
+      <w:hyperlink w:anchor="_Toc236211007" w:history="1">
         <w:r>
           <w:rPr>
             <w:rStyle w:val="Hyperlink"/>
@@ -1788,7 +1788,7 @@
           <w:rPr>
             <w:noProof/>
           </w:rPr>
-          <w:instrText xml:space="preserve"> PAGEREF _Toc236209570 \h </w:instrText>
+          <w:instrText xml:space="preserve"> PAGEREF _Toc236211007 \h </w:instrText>
         </w:r>
         <w:r>
           <w:rPr>
@@ -1829,7 +1829,7 @@
           <w14:ligatures w14:val="standardContextual"/>
         </w:rPr>
       </w:pPr>
-      <w:hyperlink w:anchor="_Toc236209571" w:history="1">
+      <w:hyperlink w:anchor="_Toc236211008" w:history="1">
         <w:r>
           <w:rPr>
             <w:rStyle w:val="Hyperlink"/>
@@ -1853,7 +1853,7 @@
           <w:rPr>
             <w:noProof/>
           </w:rPr>
-          <w:instrText xml:space="preserve"> PAGEREF _Toc236209571 \h </w:instrText>
+          <w:instrText xml:space="preserve"> PAGEREF _Toc236211008 \h </w:instrText>
         </w:r>
         <w:r>
           <w:rPr>
@@ -1894,7 +1894,7 @@
           <w14:ligatures w14:val="standardContextual"/>
         </w:rPr>
       </w:pPr>
-      <w:hyperlink w:anchor="_Toc236209572" w:history="1">
+      <w:hyperlink w:anchor="_Toc236211009" w:history="1">
         <w:r>
           <w:rPr>
             <w:rStyle w:val="Hyperlink"/>
@@ -1918,7 +1918,7 @@
           <w:rPr>
             <w:noProof/>
           </w:rPr>
-          <w:instrText xml:space="preserve"> PAGEREF _Toc236209572 \h </w:instrText>
+          <w:instrText xml:space="preserve"> PAGEREF _Toc236211009 \h </w:instrText>
         </w:r>
         <w:r>
           <w:rPr>
@@ -1959,7 +1959,7 @@
           <w14:ligatures w14:val="standardContextual"/>
         </w:rPr>
       </w:pPr>
-      <w:hyperlink w:anchor="_Toc236209573" w:history="1">
+      <w:hyperlink w:anchor="_Toc236211010" w:history="1">
         <w:r>
           <w:rPr>
             <w:rStyle w:val="Hyperlink"/>
@@ -1983,7 +1983,7 @@
           <w:rPr>
             <w:noProof/>
           </w:rPr>
-          <w:instrText xml:space="preserve"> PAGEREF _Toc236209573 \h </w:instrText>
+          <w:instrText xml:space="preserve"> PAGEREF _Toc236211010 \h </w:instrText>
         </w:r>
         <w:r>
           <w:rPr>
@@ -2024,7 +2024,7 @@
           <w14:ligatures w14:val="standardContextual"/>
         </w:rPr>
       </w:pPr>
-      <w:hyperlink w:anchor="_Toc236209574" w:history="1">
+      <w:hyperlink w:anchor="_Toc236211011" w:history="1">
         <w:r>
           <w:rPr>
             <w:rStyle w:val="Hyperlink"/>
@@ -2048,7 +2048,7 @@
           <w:rPr>
             <w:noProof/>
           </w:rPr>
-          <w:instrText xml:space="preserve"> PAGEREF _Toc236209574 \h </w:instrText>
+          <w:instrText xml:space="preserve"> PAGEREF _Toc236211011 \h </w:instrText>
         </w:r>
         <w:r>
           <w:rPr>
@@ -2089,7 +2089,7 @@
           <w14:ligatures w14:val="standardContextual"/>
         </w:rPr>
       </w:pPr>
-      <w:hyperlink w:anchor="_Toc236209575" w:history="1">
+      <w:hyperlink w:anchor="_Toc236211012" w:history="1">
         <w:r>
           <w:rPr>
             <w:rStyle w:val="Hyperlink"/>
@@ -2113,7 +2113,7 @@
           <w:rPr>
             <w:noProof/>
           </w:rPr>
-          <w:instrText xml:space="preserve"> PAGEREF _Toc236209575 \h </w:instrText>
+          <w:instrText xml:space="preserve"> PAGEREF _Toc236211012 \h </w:instrText>
         </w:r>
         <w:r>
           <w:rPr>
@@ -2154,7 +2154,7 @@
           <w14:ligatures w14:val="standardContextual"/>
         </w:rPr>
       </w:pPr>
-      <w:hyperlink w:anchor="_Toc236209576" w:history="1">
+      <w:hyperlink w:anchor="_Toc236211013" w:history="1">
         <w:r>
           <w:rPr>
             <w:rStyle w:val="Hyperlink"/>
@@ -2178,7 +2178,7 @@
           <w:rPr>
             <w:noProof/>
           </w:rPr>
-          <w:instrText xml:space="preserve"> PAGEREF _Toc236209576 \h </w:instrText>
+          <w:instrText xml:space="preserve"> PAGEREF _Toc236211013 \h </w:instrText>
         </w:r>
         <w:r>
           <w:rPr>
@@ -2219,7 +2219,7 @@
           <w14:ligatures w14:val="standardContextual"/>
         </w:rPr>
       </w:pPr>
-      <w:hyperlink w:anchor="_Toc236209577" w:history="1">
+      <w:hyperlink w:anchor="_Toc236211014" w:history="1">
         <w:r>
           <w:rPr>
             <w:rStyle w:val="Hyperlink"/>
@@ -2243,7 +2243,7 @@
           <w:rPr>
             <w:noProof/>
           </w:rPr>
-          <w:instrText xml:space="preserve"> PAGEREF _Toc236209577 \h </w:instrText>
+          <w:instrText xml:space="preserve"> PAGEREF _Toc236211014 \h </w:instrText>
         </w:r>
         <w:r>
           <w:rPr>
@@ -2284,7 +2284,7 @@
           <w14:ligatures w14:val="standardContextual"/>
         </w:rPr>
       </w:pPr>
-      <w:hyperlink w:anchor="_Toc236209578" w:history="1">
+      <w:hyperlink w:anchor="_Toc236211015" w:history="1">
         <w:r>
           <w:rPr>
             <w:rStyle w:val="Hyperlink"/>
@@ -2308,7 +2308,7 @@
           <w:rPr>
             <w:noProof/>
           </w:rPr>
-          <w:instrText xml:space="preserve"> PAGEREF _Toc236209578 \h </w:instrText>
+          <w:instrText xml:space="preserve"> PAGEREF _Toc236211015 \h </w:instrText>
         </w:r>
         <w:r>
           <w:rPr>
@@ -2349,7 +2349,7 @@
           <w14:ligatures w14:val="standardContextual"/>
         </w:rPr>
       </w:pPr>
-      <w:hyperlink w:anchor="_Toc236209579" w:history="1">
+      <w:hyperlink w:anchor="_Toc236211016" w:history="1">
         <w:r>
           <w:rPr>
             <w:rStyle w:val="Hyperlink"/>
@@ -2373,7 +2373,7 @@
           <w:rPr>
             <w:noProof/>
           </w:rPr>
-          <w:instrText xml:space="preserve"> PAGEREF _Toc236209579 \h </w:instrText>
+          <w:instrText xml:space="preserve"> PAGEREF _Toc236211016 \h </w:instrText>
         </w:r>
         <w:r>
           <w:rPr>
@@ -2414,7 +2414,7 @@
           <w14:ligatures w14:val="standardContextual"/>
         </w:rPr>
       </w:pPr>
-      <w:hyperlink w:anchor="_Toc236209580" w:history="1">
+      <w:hyperlink w:anchor="_Toc236211017" w:history="1">
         <w:r>
           <w:rPr>
             <w:rStyle w:val="Hyperlink"/>
@@ -2438,7 +2438,7 @@
           <w:rPr>
             <w:noProof/>
           </w:rPr>
-          <w:instrText xml:space="preserve"> PAGEREF _Toc236209580 \h </w:instrText>
+          <w:instrText xml:space="preserve"> PAGEREF _Toc236211017 \h </w:instrText>
         </w:r>
         <w:r>
           <w:rPr>
@@ -2479,7 +2479,7 @@
           <w14:ligatures w14:val="standardContextual"/>
         </w:rPr>
       </w:pPr>
-      <w:hyperlink w:anchor="_Toc236209581" w:history="1">
+      <w:hyperlink w:anchor="_Toc236211018" w:history="1">
         <w:r>
           <w:rPr>
             <w:rStyle w:val="Hyperlink"/>
@@ -2503,7 +2503,7 @@
           <w:rPr>
             <w:noProof/>
           </w:rPr>
-          <w:instrText xml:space="preserve"> PAGEREF _Toc236209581 \h </w:instrText>
+          <w:instrText xml:space="preserve"> PAGEREF _Toc236211018 \h </w:instrText>
         </w:r>
         <w:r>
           <w:rPr>
@@ -2544,7 +2544,7 @@
           <w14:ligatures w14:val="standardContextual"/>
         </w:rPr>
       </w:pPr>
-      <w:hyperlink w:anchor="_Toc236209582" w:history="1">
+      <w:hyperlink w:anchor="_Toc236211019" w:history="1">
         <w:r>
           <w:rPr>
             <w:rStyle w:val="Hyperlink"/>
@@ -2568,7 +2568,7 @@
           <w:rPr>
             <w:noProof/>
           </w:rPr>
-          <w:instrText xml:space="preserve"> PAGEREF _Toc236209582 \h </w:instrText>
+          <w:instrText xml:space="preserve"> PAGEREF _Toc236211019 \h </w:instrText>
         </w:r>
         <w:r>
           <w:rPr>
@@ -2609,7 +2609,7 @@
           <w14:ligatures w14:val="standardContextual"/>
         </w:rPr>
       </w:pPr>
-      <w:hyperlink w:anchor="_Toc236209583" w:history="1">
+      <w:hyperlink w:anchor="_Toc236211020" w:history="1">
         <w:r>
           <w:rPr>
             <w:rStyle w:val="Hyperlink"/>
@@ -2633,7 +2633,7 @@
           <w:rPr>
             <w:noProof/>
           </w:rPr>
-          <w:instrText xml:space="preserve"> PAGEREF _Toc236209583 \h </w:instrText>
+          <w:instrText xml:space="preserve"> PAGEREF _Toc236211020 \h </w:instrText>
         </w:r>
         <w:r>
           <w:rPr>
@@ -2674,7 +2674,7 @@
       <w:pPr>
         <w:pStyle w:val="Heading1"/>
       </w:pPr>
-      <w:bookmarkStart w:id="0" w:name="_Toc236209556"/>
+      <w:bookmarkStart w:id="0" w:name="_Toc236210993"/>
       <w:r>
         <w:lastRenderedPageBreak/>
         <w:t>Bab I   Gambaran Umum Sistem dan Arsitektur</w:t>
@@ -2855,7 +2855,7 @@
         </w:rPr>
         <w:lastRenderedPageBreak/>
         <w:drawing>
-          <wp:inline distT="0" distB="0" distL="0" distR="0" wp14:anchorId="2931CF1D" wp14:editId="76E35A48">
+          <wp:inline distT="0" distB="0" distL="0" distR="0" wp14:anchorId="7C6F00A9" wp14:editId="49793DA5">
             <wp:extent cx="5112000" cy="3382941"/>
             <wp:effectExtent l="0" t="0" r="0" b="0"/>
             <wp:docPr id="4" name="Picture 4"/>
@@ -4370,7 +4370,7 @@
       <w:pPr>
         <w:pStyle w:val="Heading2"/>
       </w:pPr>
-      <w:bookmarkStart w:id="1" w:name="_Toc236209557"/>
+      <w:bookmarkStart w:id="1" w:name="_Toc236210994"/>
       <w:r>
         <w:t>Keputusan Desain Utama</w:t>
       </w:r>
@@ -4564,7 +4564,7 @@
       <w:pPr>
         <w:pStyle w:val="Heading2"/>
       </w:pPr>
-      <w:bookmarkStart w:id="2" w:name="_Toc236209558"/>
+      <w:bookmarkStart w:id="2" w:name="_Toc236210995"/>
       <w:r>
         <w:t>Layanan Eksternal</w:t>
       </w:r>
@@ -4970,7 +4970,7 @@
       <w:pPr>
         <w:pStyle w:val="Heading1"/>
       </w:pPr>
-      <w:bookmarkStart w:id="3" w:name="_Toc236209559"/>
+      <w:bookmarkStart w:id="3" w:name="_Toc236210996"/>
       <w:r>
         <w:lastRenderedPageBreak/>
         <w:t>Bab II   Penelusuran Struktur Kode</w:t>
@@ -5612,7 +5612,7 @@
       <w:pPr>
         <w:pStyle w:val="Heading2"/>
       </w:pPr>
-      <w:bookmarkStart w:id="4" w:name="_Toc236209560"/>
+      <w:bookmarkStart w:id="4" w:name="_Toc236210997"/>
       <w:r>
         <w:t>Rute dan Pembagian Peran</w:t>
       </w:r>
@@ -6918,7 +6918,7 @@
       <w:pPr>
         <w:pStyle w:val="Heading2"/>
       </w:pPr>
-      <w:bookmarkStart w:id="5" w:name="_Toc236209561"/>
+      <w:bookmarkStart w:id="5" w:name="_Toc236210998"/>
       <w:r>
         <w:t>Modul Server yang Perlu Dikenali</w:t>
       </w:r>
@@ -7946,7 +7946,7 @@
       <w:pPr>
         <w:pStyle w:val="Heading2"/>
       </w:pPr>
-      <w:bookmarkStart w:id="6" w:name="_Toc236209562"/>
+      <w:bookmarkStart w:id="6" w:name="_Toc236210999"/>
       <w:r>
         <w:t>Logika Bisnis yang Perlu Diperhatikan</w:t>
       </w:r>
@@ -8309,7 +8309,7 @@
       <w:pPr>
         <w:pStyle w:val="Heading2"/>
       </w:pPr>
-      <w:bookmarkStart w:id="7" w:name="_Toc236209563"/>
+      <w:bookmarkStart w:id="7" w:name="_Toc236211000"/>
       <w:r>
         <w:t>Urutan Membaca yang Disarankan</w:t>
       </w:r>
@@ -8433,7 +8433,7 @@
       <w:pPr>
         <w:pStyle w:val="Heading1"/>
       </w:pPr>
-      <w:bookmarkStart w:id="8" w:name="_Toc236209564"/>
+      <w:bookmarkStart w:id="8" w:name="_Toc236211001"/>
       <w:r>
         <w:lastRenderedPageBreak/>
         <w:t>Bab III   Panduan Persiapan Lingkungan</w:t>
@@ -8554,7 +8554,7 @@
       <w:pPr>
         <w:pStyle w:val="Heading2"/>
       </w:pPr>
-      <w:bookmarkStart w:id="9" w:name="_Toc236209565"/>
+      <w:bookmarkStart w:id="9" w:name="_Toc236211002"/>
       <w:r>
         <w:t>Variabel Environment</w:t>
       </w:r>
@@ -8989,7 +8989,7 @@
       <w:pPr>
         <w:pStyle w:val="Heading2"/>
       </w:pPr>
-      <w:bookmarkStart w:id="10" w:name="_Toc236209566"/>
+      <w:bookmarkStart w:id="10" w:name="_Toc236211003"/>
       <w:r>
         <w:t>Perintah npm</w:t>
       </w:r>
@@ -9409,7 +9409,7 @@
       <w:pPr>
         <w:pStyle w:val="Heading1"/>
       </w:pPr>
-      <w:bookmarkStart w:id="11" w:name="_Toc236209567"/>
+      <w:bookmarkStart w:id="11" w:name="_Toc236211004"/>
       <w:r>
         <w:lastRenderedPageBreak/>
         <w:t>Bab IV   Deployment dan Infrastruktur</w:t>
@@ -9440,7 +9440,7 @@
       <w:pPr>
         <w:pStyle w:val="Heading2"/>
       </w:pPr>
-      <w:bookmarkStart w:id="12" w:name="_Toc236209568"/>
+      <w:bookmarkStart w:id="12" w:name="_Toc236211005"/>
       <w:r>
         <w:t>Konfigurasi vercel.json</w:t>
       </w:r>
@@ -9566,7 +9566,7 @@
       <w:pPr>
         <w:pStyle w:val="Heading2"/>
       </w:pPr>
-      <w:bookmarkStart w:id="13" w:name="_Toc236209569"/>
+      <w:bookmarkStart w:id="13" w:name="_Toc236211006"/>
       <w:r>
         <w:t>Variabel Produksi dan Rollback</w:t>
       </w:r>
@@ -9605,7 +9605,7 @@
       <w:pPr>
         <w:pStyle w:val="Heading1"/>
       </w:pPr>
-      <w:bookmarkStart w:id="14" w:name="_Toc236209570"/>
+      <w:bookmarkStart w:id="14" w:name="_Toc236211007"/>
       <w:r>
         <w:lastRenderedPageBreak/>
         <w:t>Bab V   Dokumentasi Basis Data</w:t>
@@ -10031,7 +10031,7 @@
       <w:pPr>
         <w:pStyle w:val="Heading2"/>
       </w:pPr>
-      <w:bookmarkStart w:id="15" w:name="_Toc236209571"/>
+      <w:bookmarkStart w:id="15" w:name="_Toc236211008"/>
       <w:r>
         <w:t>Skema sebagai Kode</w:t>
       </w:r>
@@ -10247,7 +10247,7 @@
       <w:pPr>
         <w:pStyle w:val="Heading2"/>
       </w:pPr>
-      <w:bookmarkStart w:id="16" w:name="_Toc236209572"/>
+      <w:bookmarkStart w:id="16" w:name="_Toc236211009"/>
       <w:r>
         <w:t>Karakteristik Data yang Perlu Diketahui</w:t>
       </w:r>
@@ -10346,7 +10346,7 @@
       <w:pPr>
         <w:pStyle w:val="Heading1"/>
       </w:pPr>
-      <w:bookmarkStart w:id="17" w:name="_Toc236209573"/>
+      <w:bookmarkStart w:id="17" w:name="_Toc236211010"/>
       <w:r>
         <w:lastRenderedPageBreak/>
         <w:t>Bab VI   Masalah yang Diketahui dan Utang Teknis</w:t>
@@ -10367,7 +10367,7 @@
       <w:pPr>
         <w:pStyle w:val="Heading2"/>
       </w:pPr>
-      <w:bookmarkStart w:id="18" w:name="_Toc236209574"/>
+      <w:bookmarkStart w:id="18" w:name="_Toc236211011"/>
       <w:r>
         <w:t>Telah Diselesaikan pada Serah Terima Ini</w:t>
       </w:r>
@@ -10552,7 +10552,7 @@
       <w:pPr>
         <w:pStyle w:val="Heading2"/>
       </w:pPr>
-      <w:bookmarkStart w:id="19" w:name="_Toc236209575"/>
+      <w:bookmarkStart w:id="19" w:name="_Toc236211012"/>
       <w:r>
         <w:t>Utang Teknis yang Masih Tersisa</w:t>
       </w:r>
@@ -10757,7 +10757,7 @@
       <w:pPr>
         <w:pStyle w:val="Heading1"/>
       </w:pPr>
-      <w:bookmarkStart w:id="20" w:name="_Toc236209576"/>
+      <w:bookmarkStart w:id="20" w:name="_Toc236211013"/>
       <w:r>
         <w:lastRenderedPageBreak/>
         <w:t>Bab VII   Pengujian</w:t>
@@ -11372,7 +11372,7 @@
       <w:pPr>
         <w:pStyle w:val="Heading1"/>
       </w:pPr>
-      <w:bookmarkStart w:id="21" w:name="_Toc236209577"/>
+      <w:bookmarkStart w:id="21" w:name="_Toc236211014"/>
       <w:r>
         <w:lastRenderedPageBreak/>
         <w:t>Bab VIII   Dependensi Pihak Ketiga dan Lisensi</w:t>
@@ -13646,7 +13646,7 @@
       <w:pPr>
         <w:pStyle w:val="Heading1"/>
       </w:pPr>
-      <w:bookmarkStart w:id="22" w:name="_Toc236209578"/>
+      <w:bookmarkStart w:id="22" w:name="_Toc236211015"/>
       <w:r>
         <w:lastRenderedPageBreak/>
         <w:t>Bab IX   Runbook Pemeliharaan</w:t>
@@ -13667,7 +13667,7 @@
       <w:pPr>
         <w:pStyle w:val="Heading2"/>
       </w:pPr>
-      <w:bookmarkStart w:id="23" w:name="_Toc236209579"/>
+      <w:bookmarkStart w:id="23" w:name="_Toc236211016"/>
       <w:r>
         <w:t>Prosedur Rutin</w:t>
       </w:r>
@@ -13824,7 +13824,7 @@
       <w:pPr>
         <w:pStyle w:val="Heading2"/>
       </w:pPr>
-      <w:bookmarkStart w:id="24" w:name="_Toc236209580"/>
+      <w:bookmarkStart w:id="24" w:name="_Toc236211017"/>
       <w:r>
         <w:t>Logging, Pemantauan, dan Pencadangan</w:t>
       </w:r>
@@ -13866,7 +13866,7 @@
       <w:pPr>
         <w:pStyle w:val="Heading1"/>
       </w:pPr>
-      <w:bookmarkStart w:id="25" w:name="_Toc236209581"/>
+      <w:bookmarkStart w:id="25" w:name="_Toc236211018"/>
       <w:r>
         <w:lastRenderedPageBreak/>
         <w:t>Bab X   Ringkasan Serah Terima dan Langkah Selanjutnya</w:t>
@@ -13900,7 +13900,7 @@
       <w:pPr>
         <w:pStyle w:val="Heading2"/>
       </w:pPr>
-      <w:bookmarkStart w:id="26" w:name="_Toc236209582"/>
+      <w:bookmarkStart w:id="26" w:name="_Toc236211019"/>
       <w:r>
         <w:t>Tiga Langkah Pertama bagi Pemelihara Baru</w:t>
       </w:r>
@@ -13964,7 +13964,7 @@
       <w:pPr>
         <w:pStyle w:val="Heading2"/>
       </w:pPr>
-      <w:bookmarkStart w:id="27" w:name="_Toc236209583"/>
+      <w:bookmarkStart w:id="27" w:name="_Toc236211020"/>
       <w:r>
         <w:t>Pekerjaan Lanjutan yang Disarankan</w:t>
       </w:r>

</xml_diff>